<commit_message>
docker - image updated
</commit_message>
<xml_diff>
--- a/Docker/3-image.docx
+++ b/Docker/3-image.docx
@@ -737,13 +737,23 @@
           </mc:Fallback>
         </mc:AlternateContent>
       </w:r>
-      <w:r>
-        <w:rPr>
-          <w:rFonts w:asciiTheme="majorBidi" w:hAnsiTheme="majorBidi" w:cstheme="majorBidi"/>
-          <w:sz w:val="28"/>
-          <w:szCs w:val="28"/>
-        </w:rPr>
-        <w:t>Dockerfile:</w:t>
+      <w:proofErr w:type="spellStart"/>
+      <w:r>
+        <w:rPr>
+          <w:rFonts w:asciiTheme="majorBidi" w:hAnsiTheme="majorBidi" w:cstheme="majorBidi"/>
+          <w:sz w:val="28"/>
+          <w:szCs w:val="28"/>
+        </w:rPr>
+        <w:t>Dockerfile</w:t>
+      </w:r>
+      <w:proofErr w:type="spellEnd"/>
+      <w:r>
+        <w:rPr>
+          <w:rFonts w:asciiTheme="majorBidi" w:hAnsiTheme="majorBidi" w:cstheme="majorBidi"/>
+          <w:sz w:val="28"/>
+          <w:szCs w:val="28"/>
+        </w:rPr>
+        <w:t>:</w:t>
       </w:r>
     </w:p>
     <w:p>
@@ -1201,18 +1211,9 @@
           <w:sz w:val="28"/>
           <w:szCs w:val="28"/>
         </w:rPr>
-        <w:t>nginx:1.25</w:t>
-      </w:r>
-      <w:r>
-        <w:rPr>
-          <w:rFonts w:asciiTheme="majorBidi" w:hAnsiTheme="majorBidi" w:cstheme="majorBidi"/>
-          <w:b/>
-          <w:bCs/>
-          <w:sz w:val="28"/>
-          <w:szCs w:val="28"/>
-        </w:rPr>
-        <w:t xml:space="preserve"> , </w:t>
-      </w:r>
+        <w:t>nginx:1.</w:t>
+      </w:r>
+      <w:proofErr w:type="gramStart"/>
       <w:r>
         <w:rPr>
           <w:rFonts w:asciiTheme="majorBidi" w:hAnsiTheme="majorBidi" w:cstheme="majorBidi"/>
@@ -1223,8 +1224,45 @@
           <w:sz w:val="28"/>
           <w:szCs w:val="28"/>
         </w:rPr>
+        <w:t>25</w:t>
+      </w:r>
+      <w:r>
+        <w:rPr>
+          <w:rFonts w:asciiTheme="majorBidi" w:hAnsiTheme="majorBidi" w:cstheme="majorBidi"/>
+          <w:b/>
+          <w:bCs/>
+          <w:sz w:val="28"/>
+          <w:szCs w:val="28"/>
+        </w:rPr>
+        <w:t xml:space="preserve"> ,</w:t>
+      </w:r>
+      <w:proofErr w:type="gramEnd"/>
+      <w:r>
+        <w:rPr>
+          <w:rFonts w:asciiTheme="majorBidi" w:hAnsiTheme="majorBidi" w:cstheme="majorBidi"/>
+          <w:b/>
+          <w:bCs/>
+          <w:sz w:val="28"/>
+          <w:szCs w:val="28"/>
+        </w:rPr>
+        <w:t xml:space="preserve"> </w:t>
+      </w:r>
+      <w:proofErr w:type="spellStart"/>
+      <w:proofErr w:type="gramStart"/>
+      <w:r>
+        <w:rPr>
+          <w:rFonts w:asciiTheme="majorBidi" w:hAnsiTheme="majorBidi" w:cstheme="majorBidi"/>
+          <w:b/>
+          <w:bCs/>
+          <w:i/>
+          <w:iCs/>
+          <w:sz w:val="28"/>
+          <w:szCs w:val="28"/>
+        </w:rPr>
         <w:t>nginx:latest</w:t>
       </w:r>
+      <w:proofErr w:type="spellEnd"/>
+      <w:proofErr w:type="gramEnd"/>
       <w:r>
         <w:rPr>
           <w:rFonts w:asciiTheme="majorBidi" w:hAnsiTheme="majorBidi" w:cstheme="majorBidi"/>
@@ -2000,8 +2038,18 @@
           <w:sz w:val="28"/>
           <w:szCs w:val="28"/>
         </w:rPr>
-        <w:t>build from Dockerfile</w:t>
-      </w:r>
+        <w:t xml:space="preserve">build from </w:t>
+      </w:r>
+      <w:proofErr w:type="spellStart"/>
+      <w:r>
+        <w:rPr>
+          <w:rFonts w:asciiTheme="majorBidi" w:hAnsiTheme="majorBidi" w:cstheme="majorBidi"/>
+          <w:sz w:val="28"/>
+          <w:szCs w:val="28"/>
+        </w:rPr>
+        <w:t>Dockerfile</w:t>
+      </w:r>
+      <w:proofErr w:type="spellEnd"/>
     </w:p>
     <w:p>
       <w:pPr>
@@ -2039,8 +2087,22 @@
           <w:sz w:val="28"/>
           <w:szCs w:val="28"/>
         </w:rPr>
-        <w:t>docker build -t myapp:1.0 .</w:t>
-      </w:r>
+        <w:t>docker build -t myapp:1.</w:t>
+      </w:r>
+      <w:proofErr w:type="gramStart"/>
+      <w:r>
+        <w:rPr>
+          <w:rFonts w:asciiTheme="majorBidi" w:hAnsiTheme="majorBidi" w:cstheme="majorBidi"/>
+          <w:b/>
+          <w:bCs/>
+          <w:i/>
+          <w:iCs/>
+          <w:sz w:val="28"/>
+          <w:szCs w:val="28"/>
+        </w:rPr>
+        <w:t>0 .</w:t>
+      </w:r>
+      <w:proofErr w:type="gramEnd"/>
       <w:r>
         <w:rPr>
           <w:rFonts w:asciiTheme="majorBidi" w:hAnsiTheme="majorBidi" w:cstheme="majorBidi"/>
@@ -2342,7 +2404,33 @@
           <w:sz w:val="28"/>
           <w:szCs w:val="28"/>
         </w:rPr>
-        <w:t>docker rmi $(docker images -q)</w:t>
+        <w:t xml:space="preserve">docker </w:t>
+      </w:r>
+      <w:proofErr w:type="spellStart"/>
+      <w:r>
+        <w:rPr>
+          <w:rFonts w:asciiTheme="majorBidi" w:hAnsiTheme="majorBidi" w:cstheme="majorBidi"/>
+          <w:b/>
+          <w:bCs/>
+          <w:i/>
+          <w:iCs/>
+          <w:sz w:val="28"/>
+          <w:szCs w:val="28"/>
+        </w:rPr>
+        <w:t>rmi</w:t>
+      </w:r>
+      <w:proofErr w:type="spellEnd"/>
+      <w:r>
+        <w:rPr>
+          <w:rFonts w:asciiTheme="majorBidi" w:hAnsiTheme="majorBidi" w:cstheme="majorBidi"/>
+          <w:b/>
+          <w:bCs/>
+          <w:i/>
+          <w:iCs/>
+          <w:sz w:val="28"/>
+          <w:szCs w:val="28"/>
+        </w:rPr>
+        <w:t xml:space="preserve"> $(docker images -q)</w:t>
       </w:r>
     </w:p>
     <w:p>
@@ -2374,40 +2462,9 @@
           <w:sz w:val="28"/>
           <w:szCs w:val="28"/>
         </w:rPr>
-        <w:t>--no-trunc</w:t>
-      </w:r>
-      <w:r>
-        <w:rPr>
-          <w:rFonts w:asciiTheme="majorBidi" w:hAnsiTheme="majorBidi" w:cstheme="majorBidi"/>
-          <w:sz w:val="28"/>
-          <w:szCs w:val="28"/>
-        </w:rPr>
-        <w:t xml:space="preserve"> </w:t>
-      </w:r>
-      <w:r>
-        <w:rPr>
-          <w:rFonts w:asciiTheme="majorBidi" w:hAnsiTheme="majorBidi" w:cstheme="majorBidi"/>
-          <w:sz w:val="28"/>
-          <w:szCs w:val="28"/>
-        </w:rPr>
-        <w:t xml:space="preserve">→ </w:t>
-      </w:r>
-      <w:r>
-        <w:rPr>
-          <w:rFonts w:asciiTheme="majorBidi" w:hAnsiTheme="majorBidi" w:cstheme="majorBidi"/>
-          <w:sz w:val="28"/>
-          <w:szCs w:val="28"/>
-        </w:rPr>
-        <w:t>show full image ID</w:t>
-      </w:r>
-      <w:r>
-        <w:rPr>
-          <w:rFonts w:asciiTheme="majorBidi" w:hAnsiTheme="majorBidi" w:cstheme="majorBidi"/>
-          <w:sz w:val="28"/>
-          <w:szCs w:val="28"/>
-        </w:rPr>
-        <w:t xml:space="preserve">. Example: </w:t>
-      </w:r>
+        <w:t>--no-</w:t>
+      </w:r>
+      <w:proofErr w:type="spellStart"/>
       <w:r>
         <w:rPr>
           <w:rFonts w:asciiTheme="majorBidi" w:hAnsiTheme="majorBidi" w:cstheme="majorBidi"/>
@@ -2418,8 +2475,67 @@
           <w:sz w:val="28"/>
           <w:szCs w:val="28"/>
         </w:rPr>
-        <w:t>docker images --no-trunc</w:t>
-      </w:r>
+        <w:t>trunc</w:t>
+      </w:r>
+      <w:proofErr w:type="spellEnd"/>
+      <w:r>
+        <w:rPr>
+          <w:rFonts w:asciiTheme="majorBidi" w:hAnsiTheme="majorBidi" w:cstheme="majorBidi"/>
+          <w:sz w:val="28"/>
+          <w:szCs w:val="28"/>
+        </w:rPr>
+        <w:t xml:space="preserve"> </w:t>
+      </w:r>
+      <w:r>
+        <w:rPr>
+          <w:rFonts w:asciiTheme="majorBidi" w:hAnsiTheme="majorBidi" w:cstheme="majorBidi"/>
+          <w:sz w:val="28"/>
+          <w:szCs w:val="28"/>
+        </w:rPr>
+        <w:t xml:space="preserve">→ </w:t>
+      </w:r>
+      <w:r>
+        <w:rPr>
+          <w:rFonts w:asciiTheme="majorBidi" w:hAnsiTheme="majorBidi" w:cstheme="majorBidi"/>
+          <w:sz w:val="28"/>
+          <w:szCs w:val="28"/>
+        </w:rPr>
+        <w:t>show full image ID</w:t>
+      </w:r>
+      <w:r>
+        <w:rPr>
+          <w:rFonts w:asciiTheme="majorBidi" w:hAnsiTheme="majorBidi" w:cstheme="majorBidi"/>
+          <w:sz w:val="28"/>
+          <w:szCs w:val="28"/>
+        </w:rPr>
+        <w:t xml:space="preserve">. Example: </w:t>
+      </w:r>
+      <w:r>
+        <w:rPr>
+          <w:rFonts w:asciiTheme="majorBidi" w:hAnsiTheme="majorBidi" w:cstheme="majorBidi"/>
+          <w:b/>
+          <w:bCs/>
+          <w:i/>
+          <w:iCs/>
+          <w:sz w:val="28"/>
+          <w:szCs w:val="28"/>
+        </w:rPr>
+        <w:t>docker images --no-</w:t>
+      </w:r>
+      <w:proofErr w:type="spellStart"/>
+      <w:r>
+        <w:rPr>
+          <w:rFonts w:asciiTheme="majorBidi" w:hAnsiTheme="majorBidi" w:cstheme="majorBidi"/>
+          <w:b/>
+          <w:bCs/>
+          <w:i/>
+          <w:iCs/>
+          <w:sz w:val="28"/>
+          <w:szCs w:val="28"/>
+        </w:rPr>
+        <w:t>trunc</w:t>
+      </w:r>
+      <w:proofErr w:type="spellEnd"/>
     </w:p>
     <w:p>
       <w:pPr>
@@ -2526,7 +2642,33 @@
           <w:sz w:val="28"/>
           <w:szCs w:val="28"/>
         </w:rPr>
-        <w:t>docker rmi nginx</w:t>
+        <w:t xml:space="preserve">docker </w:t>
+      </w:r>
+      <w:proofErr w:type="spellStart"/>
+      <w:r>
+        <w:rPr>
+          <w:rFonts w:asciiTheme="majorBidi" w:hAnsiTheme="majorBidi" w:cstheme="majorBidi"/>
+          <w:b/>
+          <w:bCs/>
+          <w:i/>
+          <w:iCs/>
+          <w:sz w:val="28"/>
+          <w:szCs w:val="28"/>
+        </w:rPr>
+        <w:t>rmi</w:t>
+      </w:r>
+      <w:proofErr w:type="spellEnd"/>
+      <w:r>
+        <w:rPr>
+          <w:rFonts w:asciiTheme="majorBidi" w:hAnsiTheme="majorBidi" w:cstheme="majorBidi"/>
+          <w:b/>
+          <w:bCs/>
+          <w:i/>
+          <w:iCs/>
+          <w:sz w:val="28"/>
+          <w:szCs w:val="28"/>
+        </w:rPr>
+        <w:t xml:space="preserve"> nginx</w:t>
       </w:r>
       <w:r>
         <w:rPr>
@@ -2909,7 +3051,33 @@
           <w:sz w:val="28"/>
           <w:szCs w:val="28"/>
         </w:rPr>
-        <w:t>docker image inspect -f '{{.Id}}' nginx</w:t>
+        <w:t>docker image inspect -f '{</w:t>
+      </w:r>
+      <w:proofErr w:type="gramStart"/>
+      <w:r>
+        <w:rPr>
+          <w:rFonts w:asciiTheme="majorBidi" w:hAnsiTheme="majorBidi" w:cstheme="majorBidi"/>
+          <w:b/>
+          <w:bCs/>
+          <w:i/>
+          <w:iCs/>
+          <w:sz w:val="28"/>
+          <w:szCs w:val="28"/>
+        </w:rPr>
+        <w:t>{.Id</w:t>
+      </w:r>
+      <w:proofErr w:type="gramEnd"/>
+      <w:r>
+        <w:rPr>
+          <w:rFonts w:asciiTheme="majorBidi" w:hAnsiTheme="majorBidi" w:cstheme="majorBidi"/>
+          <w:b/>
+          <w:bCs/>
+          <w:i/>
+          <w:iCs/>
+          <w:sz w:val="28"/>
+          <w:szCs w:val="28"/>
+        </w:rPr>
+        <w:t>}}' nginx</w:t>
       </w:r>
     </w:p>
     <w:p>
@@ -2948,7 +3116,25 @@
           <w:sz w:val="28"/>
           <w:szCs w:val="28"/>
         </w:rPr>
-        <w:t>docker image inspect -f '{{.Architecture}}' nginx</w:t>
+        <w:t>docker image inspect -f '{</w:t>
+      </w:r>
+      <w:proofErr w:type="gramStart"/>
+      <w:r>
+        <w:rPr>
+          <w:rFonts w:asciiTheme="majorBidi" w:hAnsiTheme="majorBidi" w:cstheme="majorBidi"/>
+          <w:sz w:val="28"/>
+          <w:szCs w:val="28"/>
+        </w:rPr>
+        <w:t>{.Architecture</w:t>
+      </w:r>
+      <w:proofErr w:type="gramEnd"/>
+      <w:r>
+        <w:rPr>
+          <w:rFonts w:asciiTheme="majorBidi" w:hAnsiTheme="majorBidi" w:cstheme="majorBidi"/>
+          <w:sz w:val="28"/>
+          <w:szCs w:val="28"/>
+        </w:rPr>
+        <w:t>}}' nginx</w:t>
       </w:r>
     </w:p>
     <w:p>
@@ -2995,7 +3181,33 @@
           <w:sz w:val="28"/>
           <w:szCs w:val="28"/>
         </w:rPr>
-        <w:t>docker image inspect -f '{{.Created}}' nginx</w:t>
+        <w:t>docker image inspect -f '{</w:t>
+      </w:r>
+      <w:proofErr w:type="gramStart"/>
+      <w:r>
+        <w:rPr>
+          <w:rFonts w:asciiTheme="majorBidi" w:hAnsiTheme="majorBidi" w:cstheme="majorBidi"/>
+          <w:b/>
+          <w:bCs/>
+          <w:i/>
+          <w:iCs/>
+          <w:sz w:val="28"/>
+          <w:szCs w:val="28"/>
+        </w:rPr>
+        <w:t>{.Created</w:t>
+      </w:r>
+      <w:proofErr w:type="gramEnd"/>
+      <w:r>
+        <w:rPr>
+          <w:rFonts w:asciiTheme="majorBidi" w:hAnsiTheme="majorBidi" w:cstheme="majorBidi"/>
+          <w:b/>
+          <w:bCs/>
+          <w:i/>
+          <w:iCs/>
+          <w:sz w:val="28"/>
+          <w:szCs w:val="28"/>
+        </w:rPr>
+        <w:t>}}' nginx</w:t>
       </w:r>
     </w:p>
     <w:p>
@@ -3114,8 +3326,22 @@
           <w:sz w:val="28"/>
           <w:szCs w:val="28"/>
         </w:rPr>
-        <w:t>--no-trunc</w:t>
-      </w:r>
+        <w:t>--no-</w:t>
+      </w:r>
+      <w:proofErr w:type="spellStart"/>
+      <w:r>
+        <w:rPr>
+          <w:rFonts w:asciiTheme="majorBidi" w:hAnsiTheme="majorBidi" w:cstheme="majorBidi"/>
+          <w:b/>
+          <w:bCs/>
+          <w:i/>
+          <w:iCs/>
+          <w:sz w:val="28"/>
+          <w:szCs w:val="28"/>
+        </w:rPr>
+        <w:t>trunc</w:t>
+      </w:r>
+      <w:proofErr w:type="spellEnd"/>
       <w:r>
         <w:rPr>
           <w:rFonts w:asciiTheme="majorBidi" w:hAnsiTheme="majorBidi" w:cstheme="majorBidi"/>
@@ -3218,7 +3444,33 @@
           <w:sz w:val="28"/>
           <w:szCs w:val="28"/>
         </w:rPr>
-        <w:t>docker tag nginx myrepo/nginx:1.0</w:t>
+        <w:t xml:space="preserve">docker tag nginx </w:t>
+      </w:r>
+      <w:proofErr w:type="spellStart"/>
+      <w:r>
+        <w:rPr>
+          <w:rFonts w:asciiTheme="majorBidi" w:hAnsiTheme="majorBidi" w:cstheme="majorBidi"/>
+          <w:b/>
+          <w:bCs/>
+          <w:i/>
+          <w:iCs/>
+          <w:sz w:val="28"/>
+          <w:szCs w:val="28"/>
+        </w:rPr>
+        <w:t>myrepo</w:t>
+      </w:r>
+      <w:proofErr w:type="spellEnd"/>
+      <w:r>
+        <w:rPr>
+          <w:rFonts w:asciiTheme="majorBidi" w:hAnsiTheme="majorBidi" w:cstheme="majorBidi"/>
+          <w:b/>
+          <w:bCs/>
+          <w:i/>
+          <w:iCs/>
+          <w:sz w:val="28"/>
+          <w:szCs w:val="28"/>
+        </w:rPr>
+        <w:t>/nginx:1.0</w:t>
       </w:r>
       <w:r>
         <w:rPr>
@@ -3252,13 +3504,23 @@
         </w:rPr>
         <w:t xml:space="preserve">, </w:t>
       </w:r>
-      <w:r>
-        <w:rPr>
-          <w:rFonts w:asciiTheme="majorBidi" w:hAnsiTheme="majorBidi" w:cstheme="majorBidi"/>
-          <w:sz w:val="28"/>
-          <w:szCs w:val="28"/>
-        </w:rPr>
-        <w:t>Creates new reference to same image and it does not duplicate data.</w:t>
+      <w:proofErr w:type="gramStart"/>
+      <w:r>
+        <w:rPr>
+          <w:rFonts w:asciiTheme="majorBidi" w:hAnsiTheme="majorBidi" w:cstheme="majorBidi"/>
+          <w:sz w:val="28"/>
+          <w:szCs w:val="28"/>
+        </w:rPr>
+        <w:t>Creates</w:t>
+      </w:r>
+      <w:proofErr w:type="gramEnd"/>
+      <w:r>
+        <w:rPr>
+          <w:rFonts w:asciiTheme="majorBidi" w:hAnsiTheme="majorBidi" w:cstheme="majorBidi"/>
+          <w:sz w:val="28"/>
+          <w:szCs w:val="28"/>
+        </w:rPr>
+        <w:t xml:space="preserve"> new reference to same image and it does not duplicate data.</w:t>
       </w:r>
     </w:p>
     <w:p>
@@ -3327,7 +3589,33 @@
           <w:sz w:val="28"/>
           <w:szCs w:val="28"/>
         </w:rPr>
-        <w:t>docker rmi nginx</w:t>
+        <w:t xml:space="preserve">docker </w:t>
+      </w:r>
+      <w:proofErr w:type="spellStart"/>
+      <w:r>
+        <w:rPr>
+          <w:rFonts w:asciiTheme="majorBidi" w:hAnsiTheme="majorBidi" w:cstheme="majorBidi"/>
+          <w:b/>
+          <w:bCs/>
+          <w:i/>
+          <w:iCs/>
+          <w:sz w:val="28"/>
+          <w:szCs w:val="28"/>
+        </w:rPr>
+        <w:t>rmi</w:t>
+      </w:r>
+      <w:proofErr w:type="spellEnd"/>
+      <w:r>
+        <w:rPr>
+          <w:rFonts w:asciiTheme="majorBidi" w:hAnsiTheme="majorBidi" w:cstheme="majorBidi"/>
+          <w:b/>
+          <w:bCs/>
+          <w:i/>
+          <w:iCs/>
+          <w:sz w:val="28"/>
+          <w:szCs w:val="28"/>
+        </w:rPr>
+        <w:t xml:space="preserve"> nginx</w:t>
       </w:r>
     </w:p>
     <w:p>
@@ -3487,32 +3775,11 @@
           <w:sz w:val="28"/>
           <w:szCs w:val="28"/>
         </w:rPr>
-        <w:t>registry/repository:tag</w:t>
-      </w:r>
-    </w:p>
-    <w:p>
-      <w:pPr>
-        <w:spacing w:after="60"/>
-        <w:jc w:val="both"/>
-        <w:rPr>
-          <w:rFonts w:asciiTheme="majorBidi" w:hAnsiTheme="majorBidi" w:cstheme="majorBidi"/>
-          <w:sz w:val="28"/>
-          <w:szCs w:val="28"/>
-        </w:rPr>
-      </w:pPr>
-      <w:r>
-        <w:rPr>
-          <w:rFonts w:asciiTheme="majorBidi" w:hAnsiTheme="majorBidi" w:cstheme="majorBidi"/>
-          <w:sz w:val="28"/>
-          <w:szCs w:val="28"/>
-        </w:rPr>
-        <w:t>Example:</w:t>
-      </w:r>
-    </w:p>
-    <w:p>
-      <w:pPr>
-        <w:spacing w:after="120"/>
-        <w:jc w:val="both"/>
+        <w:t>registry/</w:t>
+      </w:r>
+      <w:proofErr w:type="spellStart"/>
+      <w:proofErr w:type="gramStart"/>
+      <w:r>
         <w:rPr>
           <w:rFonts w:asciiTheme="majorBidi" w:hAnsiTheme="majorBidi" w:cstheme="majorBidi"/>
           <w:b/>
@@ -3522,8 +3789,34 @@
           <w:sz w:val="28"/>
           <w:szCs w:val="28"/>
         </w:rPr>
-      </w:pPr>
-      <w:r>
+        <w:t>repository:tag</w:t>
+      </w:r>
+      <w:proofErr w:type="spellEnd"/>
+      <w:proofErr w:type="gramEnd"/>
+    </w:p>
+    <w:p>
+      <w:pPr>
+        <w:spacing w:after="60"/>
+        <w:jc w:val="both"/>
+        <w:rPr>
+          <w:rFonts w:asciiTheme="majorBidi" w:hAnsiTheme="majorBidi" w:cstheme="majorBidi"/>
+          <w:sz w:val="28"/>
+          <w:szCs w:val="28"/>
+        </w:rPr>
+      </w:pPr>
+      <w:r>
+        <w:rPr>
+          <w:rFonts w:asciiTheme="majorBidi" w:hAnsiTheme="majorBidi" w:cstheme="majorBidi"/>
+          <w:sz w:val="28"/>
+          <w:szCs w:val="28"/>
+        </w:rPr>
+        <w:t>Example:</w:t>
+      </w:r>
+    </w:p>
+    <w:p>
+      <w:pPr>
+        <w:spacing w:after="120"/>
+        <w:jc w:val="both"/>
         <w:rPr>
           <w:rFonts w:asciiTheme="majorBidi" w:hAnsiTheme="majorBidi" w:cstheme="majorBidi"/>
           <w:b/>
@@ -3533,8 +3826,35 @@
           <w:sz w:val="28"/>
           <w:szCs w:val="28"/>
         </w:rPr>
-        <w:t>docker.io/library/nginx:latest</w:t>
-      </w:r>
+      </w:pPr>
+      <w:r>
+        <w:rPr>
+          <w:rFonts w:asciiTheme="majorBidi" w:hAnsiTheme="majorBidi" w:cstheme="majorBidi"/>
+          <w:b/>
+          <w:bCs/>
+          <w:i/>
+          <w:iCs/>
+          <w:sz w:val="28"/>
+          <w:szCs w:val="28"/>
+        </w:rPr>
+        <w:t>docker.io/library/</w:t>
+      </w:r>
+      <w:proofErr w:type="spellStart"/>
+      <w:proofErr w:type="gramStart"/>
+      <w:r>
+        <w:rPr>
+          <w:rFonts w:asciiTheme="majorBidi" w:hAnsiTheme="majorBidi" w:cstheme="majorBidi"/>
+          <w:b/>
+          <w:bCs/>
+          <w:i/>
+          <w:iCs/>
+          <w:sz w:val="28"/>
+          <w:szCs w:val="28"/>
+        </w:rPr>
+        <w:t>nginx:latest</w:t>
+      </w:r>
+      <w:proofErr w:type="spellEnd"/>
+      <w:proofErr w:type="gramEnd"/>
     </w:p>
     <w:p>
       <w:pPr>
@@ -3700,50 +4020,10 @@
           <w:sz w:val="28"/>
           <w:szCs w:val="28"/>
         </w:rPr>
-        <w:t>docker tag myapp:latest myrepo/myapp:v1</w:t>
-      </w:r>
-      <w:r>
-        <w:rPr>
-          <w:rFonts w:asciiTheme="majorBidi" w:hAnsiTheme="majorBidi" w:cstheme="majorBidi"/>
-          <w:sz w:val="28"/>
-          <w:szCs w:val="28"/>
-        </w:rPr>
-        <w:t xml:space="preserve"> </w:t>
-      </w:r>
-      <w:r>
-        <w:rPr>
-          <w:rFonts w:asciiTheme="majorBidi" w:hAnsiTheme="majorBidi" w:cstheme="majorBidi"/>
-          <w:sz w:val="28"/>
-          <w:szCs w:val="28"/>
-        </w:rPr>
-        <w:t xml:space="preserve">→ </w:t>
-      </w:r>
-      <w:r>
-        <w:rPr>
-          <w:rFonts w:asciiTheme="majorBidi" w:hAnsiTheme="majorBidi" w:cstheme="majorBidi"/>
-          <w:sz w:val="28"/>
-          <w:szCs w:val="28"/>
-        </w:rPr>
-        <w:t>You didn’t copy the image. You created another name pointing to the same image ID.</w:t>
-      </w:r>
-    </w:p>
-    <w:p>
-      <w:pPr>
-        <w:jc w:val="both"/>
-        <w:rPr>
-          <w:rFonts w:asciiTheme="majorBidi" w:hAnsiTheme="majorBidi" w:cstheme="majorBidi"/>
-          <w:sz w:val="28"/>
-          <w:szCs w:val="28"/>
-        </w:rPr>
-      </w:pPr>
-      <w:r>
-        <w:rPr>
-          <w:rFonts w:asciiTheme="majorBidi" w:hAnsiTheme="majorBidi" w:cstheme="majorBidi"/>
-          <w:sz w:val="28"/>
-          <w:szCs w:val="28"/>
-        </w:rPr>
-        <w:t xml:space="preserve">If you omit tag, Docker assumes </w:t>
-      </w:r>
+        <w:t xml:space="preserve">docker tag </w:t>
+      </w:r>
+      <w:proofErr w:type="spellStart"/>
+      <w:proofErr w:type="gramStart"/>
       <w:r>
         <w:rPr>
           <w:rFonts w:asciiTheme="majorBidi" w:hAnsiTheme="majorBidi" w:cstheme="majorBidi"/>
@@ -3754,8 +4034,138 @@
           <w:sz w:val="28"/>
           <w:szCs w:val="28"/>
         </w:rPr>
+        <w:t>myapp:latest</w:t>
+      </w:r>
+      <w:proofErr w:type="spellEnd"/>
+      <w:proofErr w:type="gramEnd"/>
+      <w:r>
+        <w:rPr>
+          <w:rFonts w:asciiTheme="majorBidi" w:hAnsiTheme="majorBidi" w:cstheme="majorBidi"/>
+          <w:b/>
+          <w:bCs/>
+          <w:i/>
+          <w:iCs/>
+          <w:sz w:val="28"/>
+          <w:szCs w:val="28"/>
+        </w:rPr>
+        <w:t xml:space="preserve"> </w:t>
+      </w:r>
+      <w:proofErr w:type="spellStart"/>
+      <w:r>
+        <w:rPr>
+          <w:rFonts w:asciiTheme="majorBidi" w:hAnsiTheme="majorBidi" w:cstheme="majorBidi"/>
+          <w:b/>
+          <w:bCs/>
+          <w:i/>
+          <w:iCs/>
+          <w:sz w:val="28"/>
+          <w:szCs w:val="28"/>
+        </w:rPr>
+        <w:t>myrepo</w:t>
+      </w:r>
+      <w:proofErr w:type="spellEnd"/>
+      <w:r>
+        <w:rPr>
+          <w:rFonts w:asciiTheme="majorBidi" w:hAnsiTheme="majorBidi" w:cstheme="majorBidi"/>
+          <w:b/>
+          <w:bCs/>
+          <w:i/>
+          <w:iCs/>
+          <w:sz w:val="28"/>
+          <w:szCs w:val="28"/>
+        </w:rPr>
+        <w:t>/</w:t>
+      </w:r>
+      <w:proofErr w:type="gramStart"/>
+      <w:r>
+        <w:rPr>
+          <w:rFonts w:asciiTheme="majorBidi" w:hAnsiTheme="majorBidi" w:cstheme="majorBidi"/>
+          <w:b/>
+          <w:bCs/>
+          <w:i/>
+          <w:iCs/>
+          <w:sz w:val="28"/>
+          <w:szCs w:val="28"/>
+        </w:rPr>
+        <w:t>myapp:v</w:t>
+      </w:r>
+      <w:proofErr w:type="gramEnd"/>
+      <w:r>
+        <w:rPr>
+          <w:rFonts w:asciiTheme="majorBidi" w:hAnsiTheme="majorBidi" w:cstheme="majorBidi"/>
+          <w:b/>
+          <w:bCs/>
+          <w:i/>
+          <w:iCs/>
+          <w:sz w:val="28"/>
+          <w:szCs w:val="28"/>
+        </w:rPr>
+        <w:t>1</w:t>
+      </w:r>
+      <w:r>
+        <w:rPr>
+          <w:rFonts w:asciiTheme="majorBidi" w:hAnsiTheme="majorBidi" w:cstheme="majorBidi"/>
+          <w:sz w:val="28"/>
+          <w:szCs w:val="28"/>
+        </w:rPr>
+        <w:t xml:space="preserve"> </w:t>
+      </w:r>
+      <w:r>
+        <w:rPr>
+          <w:rFonts w:asciiTheme="majorBidi" w:hAnsiTheme="majorBidi" w:cstheme="majorBidi"/>
+          <w:sz w:val="28"/>
+          <w:szCs w:val="28"/>
+        </w:rPr>
+        <w:t xml:space="preserve">→ </w:t>
+      </w:r>
+      <w:r>
+        <w:rPr>
+          <w:rFonts w:asciiTheme="majorBidi" w:hAnsiTheme="majorBidi" w:cstheme="majorBidi"/>
+          <w:sz w:val="28"/>
+          <w:szCs w:val="28"/>
+        </w:rPr>
+        <w:t>You didn’t copy the image. You created another name pointing to the same image ID.</w:t>
+      </w:r>
+    </w:p>
+    <w:p>
+      <w:pPr>
+        <w:jc w:val="both"/>
+        <w:rPr>
+          <w:rFonts w:asciiTheme="majorBidi" w:hAnsiTheme="majorBidi" w:cstheme="majorBidi"/>
+          <w:sz w:val="28"/>
+          <w:szCs w:val="28"/>
+        </w:rPr>
+      </w:pPr>
+      <w:r>
+        <w:rPr>
+          <w:rFonts w:asciiTheme="majorBidi" w:hAnsiTheme="majorBidi" w:cstheme="majorBidi"/>
+          <w:sz w:val="28"/>
+          <w:szCs w:val="28"/>
+        </w:rPr>
+        <w:t xml:space="preserve">If you omit tag, Docker </w:t>
+      </w:r>
+      <w:proofErr w:type="gramStart"/>
+      <w:r>
+        <w:rPr>
+          <w:rFonts w:asciiTheme="majorBidi" w:hAnsiTheme="majorBidi" w:cstheme="majorBidi"/>
+          <w:sz w:val="28"/>
+          <w:szCs w:val="28"/>
+        </w:rPr>
+        <w:t xml:space="preserve">assumes </w:t>
+      </w:r>
+      <w:r>
+        <w:rPr>
+          <w:rFonts w:asciiTheme="majorBidi" w:hAnsiTheme="majorBidi" w:cstheme="majorBidi"/>
+          <w:b/>
+          <w:bCs/>
+          <w:i/>
+          <w:iCs/>
+          <w:sz w:val="28"/>
+          <w:szCs w:val="28"/>
+        </w:rPr>
         <w:t>:latest</w:t>
       </w:r>
+      <w:proofErr w:type="gramEnd"/>
       <w:r>
         <w:rPr>
           <w:rFonts w:asciiTheme="majorBidi" w:hAnsiTheme="majorBidi" w:cstheme="majorBidi"/>
@@ -4297,7 +4707,27 @@
           <w:sz w:val="28"/>
           <w:szCs w:val="28"/>
         </w:rPr>
-        <w:t>Image itself remains unchanged.This is why multiple containers can share same image safely.</w:t>
+        <w:t xml:space="preserve">Image itself remains </w:t>
+      </w:r>
+      <w:proofErr w:type="spellStart"/>
+      <w:proofErr w:type="gramStart"/>
+      <w:r>
+        <w:rPr>
+          <w:rFonts w:asciiTheme="majorBidi" w:hAnsiTheme="majorBidi" w:cstheme="majorBidi"/>
+          <w:sz w:val="28"/>
+          <w:szCs w:val="28"/>
+        </w:rPr>
+        <w:t>unchanged.This</w:t>
+      </w:r>
+      <w:proofErr w:type="spellEnd"/>
+      <w:proofErr w:type="gramEnd"/>
+      <w:r>
+        <w:rPr>
+          <w:rFonts w:asciiTheme="majorBidi" w:hAnsiTheme="majorBidi" w:cstheme="majorBidi"/>
+          <w:sz w:val="28"/>
+          <w:szCs w:val="28"/>
+        </w:rPr>
+        <w:t xml:space="preserve"> is why multiple containers can share same image safely.</w:t>
       </w:r>
     </w:p>
     <w:p>
@@ -4357,6 +4787,7 @@
           <w:szCs w:val="28"/>
         </w:rPr>
       </w:pPr>
+      <w:proofErr w:type="spellStart"/>
       <w:r>
         <w:rPr>
           <w:rFonts w:asciiTheme="majorBidi" w:hAnsiTheme="majorBidi" w:cstheme="majorBidi"/>
@@ -4365,6 +4796,7 @@
         </w:rPr>
         <w:t>Dockerfile</w:t>
       </w:r>
+      <w:proofErr w:type="spellEnd"/>
       <w:r>
         <w:rPr>
           <w:rFonts w:asciiTheme="majorBidi" w:hAnsiTheme="majorBidi" w:cstheme="majorBidi"/>
@@ -4660,6 +5092,7 @@
     <w:p>
       <w:pPr>
         <w:pStyle w:val="ListParagraph"/>
+        <w:spacing w:after="120"/>
         <w:ind w:left="360"/>
         <w:rPr>
           <w:rFonts w:asciiTheme="majorBidi" w:hAnsiTheme="majorBidi" w:cstheme="majorBidi"/>
@@ -4678,6 +5111,7 @@
     </w:p>
     <w:p>
       <w:pPr>
+        <w:spacing w:after="120"/>
         <w:jc w:val="both"/>
         <w:rPr>
           <w:rFonts w:asciiTheme="majorBidi" w:hAnsiTheme="majorBidi" w:cstheme="majorBidi"/>
@@ -4700,6 +5134,7 @@
     </w:p>
     <w:p>
       <w:pPr>
+        <w:spacing w:after="60"/>
         <w:jc w:val="both"/>
         <w:rPr>
           <w:rFonts w:asciiTheme="majorBidi" w:hAnsiTheme="majorBidi" w:cstheme="majorBidi"/>
@@ -4823,6 +5258,7 @@
           <w:ilvl w:val="0"/>
           <w:numId w:val="12"/>
         </w:numPr>
+        <w:spacing w:after="120"/>
         <w:ind w:left="360"/>
         <w:jc w:val="both"/>
         <w:rPr>
@@ -4842,6 +5278,7 @@
     </w:p>
     <w:p>
       <w:pPr>
+        <w:spacing w:after="60"/>
         <w:jc w:val="both"/>
         <w:rPr>
           <w:rFonts w:asciiTheme="majorBidi" w:hAnsiTheme="majorBidi" w:cstheme="majorBidi"/>
@@ -4965,6 +5402,7 @@
           <w:ilvl w:val="0"/>
           <w:numId w:val="12"/>
         </w:numPr>
+        <w:spacing w:after="120"/>
         <w:ind w:left="360"/>
         <w:jc w:val="both"/>
         <w:rPr>
@@ -4984,24 +5422,28 @@
     </w:p>
     <w:p>
       <w:pPr>
+        <w:spacing w:after="60"/>
         <w:jc w:val="both"/>
         <w:rPr>
           <w:rFonts w:asciiTheme="majorBidi" w:hAnsiTheme="majorBidi" w:cstheme="majorBidi"/>
           <w:sz w:val="28"/>
           <w:szCs w:val="28"/>
-        </w:rPr>
-      </w:pPr>
-      <w:r>
-        <w:rPr>
-          <w:rFonts w:asciiTheme="majorBidi" w:hAnsiTheme="majorBidi" w:cstheme="majorBidi"/>
-          <w:sz w:val="28"/>
-          <w:szCs w:val="28"/>
+          <w:u w:val="single"/>
+        </w:rPr>
+      </w:pPr>
+      <w:r>
+        <w:rPr>
+          <w:rFonts w:asciiTheme="majorBidi" w:hAnsiTheme="majorBidi" w:cstheme="majorBidi"/>
+          <w:sz w:val="28"/>
+          <w:szCs w:val="28"/>
+          <w:u w:val="single"/>
         </w:rPr>
         <w:t>Example analogy:</w:t>
       </w:r>
     </w:p>
     <w:p>
       <w:pPr>
+        <w:spacing w:after="60"/>
         <w:jc w:val="both"/>
         <w:rPr>
           <w:rFonts w:asciiTheme="majorBidi" w:hAnsiTheme="majorBidi" w:cstheme="majorBidi"/>
@@ -5020,6 +5462,7 @@
     </w:p>
     <w:p>
       <w:pPr>
+        <w:spacing w:after="120"/>
         <w:jc w:val="both"/>
         <w:rPr>
           <w:rFonts w:asciiTheme="majorBidi" w:hAnsiTheme="majorBidi" w:cstheme="majorBidi"/>
@@ -5038,6 +5481,7 @@
     </w:p>
     <w:p>
       <w:pPr>
+        <w:spacing w:after="120"/>
         <w:jc w:val="both"/>
         <w:rPr>
           <w:rFonts w:asciiTheme="majorBidi" w:hAnsiTheme="majorBidi" w:cstheme="majorBidi"/>
@@ -5056,6 +5500,7 @@
     </w:p>
     <w:p>
       <w:pPr>
+        <w:spacing w:after="60"/>
         <w:jc w:val="both"/>
         <w:rPr>
           <w:rFonts w:asciiTheme="majorBidi" w:hAnsiTheme="majorBidi" w:cstheme="majorBidi"/>
@@ -5159,6 +5604,7 @@
           <w:ilvl w:val="0"/>
           <w:numId w:val="13"/>
         </w:numPr>
+        <w:spacing w:after="120"/>
         <w:ind w:left="360"/>
         <w:jc w:val="both"/>
         <w:rPr>
@@ -5178,6 +5624,7 @@
     </w:p>
     <w:p>
       <w:pPr>
+        <w:spacing w:after="120"/>
         <w:jc w:val="both"/>
         <w:rPr>
           <w:rFonts w:asciiTheme="majorBidi" w:hAnsiTheme="majorBidi" w:cstheme="majorBidi"/>
@@ -5212,6 +5659,7 @@
     </w:p>
     <w:p>
       <w:pPr>
+        <w:spacing w:after="60"/>
         <w:jc w:val="both"/>
         <w:rPr>
           <w:rFonts w:asciiTheme="majorBidi" w:hAnsiTheme="majorBidi" w:cstheme="majorBidi"/>
@@ -5264,6 +5712,940 @@
           <w:szCs w:val="28"/>
         </w:rPr>
         <w:t xml:space="preserve"> container is an active process created from that data.</w:t>
+      </w:r>
+    </w:p>
+    <w:p>
+      <w:pPr>
+        <w:jc w:val="both"/>
+        <w:rPr>
+          <w:rFonts w:asciiTheme="majorBidi" w:hAnsiTheme="majorBidi" w:cstheme="majorBidi"/>
+          <w:b/>
+          <w:bCs/>
+          <w:sz w:val="36"/>
+          <w:szCs w:val="36"/>
+        </w:rPr>
+      </w:pPr>
+      <w:r>
+        <w:rPr>
+          <w:rFonts w:asciiTheme="majorBidi" w:hAnsiTheme="majorBidi" w:cstheme="majorBidi"/>
+          <w:b/>
+          <w:bCs/>
+          <w:sz w:val="36"/>
+          <w:szCs w:val="36"/>
+        </w:rPr>
+        <w:t xml:space="preserve">Multi </w:t>
+      </w:r>
+      <w:r>
+        <w:rPr>
+          <w:rFonts w:asciiTheme="majorBidi" w:hAnsiTheme="majorBidi" w:cstheme="majorBidi"/>
+          <w:b/>
+          <w:bCs/>
+          <w:sz w:val="36"/>
+          <w:szCs w:val="36"/>
+        </w:rPr>
+        <w:t>multi-architecture image</w:t>
+      </w:r>
+      <w:r>
+        <w:rPr>
+          <w:rFonts w:asciiTheme="majorBidi" w:hAnsiTheme="majorBidi" w:cstheme="majorBidi"/>
+          <w:b/>
+          <w:bCs/>
+          <w:sz w:val="36"/>
+          <w:szCs w:val="36"/>
+        </w:rPr>
+        <w:t>:</w:t>
+      </w:r>
+    </w:p>
+    <w:p>
+      <w:pPr>
+        <w:jc w:val="both"/>
+        <w:rPr>
+          <w:rFonts w:asciiTheme="majorBidi" w:hAnsiTheme="majorBidi" w:cstheme="majorBidi"/>
+          <w:sz w:val="28"/>
+          <w:szCs w:val="28"/>
+        </w:rPr>
+      </w:pPr>
+      <w:r>
+        <w:rPr>
+          <w:rFonts w:asciiTheme="majorBidi" w:hAnsiTheme="majorBidi" w:cstheme="majorBidi"/>
+          <w:sz w:val="28"/>
+          <w:szCs w:val="28"/>
+        </w:rPr>
+        <w:t>A multi-architecture image (also called a multi-arch image) is a single image name that supports multiple CPU architectures — like amd64 (x86_64), arm64, arm/v7, etc.</w:t>
+      </w:r>
+    </w:p>
+    <w:p>
+      <w:pPr>
+        <w:spacing w:after="60"/>
+        <w:jc w:val="both"/>
+        <w:rPr>
+          <w:rFonts w:asciiTheme="majorBidi" w:hAnsiTheme="majorBidi" w:cstheme="majorBidi"/>
+          <w:sz w:val="28"/>
+          <w:szCs w:val="28"/>
+        </w:rPr>
+      </w:pPr>
+      <w:r>
+        <w:rPr>
+          <w:rFonts w:asciiTheme="majorBidi" w:hAnsiTheme="majorBidi" w:cstheme="majorBidi"/>
+          <w:sz w:val="28"/>
+          <w:szCs w:val="28"/>
+          <w:u w:val="single"/>
+        </w:rPr>
+        <w:lastRenderedPageBreak/>
+        <w:t>Here’s the important part:</w:t>
+      </w:r>
+      <w:r>
+        <w:rPr>
+          <w:rFonts w:asciiTheme="majorBidi" w:hAnsiTheme="majorBidi" w:cstheme="majorBidi"/>
+          <w:sz w:val="28"/>
+          <w:szCs w:val="28"/>
+        </w:rPr>
+        <w:t xml:space="preserve"> it is not one image binary.</w:t>
+      </w:r>
+      <w:r>
+        <w:rPr>
+          <w:rFonts w:asciiTheme="majorBidi" w:hAnsiTheme="majorBidi" w:cstheme="majorBidi"/>
+          <w:sz w:val="28"/>
+          <w:szCs w:val="28"/>
+        </w:rPr>
+        <w:t xml:space="preserve"> </w:t>
+      </w:r>
+      <w:r>
+        <w:rPr>
+          <w:rFonts w:asciiTheme="majorBidi" w:hAnsiTheme="majorBidi" w:cstheme="majorBidi"/>
+          <w:sz w:val="28"/>
+          <w:szCs w:val="28"/>
+        </w:rPr>
+        <w:t>It is a manifest list (an index) that points to different images built for different architectures.</w:t>
+      </w:r>
+    </w:p>
+    <w:p>
+      <w:pPr>
+        <w:spacing w:after="120"/>
+        <w:jc w:val="both"/>
+        <w:rPr>
+          <w:rFonts w:asciiTheme="majorBidi" w:hAnsiTheme="majorBidi" w:cstheme="majorBidi"/>
+          <w:sz w:val="28"/>
+          <w:szCs w:val="28"/>
+        </w:rPr>
+      </w:pPr>
+      <w:r>
+        <w:rPr>
+          <w:rFonts w:asciiTheme="majorBidi" w:hAnsiTheme="majorBidi" w:cstheme="majorBidi"/>
+          <w:sz w:val="28"/>
+          <w:szCs w:val="28"/>
+        </w:rPr>
+        <w:t>When you run:</w:t>
+      </w:r>
+      <w:r>
+        <w:rPr>
+          <w:rFonts w:asciiTheme="majorBidi" w:hAnsiTheme="majorBidi" w:cstheme="majorBidi"/>
+          <w:sz w:val="28"/>
+          <w:szCs w:val="28"/>
+        </w:rPr>
+        <w:t xml:space="preserve"> </w:t>
+      </w:r>
+      <w:r>
+        <w:rPr>
+          <w:rFonts w:asciiTheme="majorBidi" w:hAnsiTheme="majorBidi" w:cstheme="majorBidi"/>
+          <w:b/>
+          <w:bCs/>
+          <w:i/>
+          <w:iCs/>
+          <w:sz w:val="28"/>
+          <w:szCs w:val="28"/>
+        </w:rPr>
+        <w:t>docker pull nginx</w:t>
+      </w:r>
+      <w:r>
+        <w:rPr>
+          <w:rFonts w:asciiTheme="majorBidi" w:hAnsiTheme="majorBidi" w:cstheme="majorBidi"/>
+          <w:b/>
+          <w:bCs/>
+          <w:i/>
+          <w:iCs/>
+          <w:sz w:val="28"/>
+          <w:szCs w:val="28"/>
+        </w:rPr>
+        <w:t xml:space="preserve"> </w:t>
+      </w:r>
+      <w:r>
+        <w:rPr>
+          <w:rFonts w:asciiTheme="majorBidi" w:hAnsiTheme="majorBidi" w:cstheme="majorBidi"/>
+          <w:sz w:val="28"/>
+          <w:szCs w:val="28"/>
+        </w:rPr>
+        <w:t xml:space="preserve">→ </w:t>
+      </w:r>
+      <w:r>
+        <w:rPr>
+          <w:rFonts w:asciiTheme="majorBidi" w:hAnsiTheme="majorBidi" w:cstheme="majorBidi"/>
+          <w:sz w:val="28"/>
+          <w:szCs w:val="28"/>
+        </w:rPr>
+        <w:t>Docker checks your machine architecture.</w:t>
+      </w:r>
+      <w:r>
+        <w:rPr>
+          <w:rFonts w:asciiTheme="majorBidi" w:hAnsiTheme="majorBidi" w:cstheme="majorBidi"/>
+          <w:b/>
+          <w:bCs/>
+          <w:i/>
+          <w:iCs/>
+          <w:sz w:val="28"/>
+          <w:szCs w:val="28"/>
+        </w:rPr>
+        <w:t xml:space="preserve"> </w:t>
+      </w:r>
+      <w:r>
+        <w:rPr>
+          <w:rFonts w:asciiTheme="majorBidi" w:hAnsiTheme="majorBidi" w:cstheme="majorBidi"/>
+          <w:sz w:val="28"/>
+          <w:szCs w:val="28"/>
+        </w:rPr>
+        <w:t>If you’re on x86_64, it pulls the amd64 variant.</w:t>
+      </w:r>
+      <w:r>
+        <w:rPr>
+          <w:rFonts w:asciiTheme="majorBidi" w:hAnsiTheme="majorBidi" w:cstheme="majorBidi"/>
+          <w:b/>
+          <w:bCs/>
+          <w:i/>
+          <w:iCs/>
+          <w:sz w:val="28"/>
+          <w:szCs w:val="28"/>
+        </w:rPr>
+        <w:t xml:space="preserve"> </w:t>
+      </w:r>
+      <w:r>
+        <w:rPr>
+          <w:rFonts w:asciiTheme="majorBidi" w:hAnsiTheme="majorBidi" w:cstheme="majorBidi"/>
+          <w:sz w:val="28"/>
+          <w:szCs w:val="28"/>
+        </w:rPr>
+        <w:t>If you’re on an Apple M-series (ARM64), it pulls the arm64 variant.</w:t>
+      </w:r>
+      <w:r>
+        <w:rPr>
+          <w:rFonts w:asciiTheme="majorBidi" w:hAnsiTheme="majorBidi" w:cstheme="majorBidi"/>
+          <w:sz w:val="28"/>
+          <w:szCs w:val="28"/>
+        </w:rPr>
+        <w:t xml:space="preserve"> </w:t>
+      </w:r>
+      <w:r>
+        <w:rPr>
+          <w:rFonts w:asciiTheme="majorBidi" w:hAnsiTheme="majorBidi" w:cstheme="majorBidi"/>
+          <w:sz w:val="28"/>
+          <w:szCs w:val="28"/>
+        </w:rPr>
+        <w:t>Same image name. Different underlying image.</w:t>
+      </w:r>
+    </w:p>
+    <w:p>
+      <w:pPr>
+        <w:spacing w:after="120"/>
+        <w:jc w:val="both"/>
+        <w:rPr>
+          <w:rFonts w:asciiTheme="majorBidi" w:hAnsiTheme="majorBidi" w:cstheme="majorBidi"/>
+          <w:sz w:val="28"/>
+          <w:szCs w:val="28"/>
+          <w:u w:val="single"/>
+        </w:rPr>
+      </w:pPr>
+      <w:r>
+        <w:rPr>
+          <w:rFonts w:asciiTheme="majorBidi" w:hAnsiTheme="majorBidi" w:cstheme="majorBidi"/>
+          <w:sz w:val="28"/>
+          <w:szCs w:val="28"/>
+          <w:u w:val="single"/>
+        </w:rPr>
+        <w:t>Why this matters:</w:t>
+      </w:r>
+    </w:p>
+    <w:p>
+      <w:pPr>
+        <w:spacing w:after="120"/>
+        <w:jc w:val="both"/>
+        <w:rPr>
+          <w:rFonts w:asciiTheme="majorBidi" w:hAnsiTheme="majorBidi" w:cstheme="majorBidi"/>
+          <w:sz w:val="28"/>
+          <w:szCs w:val="28"/>
+        </w:rPr>
+      </w:pPr>
+      <w:r>
+        <w:rPr>
+          <w:rFonts w:asciiTheme="majorBidi" w:hAnsiTheme="majorBidi" w:cstheme="majorBidi"/>
+          <w:sz w:val="28"/>
+          <w:szCs w:val="28"/>
+        </w:rPr>
+        <w:t>CPU architectures are not compatible at the binary level. An amd64 container cannot run natively on arm64. The machine code is different. A multi-arch image solves that by packaging multiple builds under one tag.</w:t>
+      </w:r>
+    </w:p>
+    <w:p>
+      <w:pPr>
+        <w:jc w:val="both"/>
+        <w:rPr>
+          <w:rFonts w:asciiTheme="majorBidi" w:hAnsiTheme="majorBidi" w:cstheme="majorBidi"/>
+          <w:b/>
+          <w:bCs/>
+          <w:sz w:val="28"/>
+          <w:szCs w:val="28"/>
+        </w:rPr>
+      </w:pPr>
+      <w:r>
+        <w:rPr>
+          <w:rFonts w:asciiTheme="majorBidi" w:hAnsiTheme="majorBidi" w:cstheme="majorBidi"/>
+          <w:noProof/>
+          <w:sz w:val="28"/>
+          <w:szCs w:val="28"/>
+        </w:rPr>
+        <mc:AlternateContent>
+          <mc:Choice Requires="wps">
+            <w:drawing>
+              <wp:anchor distT="0" distB="0" distL="114300" distR="114300" simplePos="0" relativeHeight="251669504" behindDoc="0" locked="0" layoutInCell="1" allowOverlap="1" wp14:anchorId="2BB203BD" wp14:editId="45879B02">
+                <wp:simplePos x="0" y="0"/>
+                <wp:positionH relativeFrom="margin">
+                  <wp:align>left</wp:align>
+                </wp:positionH>
+                <wp:positionV relativeFrom="paragraph">
+                  <wp:posOffset>270510</wp:posOffset>
+                </wp:positionV>
+                <wp:extent cx="2484120" cy="1005840"/>
+                <wp:effectExtent l="0" t="0" r="11430" b="22860"/>
+                <wp:wrapNone/>
+                <wp:docPr id="1256463025" name="Rectangle 4"/>
+                <wp:cNvGraphicFramePr/>
+                <a:graphic xmlns:a="http://schemas.openxmlformats.org/drawingml/2006/main">
+                  <a:graphicData uri="http://schemas.microsoft.com/office/word/2010/wordprocessingShape">
+                    <wps:wsp>
+                      <wps:cNvSpPr/>
+                      <wps:spPr>
+                        <a:xfrm>
+                          <a:off x="0" y="0"/>
+                          <a:ext cx="2484120" cy="1005840"/>
+                        </a:xfrm>
+                        <a:prstGeom prst="rect">
+                          <a:avLst/>
+                        </a:prstGeom>
+                      </wps:spPr>
+                      <wps:style>
+                        <a:lnRef idx="2">
+                          <a:schemeClr val="dk1">
+                            <a:shade val="15000"/>
+                          </a:schemeClr>
+                        </a:lnRef>
+                        <a:fillRef idx="1">
+                          <a:schemeClr val="dk1"/>
+                        </a:fillRef>
+                        <a:effectRef idx="0">
+                          <a:schemeClr val="dk1"/>
+                        </a:effectRef>
+                        <a:fontRef idx="minor">
+                          <a:schemeClr val="lt1"/>
+                        </a:fontRef>
+                      </wps:style>
+                      <wps:txbx>
+                        <w:txbxContent>
+                          <w:p>
+                            <w:pPr>
+                              <w:spacing w:after="0"/>
+                              <w:rPr>
+                                <w:rFonts w:asciiTheme="majorBidi" w:hAnsiTheme="majorBidi" w:cstheme="majorBidi"/>
+                                <w:sz w:val="28"/>
+                                <w:szCs w:val="28"/>
+                              </w:rPr>
+                            </w:pPr>
+                            <w:proofErr w:type="spellStart"/>
+                            <w:proofErr w:type="gramStart"/>
+                            <w:r>
+                              <w:rPr>
+                                <w:rFonts w:asciiTheme="majorBidi" w:hAnsiTheme="majorBidi" w:cstheme="majorBidi"/>
+                                <w:sz w:val="28"/>
+                                <w:szCs w:val="28"/>
+                              </w:rPr>
+                              <w:t>nginx:latest</w:t>
+                            </w:r>
+                            <w:proofErr w:type="spellEnd"/>
+                            <w:proofErr w:type="gramEnd"/>
+                          </w:p>
+                          <w:p>
+                            <w:pPr>
+                              <w:spacing w:after="0"/>
+                              <w:rPr>
+                                <w:rFonts w:asciiTheme="majorBidi" w:hAnsiTheme="majorBidi" w:cstheme="majorBidi"/>
+                                <w:sz w:val="28"/>
+                                <w:szCs w:val="28"/>
+                              </w:rPr>
+                            </w:pPr>
+                            <w:r>
+                              <w:rPr>
+                                <w:rFonts w:asciiTheme="majorBidi" w:hAnsiTheme="majorBidi" w:cstheme="majorBidi"/>
+                                <w:sz w:val="28"/>
+                                <w:szCs w:val="28"/>
+                              </w:rPr>
+                              <w:t xml:space="preserve"> </w:t>
+                            </w:r>
+                            <w:r>
+                              <w:rPr>
+                                <w:rFonts w:asciiTheme="majorBidi" w:eastAsia="MS Gothic" w:hAnsiTheme="majorBidi" w:cstheme="majorBidi"/>
+                                <w:sz w:val="28"/>
+                                <w:szCs w:val="28"/>
+                              </w:rPr>
+                              <w:t>├</w:t>
+                            </w:r>
+                            <w:r>
+                              <w:rPr>
+                                <w:rFonts w:asciiTheme="majorBidi" w:hAnsiTheme="majorBidi" w:cstheme="majorBidi"/>
+                                <w:sz w:val="28"/>
+                                <w:szCs w:val="28"/>
+                              </w:rPr>
+                              <w:t>── amd64 image</w:t>
+                            </w:r>
+                          </w:p>
+                          <w:p>
+                            <w:pPr>
+                              <w:spacing w:after="0"/>
+                              <w:rPr>
+                                <w:rFonts w:asciiTheme="majorBidi" w:hAnsiTheme="majorBidi" w:cstheme="majorBidi"/>
+                                <w:sz w:val="28"/>
+                                <w:szCs w:val="28"/>
+                              </w:rPr>
+                            </w:pPr>
+                            <w:r>
+                              <w:rPr>
+                                <w:rFonts w:asciiTheme="majorBidi" w:hAnsiTheme="majorBidi" w:cstheme="majorBidi"/>
+                                <w:sz w:val="28"/>
+                                <w:szCs w:val="28"/>
+                              </w:rPr>
+                              <w:t xml:space="preserve"> </w:t>
+                            </w:r>
+                            <w:r>
+                              <w:rPr>
+                                <w:rFonts w:asciiTheme="majorBidi" w:eastAsia="MS Gothic" w:hAnsiTheme="majorBidi" w:cstheme="majorBidi"/>
+                                <w:sz w:val="28"/>
+                                <w:szCs w:val="28"/>
+                              </w:rPr>
+                              <w:t>├</w:t>
+                            </w:r>
+                            <w:r>
+                              <w:rPr>
+                                <w:rFonts w:asciiTheme="majorBidi" w:hAnsiTheme="majorBidi" w:cstheme="majorBidi"/>
+                                <w:sz w:val="28"/>
+                                <w:szCs w:val="28"/>
+                              </w:rPr>
+                              <w:t>── arm64 image</w:t>
+                            </w:r>
+                          </w:p>
+                          <w:p>
+                            <w:pPr>
+                              <w:spacing w:after="0"/>
+                              <w:rPr>
+                                <w:rFonts w:asciiTheme="majorBidi" w:hAnsiTheme="majorBidi" w:cstheme="majorBidi"/>
+                                <w:sz w:val="28"/>
+                                <w:szCs w:val="28"/>
+                              </w:rPr>
+                            </w:pPr>
+                            <w:r>
+                              <w:rPr>
+                                <w:rFonts w:asciiTheme="majorBidi" w:hAnsiTheme="majorBidi" w:cstheme="majorBidi"/>
+                                <w:sz w:val="28"/>
+                                <w:szCs w:val="28"/>
+                              </w:rPr>
+                              <w:t xml:space="preserve"> └── arm/v7 image</w:t>
+                            </w:r>
+                          </w:p>
+                        </w:txbxContent>
+                      </wps:txbx>
+                      <wps:bodyPr rot="0" spcFirstLastPara="0" vertOverflow="overflow" horzOverflow="overflow" vert="horz" wrap="square" lIns="91440" tIns="45720" rIns="91440" bIns="45720" numCol="1" spcCol="0" rtlCol="0" fromWordArt="0" anchor="ctr" anchorCtr="0" forceAA="0" compatLnSpc="1">
+                        <a:prstTxWarp prst="textNoShape">
+                          <a:avLst/>
+                        </a:prstTxWarp>
+                        <a:noAutofit/>
+                      </wps:bodyPr>
+                    </wps:wsp>
+                  </a:graphicData>
+                </a:graphic>
+                <wp14:sizeRelH relativeFrom="margin">
+                  <wp14:pctWidth>0</wp14:pctWidth>
+                </wp14:sizeRelH>
+                <wp14:sizeRelV relativeFrom="margin">
+                  <wp14:pctHeight>0</wp14:pctHeight>
+                </wp14:sizeRelV>
+              </wp:anchor>
+            </w:drawing>
+          </mc:Choice>
+          <mc:Fallback>
+            <w:pict>
+              <v:rect w14:anchorId="2BB203BD" id="Rectangle 4" o:spid="_x0000_s1029" style="position:absolute;left:0;text-align:left;margin-left:0;margin-top:21.3pt;width:195.6pt;height:79.2pt;z-index:251669504;visibility:visible;mso-wrap-style:square;mso-width-percent:0;mso-height-percent:0;mso-wrap-distance-left:9pt;mso-wrap-distance-top:0;mso-wrap-distance-right:9pt;mso-wrap-distance-bottom:0;mso-position-horizontal:left;mso-position-horizontal-relative:margin;mso-position-vertical:absolute;mso-position-vertical-relative:text;mso-width-percent:0;mso-height-percent:0;mso-width-relative:margin;mso-height-relative:margin;v-text-anchor:middle" o:gfxdata="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" fillcolor="black [3200]" strokecolor="black [480]" strokeweight="1pt">
+                <v:textbox>
+                  <w:txbxContent>
+                    <w:p>
+                      <w:pPr>
+                        <w:spacing w:after="0"/>
+                        <w:rPr>
+                          <w:rFonts w:asciiTheme="majorBidi" w:hAnsiTheme="majorBidi" w:cstheme="majorBidi"/>
+                          <w:sz w:val="28"/>
+                          <w:szCs w:val="28"/>
+                        </w:rPr>
+                      </w:pPr>
+                      <w:proofErr w:type="spellStart"/>
+                      <w:proofErr w:type="gramStart"/>
+                      <w:r>
+                        <w:rPr>
+                          <w:rFonts w:asciiTheme="majorBidi" w:hAnsiTheme="majorBidi" w:cstheme="majorBidi"/>
+                          <w:sz w:val="28"/>
+                          <w:szCs w:val="28"/>
+                        </w:rPr>
+                        <w:t>nginx:latest</w:t>
+                      </w:r>
+                      <w:proofErr w:type="spellEnd"/>
+                      <w:proofErr w:type="gramEnd"/>
+                    </w:p>
+                    <w:p>
+                      <w:pPr>
+                        <w:spacing w:after="0"/>
+                        <w:rPr>
+                          <w:rFonts w:asciiTheme="majorBidi" w:hAnsiTheme="majorBidi" w:cstheme="majorBidi"/>
+                          <w:sz w:val="28"/>
+                          <w:szCs w:val="28"/>
+                        </w:rPr>
+                      </w:pPr>
+                      <w:r>
+                        <w:rPr>
+                          <w:rFonts w:asciiTheme="majorBidi" w:hAnsiTheme="majorBidi" w:cstheme="majorBidi"/>
+                          <w:sz w:val="28"/>
+                          <w:szCs w:val="28"/>
+                        </w:rPr>
+                        <w:t xml:space="preserve"> </w:t>
+                      </w:r>
+                      <w:r>
+                        <w:rPr>
+                          <w:rFonts w:asciiTheme="majorBidi" w:eastAsia="MS Gothic" w:hAnsiTheme="majorBidi" w:cstheme="majorBidi"/>
+                          <w:sz w:val="28"/>
+                          <w:szCs w:val="28"/>
+                        </w:rPr>
+                        <w:t>├</w:t>
+                      </w:r>
+                      <w:r>
+                        <w:rPr>
+                          <w:rFonts w:asciiTheme="majorBidi" w:hAnsiTheme="majorBidi" w:cstheme="majorBidi"/>
+                          <w:sz w:val="28"/>
+                          <w:szCs w:val="28"/>
+                        </w:rPr>
+                        <w:t>── amd64 image</w:t>
+                      </w:r>
+                    </w:p>
+                    <w:p>
+                      <w:pPr>
+                        <w:spacing w:after="0"/>
+                        <w:rPr>
+                          <w:rFonts w:asciiTheme="majorBidi" w:hAnsiTheme="majorBidi" w:cstheme="majorBidi"/>
+                          <w:sz w:val="28"/>
+                          <w:szCs w:val="28"/>
+                        </w:rPr>
+                      </w:pPr>
+                      <w:r>
+                        <w:rPr>
+                          <w:rFonts w:asciiTheme="majorBidi" w:hAnsiTheme="majorBidi" w:cstheme="majorBidi"/>
+                          <w:sz w:val="28"/>
+                          <w:szCs w:val="28"/>
+                        </w:rPr>
+                        <w:t xml:space="preserve"> </w:t>
+                      </w:r>
+                      <w:r>
+                        <w:rPr>
+                          <w:rFonts w:asciiTheme="majorBidi" w:eastAsia="MS Gothic" w:hAnsiTheme="majorBidi" w:cstheme="majorBidi"/>
+                          <w:sz w:val="28"/>
+                          <w:szCs w:val="28"/>
+                        </w:rPr>
+                        <w:t>├</w:t>
+                      </w:r>
+                      <w:r>
+                        <w:rPr>
+                          <w:rFonts w:asciiTheme="majorBidi" w:hAnsiTheme="majorBidi" w:cstheme="majorBidi"/>
+                          <w:sz w:val="28"/>
+                          <w:szCs w:val="28"/>
+                        </w:rPr>
+                        <w:t>── arm64 image</w:t>
+                      </w:r>
+                    </w:p>
+                    <w:p>
+                      <w:pPr>
+                        <w:spacing w:after="0"/>
+                        <w:rPr>
+                          <w:rFonts w:asciiTheme="majorBidi" w:hAnsiTheme="majorBidi" w:cstheme="majorBidi"/>
+                          <w:sz w:val="28"/>
+                          <w:szCs w:val="28"/>
+                        </w:rPr>
+                      </w:pPr>
+                      <w:r>
+                        <w:rPr>
+                          <w:rFonts w:asciiTheme="majorBidi" w:hAnsiTheme="majorBidi" w:cstheme="majorBidi"/>
+                          <w:sz w:val="28"/>
+                          <w:szCs w:val="28"/>
+                        </w:rPr>
+                        <w:t xml:space="preserve"> └── arm/v7 image</w:t>
+                      </w:r>
+                    </w:p>
+                  </w:txbxContent>
+                </v:textbox>
+                <w10:wrap anchorx="margin"/>
+              </v:rect>
+            </w:pict>
+          </mc:Fallback>
+        </mc:AlternateContent>
+      </w:r>
+      <w:r>
+        <w:rPr>
+          <w:rFonts w:asciiTheme="majorBidi" w:hAnsiTheme="majorBidi" w:cstheme="majorBidi"/>
+          <w:b/>
+          <w:bCs/>
+          <w:sz w:val="28"/>
+          <w:szCs w:val="28"/>
+        </w:rPr>
+        <w:t>Conceptually:</w:t>
+      </w:r>
+    </w:p>
+    <w:p>
+      <w:pPr>
+        <w:jc w:val="both"/>
+        <w:rPr>
+          <w:rFonts w:asciiTheme="majorBidi" w:hAnsiTheme="majorBidi" w:cstheme="majorBidi"/>
+          <w:sz w:val="28"/>
+          <w:szCs w:val="28"/>
+        </w:rPr>
+      </w:pPr>
+    </w:p>
+    <w:p>
+      <w:pPr>
+        <w:jc w:val="both"/>
+        <w:rPr>
+          <w:rFonts w:asciiTheme="majorBidi" w:hAnsiTheme="majorBidi" w:cstheme="majorBidi"/>
+          <w:sz w:val="28"/>
+          <w:szCs w:val="28"/>
+        </w:rPr>
+      </w:pPr>
+    </w:p>
+    <w:p>
+      <w:pPr>
+        <w:jc w:val="both"/>
+        <w:rPr>
+          <w:rFonts w:asciiTheme="majorBidi" w:hAnsiTheme="majorBidi" w:cstheme="majorBidi"/>
+          <w:sz w:val="28"/>
+          <w:szCs w:val="28"/>
+        </w:rPr>
+      </w:pPr>
+    </w:p>
+    <w:p>
+      <w:pPr>
+        <w:spacing w:after="120"/>
+        <w:jc w:val="both"/>
+        <w:rPr>
+          <w:rFonts w:asciiTheme="majorBidi" w:hAnsiTheme="majorBidi" w:cstheme="majorBidi"/>
+          <w:sz w:val="28"/>
+          <w:szCs w:val="28"/>
+        </w:rPr>
+      </w:pPr>
+      <w:r>
+        <w:rPr>
+          <w:rFonts w:asciiTheme="majorBidi" w:hAnsiTheme="majorBidi" w:cstheme="majorBidi"/>
+          <w:sz w:val="28"/>
+          <w:szCs w:val="28"/>
+        </w:rPr>
+        <w:t>Docker chooses automatically at pull time.</w:t>
+      </w:r>
+    </w:p>
+    <w:p>
+      <w:pPr>
+        <w:spacing w:after="120"/>
+        <w:jc w:val="both"/>
+        <w:rPr>
+          <w:rFonts w:asciiTheme="majorBidi" w:hAnsiTheme="majorBidi" w:cstheme="majorBidi"/>
+          <w:sz w:val="28"/>
+          <w:szCs w:val="28"/>
+        </w:rPr>
+      </w:pPr>
+      <w:r>
+        <w:rPr>
+          <w:rFonts w:asciiTheme="majorBidi" w:hAnsiTheme="majorBidi" w:cstheme="majorBidi"/>
+          <w:sz w:val="28"/>
+          <w:szCs w:val="28"/>
+        </w:rPr>
+        <w:t>You can inspect architectures with:</w:t>
+      </w:r>
+      <w:r>
+        <w:rPr>
+          <w:rFonts w:asciiTheme="majorBidi" w:hAnsiTheme="majorBidi" w:cstheme="majorBidi"/>
+          <w:sz w:val="28"/>
+          <w:szCs w:val="28"/>
+        </w:rPr>
+        <w:t xml:space="preserve"> </w:t>
+      </w:r>
+      <w:r>
+        <w:rPr>
+          <w:rFonts w:asciiTheme="majorBidi" w:hAnsiTheme="majorBidi" w:cstheme="majorBidi"/>
+          <w:b/>
+          <w:bCs/>
+          <w:i/>
+          <w:iCs/>
+          <w:sz w:val="28"/>
+          <w:szCs w:val="28"/>
+        </w:rPr>
+        <w:t>docker manifest inspect nginx</w:t>
+      </w:r>
+    </w:p>
+    <w:p>
+      <w:pPr>
+        <w:spacing w:after="120"/>
+        <w:jc w:val="both"/>
+        <w:rPr>
+          <w:rFonts w:asciiTheme="majorBidi" w:hAnsiTheme="majorBidi" w:cstheme="majorBidi"/>
+          <w:sz w:val="28"/>
+          <w:szCs w:val="28"/>
+        </w:rPr>
+      </w:pPr>
+      <w:r>
+        <w:rPr>
+          <w:rFonts w:asciiTheme="majorBidi" w:hAnsiTheme="majorBidi" w:cstheme="majorBidi"/>
+          <w:sz w:val="28"/>
+          <w:szCs w:val="28"/>
+        </w:rPr>
+        <w:t>Multi-arch images are essential today because:</w:t>
+      </w:r>
+    </w:p>
+    <w:p>
+      <w:pPr>
+        <w:pStyle w:val="ListParagraph"/>
+        <w:numPr>
+          <w:ilvl w:val="0"/>
+          <w:numId w:val="86"/>
+        </w:numPr>
+        <w:ind w:left="360"/>
+        <w:jc w:val="both"/>
+        <w:rPr>
+          <w:rFonts w:asciiTheme="majorBidi" w:hAnsiTheme="majorBidi" w:cstheme="majorBidi"/>
+          <w:sz w:val="28"/>
+          <w:szCs w:val="28"/>
+        </w:rPr>
+      </w:pPr>
+      <w:r>
+        <w:rPr>
+          <w:rFonts w:asciiTheme="majorBidi" w:hAnsiTheme="majorBidi" w:cstheme="majorBidi"/>
+          <w:sz w:val="28"/>
+          <w:szCs w:val="28"/>
+        </w:rPr>
+        <w:t>Cloud servers are often amd64</w:t>
+      </w:r>
+    </w:p>
+    <w:p>
+      <w:pPr>
+        <w:pStyle w:val="ListParagraph"/>
+        <w:numPr>
+          <w:ilvl w:val="0"/>
+          <w:numId w:val="86"/>
+        </w:numPr>
+        <w:ind w:left="360"/>
+        <w:jc w:val="both"/>
+        <w:rPr>
+          <w:rFonts w:asciiTheme="majorBidi" w:hAnsiTheme="majorBidi" w:cstheme="majorBidi"/>
+          <w:sz w:val="28"/>
+          <w:szCs w:val="28"/>
+        </w:rPr>
+      </w:pPr>
+      <w:r>
+        <w:rPr>
+          <w:rFonts w:asciiTheme="majorBidi" w:hAnsiTheme="majorBidi" w:cstheme="majorBidi"/>
+          <w:sz w:val="28"/>
+          <w:szCs w:val="28"/>
+        </w:rPr>
+        <w:t>Raspberry Pi is arm</w:t>
+      </w:r>
+    </w:p>
+    <w:p>
+      <w:pPr>
+        <w:pStyle w:val="ListParagraph"/>
+        <w:numPr>
+          <w:ilvl w:val="0"/>
+          <w:numId w:val="86"/>
+        </w:numPr>
+        <w:spacing w:after="120"/>
+        <w:ind w:left="360"/>
+        <w:jc w:val="both"/>
+        <w:rPr>
+          <w:rFonts w:asciiTheme="majorBidi" w:hAnsiTheme="majorBidi" w:cstheme="majorBidi"/>
+          <w:sz w:val="28"/>
+          <w:szCs w:val="28"/>
+        </w:rPr>
+      </w:pPr>
+      <w:r>
+        <w:rPr>
+          <w:rFonts w:asciiTheme="majorBidi" w:hAnsiTheme="majorBidi" w:cstheme="majorBidi"/>
+          <w:sz w:val="28"/>
+          <w:szCs w:val="28"/>
+        </w:rPr>
+        <w:t>Apple Silicon laptops are arm64</w:t>
+      </w:r>
+    </w:p>
+    <w:p>
+      <w:pPr>
+        <w:spacing w:after="120"/>
+        <w:jc w:val="both"/>
+        <w:rPr>
+          <w:rFonts w:asciiTheme="majorBidi" w:hAnsiTheme="majorBidi" w:cstheme="majorBidi"/>
+          <w:sz w:val="28"/>
+          <w:szCs w:val="28"/>
+        </w:rPr>
+      </w:pPr>
+      <w:r>
+        <w:rPr>
+          <w:rFonts w:asciiTheme="majorBidi" w:hAnsiTheme="majorBidi" w:cstheme="majorBidi"/>
+          <w:sz w:val="28"/>
+          <w:szCs w:val="28"/>
+        </w:rPr>
+        <w:t>Without multi-arch, you would need separate image names for each platform. With it, one tag works everywhere.</w:t>
+      </w:r>
+    </w:p>
+    <w:p>
+      <w:pPr>
+        <w:spacing w:after="60"/>
+        <w:jc w:val="both"/>
+        <w:rPr>
+          <w:rFonts w:asciiTheme="majorBidi" w:hAnsiTheme="majorBidi" w:cstheme="majorBidi"/>
+          <w:b/>
+          <w:bCs/>
+          <w:sz w:val="32"/>
+          <w:szCs w:val="32"/>
+        </w:rPr>
+      </w:pPr>
+      <w:r>
+        <w:rPr>
+          <w:rFonts w:asciiTheme="majorBidi" w:hAnsiTheme="majorBidi" w:cstheme="majorBidi"/>
+          <w:b/>
+          <w:bCs/>
+          <w:sz w:val="32"/>
+          <w:szCs w:val="32"/>
+        </w:rPr>
+        <w:t>Manifest &amp; Manifest List:</w:t>
+      </w:r>
+    </w:p>
+    <w:p>
+      <w:pPr>
+        <w:spacing w:after="60"/>
+        <w:rPr>
+          <w:rFonts w:asciiTheme="majorBidi" w:hAnsiTheme="majorBidi" w:cstheme="majorBidi"/>
+          <w:sz w:val="28"/>
+          <w:szCs w:val="28"/>
+        </w:rPr>
+      </w:pPr>
+      <w:r>
+        <w:rPr>
+          <w:rFonts w:asciiTheme="majorBidi" w:hAnsiTheme="majorBidi" w:cstheme="majorBidi"/>
+          <w:sz w:val="28"/>
+          <w:szCs w:val="28"/>
+        </w:rPr>
+        <w:t>A manifest is the JSON document that describes a single image — its layers, configuration, architecture (like amd64 or arm64), and how to assemble it. Think of it as the blueprint for one specific build of an image.</w:t>
+      </w:r>
+    </w:p>
+    <w:p>
+      <w:pPr>
+        <w:spacing w:after="60"/>
+        <w:rPr>
+          <w:rFonts w:asciiTheme="majorBidi" w:hAnsiTheme="majorBidi" w:cstheme="majorBidi"/>
+          <w:sz w:val="28"/>
+          <w:szCs w:val="28"/>
+        </w:rPr>
+      </w:pPr>
+      <w:r>
+        <w:rPr>
+          <w:rFonts w:asciiTheme="majorBidi" w:hAnsiTheme="majorBidi" w:cstheme="majorBidi"/>
+          <w:sz w:val="28"/>
+          <w:szCs w:val="28"/>
+        </w:rPr>
+        <w:t>A manifest list (also called an image index) is a higher-level JSON document that points to multiple manifests, each for a different architecture. It’s the traffic controller. When you pull an image, Docker looks at the manifest list, detects your CPU architecture, and selects the correct manifest automatically.</w:t>
+      </w:r>
+    </w:p>
+    <w:p>
+      <w:pPr>
+        <w:spacing w:after="60"/>
+        <w:rPr>
+          <w:rFonts w:asciiTheme="majorBidi" w:hAnsiTheme="majorBidi" w:cstheme="majorBidi"/>
+          <w:sz w:val="28"/>
+          <w:szCs w:val="28"/>
+        </w:rPr>
+      </w:pPr>
+      <w:r>
+        <w:rPr>
+          <w:rFonts w:asciiTheme="majorBidi" w:hAnsiTheme="majorBidi" w:cstheme="majorBidi"/>
+          <w:sz w:val="28"/>
+          <w:szCs w:val="28"/>
+        </w:rPr>
+        <w:t>So:</w:t>
+      </w:r>
+    </w:p>
+    <w:p>
+      <w:pPr>
+        <w:pStyle w:val="ListParagraph"/>
+        <w:numPr>
+          <w:ilvl w:val="0"/>
+          <w:numId w:val="87"/>
+        </w:numPr>
+        <w:ind w:left="504"/>
+        <w:rPr>
+          <w:rFonts w:asciiTheme="majorBidi" w:hAnsiTheme="majorBidi" w:cstheme="majorBidi"/>
+          <w:sz w:val="28"/>
+          <w:szCs w:val="28"/>
+        </w:rPr>
+      </w:pPr>
+      <w:r>
+        <w:rPr>
+          <w:rFonts w:asciiTheme="majorBidi" w:hAnsiTheme="majorBidi" w:cstheme="majorBidi"/>
+          <w:sz w:val="28"/>
+          <w:szCs w:val="28"/>
+        </w:rPr>
+        <w:t>Manifest → describes one concrete image build</w:t>
+      </w:r>
+    </w:p>
+    <w:p>
+      <w:pPr>
+        <w:pStyle w:val="ListParagraph"/>
+        <w:numPr>
+          <w:ilvl w:val="0"/>
+          <w:numId w:val="87"/>
+        </w:numPr>
+        <w:spacing w:after="60"/>
+        <w:ind w:left="504"/>
+        <w:rPr>
+          <w:rFonts w:asciiTheme="majorBidi" w:hAnsiTheme="majorBidi" w:cstheme="majorBidi"/>
+          <w:sz w:val="28"/>
+          <w:szCs w:val="28"/>
+        </w:rPr>
+      </w:pPr>
+      <w:r>
+        <w:rPr>
+          <w:rFonts w:asciiTheme="majorBidi" w:hAnsiTheme="majorBidi" w:cstheme="majorBidi"/>
+          <w:sz w:val="28"/>
+          <w:szCs w:val="28"/>
+        </w:rPr>
+        <w:t>Manifest list → describes multiple image builds for different architectures</w:t>
+      </w:r>
+    </w:p>
+    <w:p>
+      <w:pPr>
+        <w:jc w:val="both"/>
+        <w:rPr>
+          <w:rFonts w:asciiTheme="majorBidi" w:hAnsiTheme="majorBidi" w:cstheme="majorBidi"/>
+          <w:sz w:val="28"/>
+          <w:szCs w:val="28"/>
+        </w:rPr>
+      </w:pPr>
+      <w:r>
+        <w:rPr>
+          <w:rFonts w:asciiTheme="majorBidi" w:hAnsiTheme="majorBidi" w:cstheme="majorBidi"/>
+          <w:sz w:val="28"/>
+          <w:szCs w:val="28"/>
+        </w:rPr>
+        <w:t>One blueprint vs. a catalog of blueprints.</w:t>
       </w:r>
     </w:p>
     <w:sectPr>
@@ -5930,6 +7312,119 @@
     </w:lvl>
   </w:abstractNum>
   <w:abstractNum w:abstractNumId="6" w15:restartNumberingAfterBreak="0">
+    <w:nsid w:val="0C66491B"/>
+    <w:multiLevelType w:val="hybridMultilevel"/>
+    <w:tmpl w:val="915E4F62"/>
+    <w:lvl w:ilvl="0" w:tplc="04090001">
+      <w:start w:val="1"/>
+      <w:numFmt w:val="bullet"/>
+      <w:lvlText w:val=""/>
+      <w:lvlJc w:val="left"/>
+      <w:pPr>
+        <w:ind w:left="720" w:hanging="360"/>
+      </w:pPr>
+      <w:rPr>
+        <w:rFonts w:ascii="Symbol" w:hAnsi="Symbol" w:hint="default"/>
+      </w:rPr>
+    </w:lvl>
+    <w:lvl w:ilvl="1" w:tplc="04090003" w:tentative="1">
+      <w:start w:val="1"/>
+      <w:numFmt w:val="bullet"/>
+      <w:lvlText w:val="o"/>
+      <w:lvlJc w:val="left"/>
+      <w:pPr>
+        <w:ind w:left="1440" w:hanging="360"/>
+      </w:pPr>
+      <w:rPr>
+        <w:rFonts w:ascii="Courier New" w:hAnsi="Courier New" w:cs="Courier New" w:hint="default"/>
+      </w:rPr>
+    </w:lvl>
+    <w:lvl w:ilvl="2" w:tplc="04090005" w:tentative="1">
+      <w:start w:val="1"/>
+      <w:numFmt w:val="bullet"/>
+      <w:lvlText w:val=""/>
+      <w:lvlJc w:val="left"/>
+      <w:pPr>
+        <w:ind w:left="2160" w:hanging="360"/>
+      </w:pPr>
+      <w:rPr>
+        <w:rFonts w:ascii="Wingdings" w:hAnsi="Wingdings" w:hint="default"/>
+      </w:rPr>
+    </w:lvl>
+    <w:lvl w:ilvl="3" w:tplc="04090001" w:tentative="1">
+      <w:start w:val="1"/>
+      <w:numFmt w:val="bullet"/>
+      <w:lvlText w:val=""/>
+      <w:lvlJc w:val="left"/>
+      <w:pPr>
+        <w:ind w:left="2880" w:hanging="360"/>
+      </w:pPr>
+      <w:rPr>
+        <w:rFonts w:ascii="Symbol" w:hAnsi="Symbol" w:hint="default"/>
+      </w:rPr>
+    </w:lvl>
+    <w:lvl w:ilvl="4" w:tplc="04090003" w:tentative="1">
+      <w:start w:val="1"/>
+      <w:numFmt w:val="bullet"/>
+      <w:lvlText w:val="o"/>
+      <w:lvlJc w:val="left"/>
+      <w:pPr>
+        <w:ind w:left="3600" w:hanging="360"/>
+      </w:pPr>
+      <w:rPr>
+        <w:rFonts w:ascii="Courier New" w:hAnsi="Courier New" w:cs="Courier New" w:hint="default"/>
+      </w:rPr>
+    </w:lvl>
+    <w:lvl w:ilvl="5" w:tplc="04090005" w:tentative="1">
+      <w:start w:val="1"/>
+      <w:numFmt w:val="bullet"/>
+      <w:lvlText w:val=""/>
+      <w:lvlJc w:val="left"/>
+      <w:pPr>
+        <w:ind w:left="4320" w:hanging="360"/>
+      </w:pPr>
+      <w:rPr>
+        <w:rFonts w:ascii="Wingdings" w:hAnsi="Wingdings" w:hint="default"/>
+      </w:rPr>
+    </w:lvl>
+    <w:lvl w:ilvl="6" w:tplc="04090001" w:tentative="1">
+      <w:start w:val="1"/>
+      <w:numFmt w:val="bullet"/>
+      <w:lvlText w:val=""/>
+      <w:lvlJc w:val="left"/>
+      <w:pPr>
+        <w:ind w:left="5040" w:hanging="360"/>
+      </w:pPr>
+      <w:rPr>
+        <w:rFonts w:ascii="Symbol" w:hAnsi="Symbol" w:hint="default"/>
+      </w:rPr>
+    </w:lvl>
+    <w:lvl w:ilvl="7" w:tplc="04090003" w:tentative="1">
+      <w:start w:val="1"/>
+      <w:numFmt w:val="bullet"/>
+      <w:lvlText w:val="o"/>
+      <w:lvlJc w:val="left"/>
+      <w:pPr>
+        <w:ind w:left="5760" w:hanging="360"/>
+      </w:pPr>
+      <w:rPr>
+        <w:rFonts w:ascii="Courier New" w:hAnsi="Courier New" w:cs="Courier New" w:hint="default"/>
+      </w:rPr>
+    </w:lvl>
+    <w:lvl w:ilvl="8" w:tplc="04090005" w:tentative="1">
+      <w:start w:val="1"/>
+      <w:numFmt w:val="bullet"/>
+      <w:lvlText w:val=""/>
+      <w:lvlJc w:val="left"/>
+      <w:pPr>
+        <w:ind w:left="6480" w:hanging="360"/>
+      </w:pPr>
+      <w:rPr>
+        <w:rFonts w:ascii="Wingdings" w:hAnsi="Wingdings" w:hint="default"/>
+      </w:rPr>
+    </w:lvl>
+  </w:abstractNum>
+  <w:abstractNum w:abstractNumId="7" w15:restartNumberingAfterBreak="0">
     <w:nsid w:val="0DB51854"/>
     <w:multiLevelType w:val="hybridMultilevel"/>
     <w:tmpl w:val="18EA1148"/>
@@ -6042,7 +7537,7 @@
       </w:rPr>
     </w:lvl>
   </w:abstractNum>
-  <w:abstractNum w:abstractNumId="7" w15:restartNumberingAfterBreak="0">
+  <w:abstractNum w:abstractNumId="8" w15:restartNumberingAfterBreak="0">
     <w:nsid w:val="0EAB61EE"/>
     <w:multiLevelType w:val="hybridMultilevel"/>
     <w:tmpl w:val="C7B4D7D2"/>
@@ -6128,7 +7623,7 @@
       </w:pPr>
     </w:lvl>
   </w:abstractNum>
-  <w:abstractNum w:abstractNumId="8" w15:restartNumberingAfterBreak="0">
+  <w:abstractNum w:abstractNumId="9" w15:restartNumberingAfterBreak="0">
     <w:nsid w:val="0EEC3934"/>
     <w:multiLevelType w:val="hybridMultilevel"/>
     <w:tmpl w:val="E1620146"/>
@@ -6241,7 +7736,7 @@
       </w:rPr>
     </w:lvl>
   </w:abstractNum>
-  <w:abstractNum w:abstractNumId="9" w15:restartNumberingAfterBreak="0">
+  <w:abstractNum w:abstractNumId="10" w15:restartNumberingAfterBreak="0">
     <w:nsid w:val="0F601ABA"/>
     <w:multiLevelType w:val="hybridMultilevel"/>
     <w:tmpl w:val="F3D4ACA8"/>
@@ -6354,7 +7849,7 @@
       </w:rPr>
     </w:lvl>
   </w:abstractNum>
-  <w:abstractNum w:abstractNumId="10" w15:restartNumberingAfterBreak="0">
+  <w:abstractNum w:abstractNumId="11" w15:restartNumberingAfterBreak="0">
     <w:nsid w:val="0F724923"/>
     <w:multiLevelType w:val="hybridMultilevel"/>
     <w:tmpl w:val="0FDA852C"/>
@@ -6467,7 +7962,7 @@
       </w:rPr>
     </w:lvl>
   </w:abstractNum>
-  <w:abstractNum w:abstractNumId="11" w15:restartNumberingAfterBreak="0">
+  <w:abstractNum w:abstractNumId="12" w15:restartNumberingAfterBreak="0">
     <w:nsid w:val="119C5127"/>
     <w:multiLevelType w:val="hybridMultilevel"/>
     <w:tmpl w:val="29BC7C88"/>
@@ -6580,7 +8075,7 @@
       </w:rPr>
     </w:lvl>
   </w:abstractNum>
-  <w:abstractNum w:abstractNumId="12" w15:restartNumberingAfterBreak="0">
+  <w:abstractNum w:abstractNumId="13" w15:restartNumberingAfterBreak="0">
     <w:nsid w:val="11E41729"/>
     <w:multiLevelType w:val="hybridMultilevel"/>
     <w:tmpl w:val="5ABA1398"/>
@@ -6693,7 +8188,7 @@
       </w:rPr>
     </w:lvl>
   </w:abstractNum>
-  <w:abstractNum w:abstractNumId="13" w15:restartNumberingAfterBreak="0">
+  <w:abstractNum w:abstractNumId="14" w15:restartNumberingAfterBreak="0">
     <w:nsid w:val="143C6BD0"/>
     <w:multiLevelType w:val="hybridMultilevel"/>
     <w:tmpl w:val="D804A9F2"/>
@@ -6806,7 +8301,7 @@
       </w:rPr>
     </w:lvl>
   </w:abstractNum>
-  <w:abstractNum w:abstractNumId="14" w15:restartNumberingAfterBreak="0">
+  <w:abstractNum w:abstractNumId="15" w15:restartNumberingAfterBreak="0">
     <w:nsid w:val="14A8188E"/>
     <w:multiLevelType w:val="hybridMultilevel"/>
     <w:tmpl w:val="AAA2A268"/>
@@ -6919,7 +8414,7 @@
       </w:rPr>
     </w:lvl>
   </w:abstractNum>
-  <w:abstractNum w:abstractNumId="15" w15:restartNumberingAfterBreak="0">
+  <w:abstractNum w:abstractNumId="16" w15:restartNumberingAfterBreak="0">
     <w:nsid w:val="15B2768B"/>
     <w:multiLevelType w:val="hybridMultilevel"/>
     <w:tmpl w:val="E910B0F2"/>
@@ -7032,7 +8527,7 @@
       </w:rPr>
     </w:lvl>
   </w:abstractNum>
-  <w:abstractNum w:abstractNumId="16" w15:restartNumberingAfterBreak="0">
+  <w:abstractNum w:abstractNumId="17" w15:restartNumberingAfterBreak="0">
     <w:nsid w:val="15E069CA"/>
     <w:multiLevelType w:val="hybridMultilevel"/>
     <w:tmpl w:val="7B169B72"/>
@@ -7145,7 +8640,7 @@
       </w:rPr>
     </w:lvl>
   </w:abstractNum>
-  <w:abstractNum w:abstractNumId="17" w15:restartNumberingAfterBreak="0">
+  <w:abstractNum w:abstractNumId="18" w15:restartNumberingAfterBreak="0">
     <w:nsid w:val="15EC305A"/>
     <w:multiLevelType w:val="hybridMultilevel"/>
     <w:tmpl w:val="3F38AAA6"/>
@@ -7258,7 +8753,7 @@
       </w:rPr>
     </w:lvl>
   </w:abstractNum>
-  <w:abstractNum w:abstractNumId="18" w15:restartNumberingAfterBreak="0">
+  <w:abstractNum w:abstractNumId="19" w15:restartNumberingAfterBreak="0">
     <w:nsid w:val="176653C0"/>
     <w:multiLevelType w:val="hybridMultilevel"/>
     <w:tmpl w:val="08A05E28"/>
@@ -7371,7 +8866,7 @@
       </w:rPr>
     </w:lvl>
   </w:abstractNum>
-  <w:abstractNum w:abstractNumId="19" w15:restartNumberingAfterBreak="0">
+  <w:abstractNum w:abstractNumId="20" w15:restartNumberingAfterBreak="0">
     <w:nsid w:val="19B30FA4"/>
     <w:multiLevelType w:val="hybridMultilevel"/>
     <w:tmpl w:val="570486BE"/>
@@ -7484,7 +8979,7 @@
       </w:rPr>
     </w:lvl>
   </w:abstractNum>
-  <w:abstractNum w:abstractNumId="20" w15:restartNumberingAfterBreak="0">
+  <w:abstractNum w:abstractNumId="21" w15:restartNumberingAfterBreak="0">
     <w:nsid w:val="1C7A2575"/>
     <w:multiLevelType w:val="hybridMultilevel"/>
     <w:tmpl w:val="7D746F8C"/>
@@ -7597,7 +9092,7 @@
       </w:rPr>
     </w:lvl>
   </w:abstractNum>
-  <w:abstractNum w:abstractNumId="21" w15:restartNumberingAfterBreak="0">
+  <w:abstractNum w:abstractNumId="22" w15:restartNumberingAfterBreak="0">
     <w:nsid w:val="1CCC70E7"/>
     <w:multiLevelType w:val="hybridMultilevel"/>
     <w:tmpl w:val="5F781118"/>
@@ -7710,7 +9205,7 @@
       </w:rPr>
     </w:lvl>
   </w:abstractNum>
-  <w:abstractNum w:abstractNumId="22" w15:restartNumberingAfterBreak="0">
+  <w:abstractNum w:abstractNumId="23" w15:restartNumberingAfterBreak="0">
     <w:nsid w:val="24B90396"/>
     <w:multiLevelType w:val="hybridMultilevel"/>
     <w:tmpl w:val="75469786"/>
@@ -7823,7 +9318,7 @@
       </w:rPr>
     </w:lvl>
   </w:abstractNum>
-  <w:abstractNum w:abstractNumId="23" w15:restartNumberingAfterBreak="0">
+  <w:abstractNum w:abstractNumId="24" w15:restartNumberingAfterBreak="0">
     <w:nsid w:val="26AC3E30"/>
     <w:multiLevelType w:val="hybridMultilevel"/>
     <w:tmpl w:val="D1FC649A"/>
@@ -7936,7 +9431,7 @@
       </w:rPr>
     </w:lvl>
   </w:abstractNum>
-  <w:abstractNum w:abstractNumId="24" w15:restartNumberingAfterBreak="0">
+  <w:abstractNum w:abstractNumId="25" w15:restartNumberingAfterBreak="0">
     <w:nsid w:val="28190715"/>
     <w:multiLevelType w:val="hybridMultilevel"/>
     <w:tmpl w:val="F198EA58"/>
@@ -8022,7 +9517,7 @@
       </w:pPr>
     </w:lvl>
   </w:abstractNum>
-  <w:abstractNum w:abstractNumId="25" w15:restartNumberingAfterBreak="0">
+  <w:abstractNum w:abstractNumId="26" w15:restartNumberingAfterBreak="0">
     <w:nsid w:val="290D16D4"/>
     <w:multiLevelType w:val="hybridMultilevel"/>
     <w:tmpl w:val="850CA056"/>
@@ -8108,7 +9603,7 @@
       </w:pPr>
     </w:lvl>
   </w:abstractNum>
-  <w:abstractNum w:abstractNumId="26" w15:restartNumberingAfterBreak="0">
+  <w:abstractNum w:abstractNumId="27" w15:restartNumberingAfterBreak="0">
     <w:nsid w:val="29125D6B"/>
     <w:multiLevelType w:val="hybridMultilevel"/>
     <w:tmpl w:val="5C14C760"/>
@@ -8221,7 +9716,7 @@
       </w:rPr>
     </w:lvl>
   </w:abstractNum>
-  <w:abstractNum w:abstractNumId="27" w15:restartNumberingAfterBreak="0">
+  <w:abstractNum w:abstractNumId="28" w15:restartNumberingAfterBreak="0">
     <w:nsid w:val="299E5941"/>
     <w:multiLevelType w:val="hybridMultilevel"/>
     <w:tmpl w:val="9FE80B98"/>
@@ -8334,7 +9829,7 @@
       </w:rPr>
     </w:lvl>
   </w:abstractNum>
-  <w:abstractNum w:abstractNumId="28" w15:restartNumberingAfterBreak="0">
+  <w:abstractNum w:abstractNumId="29" w15:restartNumberingAfterBreak="0">
     <w:nsid w:val="2A425DD0"/>
     <w:multiLevelType w:val="hybridMultilevel"/>
     <w:tmpl w:val="FC5CFAF2"/>
@@ -8420,7 +9915,7 @@
       </w:pPr>
     </w:lvl>
   </w:abstractNum>
-  <w:abstractNum w:abstractNumId="29" w15:restartNumberingAfterBreak="0">
+  <w:abstractNum w:abstractNumId="30" w15:restartNumberingAfterBreak="0">
     <w:nsid w:val="2B5F052B"/>
     <w:multiLevelType w:val="hybridMultilevel"/>
     <w:tmpl w:val="5030DC38"/>
@@ -8533,7 +10028,7 @@
       </w:rPr>
     </w:lvl>
   </w:abstractNum>
-  <w:abstractNum w:abstractNumId="30" w15:restartNumberingAfterBreak="0">
+  <w:abstractNum w:abstractNumId="31" w15:restartNumberingAfterBreak="0">
     <w:nsid w:val="2F9D4EBC"/>
     <w:multiLevelType w:val="hybridMultilevel"/>
     <w:tmpl w:val="75BE8682"/>
@@ -8646,7 +10141,7 @@
       </w:rPr>
     </w:lvl>
   </w:abstractNum>
-  <w:abstractNum w:abstractNumId="31" w15:restartNumberingAfterBreak="0">
+  <w:abstractNum w:abstractNumId="32" w15:restartNumberingAfterBreak="0">
     <w:nsid w:val="30B67E2F"/>
     <w:multiLevelType w:val="hybridMultilevel"/>
     <w:tmpl w:val="59660B40"/>
@@ -8759,7 +10254,7 @@
       </w:rPr>
     </w:lvl>
   </w:abstractNum>
-  <w:abstractNum w:abstractNumId="32" w15:restartNumberingAfterBreak="0">
+  <w:abstractNum w:abstractNumId="33" w15:restartNumberingAfterBreak="0">
     <w:nsid w:val="30E50561"/>
     <w:multiLevelType w:val="hybridMultilevel"/>
     <w:tmpl w:val="32B6F57E"/>
@@ -8872,7 +10367,7 @@
       </w:rPr>
     </w:lvl>
   </w:abstractNum>
-  <w:abstractNum w:abstractNumId="33" w15:restartNumberingAfterBreak="0">
+  <w:abstractNum w:abstractNumId="34" w15:restartNumberingAfterBreak="0">
     <w:nsid w:val="35484DB3"/>
     <w:multiLevelType w:val="hybridMultilevel"/>
     <w:tmpl w:val="F7F620EC"/>
@@ -8985,7 +10480,7 @@
       </w:rPr>
     </w:lvl>
   </w:abstractNum>
-  <w:abstractNum w:abstractNumId="34" w15:restartNumberingAfterBreak="0">
+  <w:abstractNum w:abstractNumId="35" w15:restartNumberingAfterBreak="0">
     <w:nsid w:val="356C252A"/>
     <w:multiLevelType w:val="hybridMultilevel"/>
     <w:tmpl w:val="56C642E8"/>
@@ -9098,7 +10593,7 @@
       </w:rPr>
     </w:lvl>
   </w:abstractNum>
-  <w:abstractNum w:abstractNumId="35" w15:restartNumberingAfterBreak="0">
+  <w:abstractNum w:abstractNumId="36" w15:restartNumberingAfterBreak="0">
     <w:nsid w:val="35861E1F"/>
     <w:multiLevelType w:val="hybridMultilevel"/>
     <w:tmpl w:val="7B364A44"/>
@@ -9211,7 +10706,7 @@
       </w:rPr>
     </w:lvl>
   </w:abstractNum>
-  <w:abstractNum w:abstractNumId="36" w15:restartNumberingAfterBreak="0">
+  <w:abstractNum w:abstractNumId="37" w15:restartNumberingAfterBreak="0">
     <w:nsid w:val="35A706F1"/>
     <w:multiLevelType w:val="hybridMultilevel"/>
     <w:tmpl w:val="F19C8E58"/>
@@ -9324,7 +10819,7 @@
       </w:rPr>
     </w:lvl>
   </w:abstractNum>
-  <w:abstractNum w:abstractNumId="37" w15:restartNumberingAfterBreak="0">
+  <w:abstractNum w:abstractNumId="38" w15:restartNumberingAfterBreak="0">
     <w:nsid w:val="39984B4A"/>
     <w:multiLevelType w:val="hybridMultilevel"/>
     <w:tmpl w:val="4B9CFE62"/>
@@ -9437,7 +10932,7 @@
       </w:rPr>
     </w:lvl>
   </w:abstractNum>
-  <w:abstractNum w:abstractNumId="38" w15:restartNumberingAfterBreak="0">
+  <w:abstractNum w:abstractNumId="39" w15:restartNumberingAfterBreak="0">
     <w:nsid w:val="3BB13CD6"/>
     <w:multiLevelType w:val="hybridMultilevel"/>
     <w:tmpl w:val="38E65BE0"/>
@@ -9550,7 +11045,7 @@
       </w:rPr>
     </w:lvl>
   </w:abstractNum>
-  <w:abstractNum w:abstractNumId="39" w15:restartNumberingAfterBreak="0">
+  <w:abstractNum w:abstractNumId="40" w15:restartNumberingAfterBreak="0">
     <w:nsid w:val="3D8272C8"/>
     <w:multiLevelType w:val="hybridMultilevel"/>
     <w:tmpl w:val="69A42A26"/>
@@ -9663,7 +11158,7 @@
       </w:rPr>
     </w:lvl>
   </w:abstractNum>
-  <w:abstractNum w:abstractNumId="40" w15:restartNumberingAfterBreak="0">
+  <w:abstractNum w:abstractNumId="41" w15:restartNumberingAfterBreak="0">
     <w:nsid w:val="3E921BF7"/>
     <w:multiLevelType w:val="hybridMultilevel"/>
     <w:tmpl w:val="07D83C3E"/>
@@ -9776,7 +11271,7 @@
       </w:rPr>
     </w:lvl>
   </w:abstractNum>
-  <w:abstractNum w:abstractNumId="41" w15:restartNumberingAfterBreak="0">
+  <w:abstractNum w:abstractNumId="42" w15:restartNumberingAfterBreak="0">
     <w:nsid w:val="40BF32BA"/>
     <w:multiLevelType w:val="hybridMultilevel"/>
     <w:tmpl w:val="90849960"/>
@@ -9889,7 +11384,120 @@
       </w:rPr>
     </w:lvl>
   </w:abstractNum>
-  <w:abstractNum w:abstractNumId="42" w15:restartNumberingAfterBreak="0">
+  <w:abstractNum w:abstractNumId="43" w15:restartNumberingAfterBreak="0">
+    <w:nsid w:val="410A541F"/>
+    <w:multiLevelType w:val="hybridMultilevel"/>
+    <w:tmpl w:val="F8CA0428"/>
+    <w:lvl w:ilvl="0" w:tplc="04090001">
+      <w:start w:val="1"/>
+      <w:numFmt w:val="bullet"/>
+      <w:lvlText w:val=""/>
+      <w:lvlJc w:val="left"/>
+      <w:pPr>
+        <w:ind w:left="720" w:hanging="360"/>
+      </w:pPr>
+      <w:rPr>
+        <w:rFonts w:ascii="Symbol" w:hAnsi="Symbol" w:hint="default"/>
+      </w:rPr>
+    </w:lvl>
+    <w:lvl w:ilvl="1" w:tplc="04090003" w:tentative="1">
+      <w:start w:val="1"/>
+      <w:numFmt w:val="bullet"/>
+      <w:lvlText w:val="o"/>
+      <w:lvlJc w:val="left"/>
+      <w:pPr>
+        <w:ind w:left="1440" w:hanging="360"/>
+      </w:pPr>
+      <w:rPr>
+        <w:rFonts w:ascii="Courier New" w:hAnsi="Courier New" w:cs="Courier New" w:hint="default"/>
+      </w:rPr>
+    </w:lvl>
+    <w:lvl w:ilvl="2" w:tplc="04090005" w:tentative="1">
+      <w:start w:val="1"/>
+      <w:numFmt w:val="bullet"/>
+      <w:lvlText w:val=""/>
+      <w:lvlJc w:val="left"/>
+      <w:pPr>
+        <w:ind w:left="2160" w:hanging="360"/>
+      </w:pPr>
+      <w:rPr>
+        <w:rFonts w:ascii="Wingdings" w:hAnsi="Wingdings" w:hint="default"/>
+      </w:rPr>
+    </w:lvl>
+    <w:lvl w:ilvl="3" w:tplc="04090001" w:tentative="1">
+      <w:start w:val="1"/>
+      <w:numFmt w:val="bullet"/>
+      <w:lvlText w:val=""/>
+      <w:lvlJc w:val="left"/>
+      <w:pPr>
+        <w:ind w:left="2880" w:hanging="360"/>
+      </w:pPr>
+      <w:rPr>
+        <w:rFonts w:ascii="Symbol" w:hAnsi="Symbol" w:hint="default"/>
+      </w:rPr>
+    </w:lvl>
+    <w:lvl w:ilvl="4" w:tplc="04090003" w:tentative="1">
+      <w:start w:val="1"/>
+      <w:numFmt w:val="bullet"/>
+      <w:lvlText w:val="o"/>
+      <w:lvlJc w:val="left"/>
+      <w:pPr>
+        <w:ind w:left="3600" w:hanging="360"/>
+      </w:pPr>
+      <w:rPr>
+        <w:rFonts w:ascii="Courier New" w:hAnsi="Courier New" w:cs="Courier New" w:hint="default"/>
+      </w:rPr>
+    </w:lvl>
+    <w:lvl w:ilvl="5" w:tplc="04090005" w:tentative="1">
+      <w:start w:val="1"/>
+      <w:numFmt w:val="bullet"/>
+      <w:lvlText w:val=""/>
+      <w:lvlJc w:val="left"/>
+      <w:pPr>
+        <w:ind w:left="4320" w:hanging="360"/>
+      </w:pPr>
+      <w:rPr>
+        <w:rFonts w:ascii="Wingdings" w:hAnsi="Wingdings" w:hint="default"/>
+      </w:rPr>
+    </w:lvl>
+    <w:lvl w:ilvl="6" w:tplc="04090001" w:tentative="1">
+      <w:start w:val="1"/>
+      <w:numFmt w:val="bullet"/>
+      <w:lvlText w:val=""/>
+      <w:lvlJc w:val="left"/>
+      <w:pPr>
+        <w:ind w:left="5040" w:hanging="360"/>
+      </w:pPr>
+      <w:rPr>
+        <w:rFonts w:ascii="Symbol" w:hAnsi="Symbol" w:hint="default"/>
+      </w:rPr>
+    </w:lvl>
+    <w:lvl w:ilvl="7" w:tplc="04090003" w:tentative="1">
+      <w:start w:val="1"/>
+      <w:numFmt w:val="bullet"/>
+      <w:lvlText w:val="o"/>
+      <w:lvlJc w:val="left"/>
+      <w:pPr>
+        <w:ind w:left="5760" w:hanging="360"/>
+      </w:pPr>
+      <w:rPr>
+        <w:rFonts w:ascii="Courier New" w:hAnsi="Courier New" w:cs="Courier New" w:hint="default"/>
+      </w:rPr>
+    </w:lvl>
+    <w:lvl w:ilvl="8" w:tplc="04090005" w:tentative="1">
+      <w:start w:val="1"/>
+      <w:numFmt w:val="bullet"/>
+      <w:lvlText w:val=""/>
+      <w:lvlJc w:val="left"/>
+      <w:pPr>
+        <w:ind w:left="6480" w:hanging="360"/>
+      </w:pPr>
+      <w:rPr>
+        <w:rFonts w:ascii="Wingdings" w:hAnsi="Wingdings" w:hint="default"/>
+      </w:rPr>
+    </w:lvl>
+  </w:abstractNum>
+  <w:abstractNum w:abstractNumId="44" w15:restartNumberingAfterBreak="0">
     <w:nsid w:val="42126938"/>
     <w:multiLevelType w:val="hybridMultilevel"/>
     <w:tmpl w:val="5D086338"/>
@@ -10002,7 +11610,7 @@
       </w:rPr>
     </w:lvl>
   </w:abstractNum>
-  <w:abstractNum w:abstractNumId="43" w15:restartNumberingAfterBreak="0">
+  <w:abstractNum w:abstractNumId="45" w15:restartNumberingAfterBreak="0">
     <w:nsid w:val="422A0DA2"/>
     <w:multiLevelType w:val="hybridMultilevel"/>
     <w:tmpl w:val="7B527DD6"/>
@@ -10088,7 +11696,7 @@
       </w:pPr>
     </w:lvl>
   </w:abstractNum>
-  <w:abstractNum w:abstractNumId="44" w15:restartNumberingAfterBreak="0">
+  <w:abstractNum w:abstractNumId="46" w15:restartNumberingAfterBreak="0">
     <w:nsid w:val="42592306"/>
     <w:multiLevelType w:val="hybridMultilevel"/>
     <w:tmpl w:val="252211AE"/>
@@ -10201,7 +11809,7 @@
       </w:rPr>
     </w:lvl>
   </w:abstractNum>
-  <w:abstractNum w:abstractNumId="45" w15:restartNumberingAfterBreak="0">
+  <w:abstractNum w:abstractNumId="47" w15:restartNumberingAfterBreak="0">
     <w:nsid w:val="42767048"/>
     <w:multiLevelType w:val="hybridMultilevel"/>
     <w:tmpl w:val="1E98EFE6"/>
@@ -10287,7 +11895,7 @@
       </w:pPr>
     </w:lvl>
   </w:abstractNum>
-  <w:abstractNum w:abstractNumId="46" w15:restartNumberingAfterBreak="0">
+  <w:abstractNum w:abstractNumId="48" w15:restartNumberingAfterBreak="0">
     <w:nsid w:val="43067A6B"/>
     <w:multiLevelType w:val="hybridMultilevel"/>
     <w:tmpl w:val="6B8AF690"/>
@@ -10400,7 +12008,7 @@
       </w:rPr>
     </w:lvl>
   </w:abstractNum>
-  <w:abstractNum w:abstractNumId="47" w15:restartNumberingAfterBreak="0">
+  <w:abstractNum w:abstractNumId="49" w15:restartNumberingAfterBreak="0">
     <w:nsid w:val="438638CD"/>
     <w:multiLevelType w:val="hybridMultilevel"/>
     <w:tmpl w:val="8526AD56"/>
@@ -10513,7 +12121,7 @@
       </w:rPr>
     </w:lvl>
   </w:abstractNum>
-  <w:abstractNum w:abstractNumId="48" w15:restartNumberingAfterBreak="0">
+  <w:abstractNum w:abstractNumId="50" w15:restartNumberingAfterBreak="0">
     <w:nsid w:val="43FE2240"/>
     <w:multiLevelType w:val="hybridMultilevel"/>
     <w:tmpl w:val="379010B8"/>
@@ -10626,7 +12234,7 @@
       </w:rPr>
     </w:lvl>
   </w:abstractNum>
-  <w:abstractNum w:abstractNumId="49" w15:restartNumberingAfterBreak="0">
+  <w:abstractNum w:abstractNumId="51" w15:restartNumberingAfterBreak="0">
     <w:nsid w:val="440542AF"/>
     <w:multiLevelType w:val="hybridMultilevel"/>
     <w:tmpl w:val="3D3CB302"/>
@@ -10739,7 +12347,7 @@
       </w:rPr>
     </w:lvl>
   </w:abstractNum>
-  <w:abstractNum w:abstractNumId="50" w15:restartNumberingAfterBreak="0">
+  <w:abstractNum w:abstractNumId="52" w15:restartNumberingAfterBreak="0">
     <w:nsid w:val="448444E1"/>
     <w:multiLevelType w:val="hybridMultilevel"/>
     <w:tmpl w:val="4244A5A6"/>
@@ -10852,7 +12460,7 @@
       </w:rPr>
     </w:lvl>
   </w:abstractNum>
-  <w:abstractNum w:abstractNumId="51" w15:restartNumberingAfterBreak="0">
+  <w:abstractNum w:abstractNumId="53" w15:restartNumberingAfterBreak="0">
     <w:nsid w:val="465D19C4"/>
     <w:multiLevelType w:val="hybridMultilevel"/>
     <w:tmpl w:val="59DA5D9A"/>
@@ -10965,7 +12573,7 @@
       </w:rPr>
     </w:lvl>
   </w:abstractNum>
-  <w:abstractNum w:abstractNumId="52" w15:restartNumberingAfterBreak="0">
+  <w:abstractNum w:abstractNumId="54" w15:restartNumberingAfterBreak="0">
     <w:nsid w:val="47666A8C"/>
     <w:multiLevelType w:val="hybridMultilevel"/>
     <w:tmpl w:val="18EC88AE"/>
@@ -11051,7 +12659,7 @@
       </w:pPr>
     </w:lvl>
   </w:abstractNum>
-  <w:abstractNum w:abstractNumId="53" w15:restartNumberingAfterBreak="0">
+  <w:abstractNum w:abstractNumId="55" w15:restartNumberingAfterBreak="0">
     <w:nsid w:val="49417DC1"/>
     <w:multiLevelType w:val="hybridMultilevel"/>
     <w:tmpl w:val="357411BA"/>
@@ -11164,7 +12772,7 @@
       </w:rPr>
     </w:lvl>
   </w:abstractNum>
-  <w:abstractNum w:abstractNumId="54" w15:restartNumberingAfterBreak="0">
+  <w:abstractNum w:abstractNumId="56" w15:restartNumberingAfterBreak="0">
     <w:nsid w:val="4E2C2D1C"/>
     <w:multiLevelType w:val="hybridMultilevel"/>
     <w:tmpl w:val="9626D062"/>
@@ -11277,7 +12885,7 @@
       </w:rPr>
     </w:lvl>
   </w:abstractNum>
-  <w:abstractNum w:abstractNumId="55" w15:restartNumberingAfterBreak="0">
+  <w:abstractNum w:abstractNumId="57" w15:restartNumberingAfterBreak="0">
     <w:nsid w:val="4EB719F3"/>
     <w:multiLevelType w:val="hybridMultilevel"/>
     <w:tmpl w:val="9306D736"/>
@@ -11390,7 +12998,7 @@
       </w:rPr>
     </w:lvl>
   </w:abstractNum>
-  <w:abstractNum w:abstractNumId="56" w15:restartNumberingAfterBreak="0">
+  <w:abstractNum w:abstractNumId="58" w15:restartNumberingAfterBreak="0">
     <w:nsid w:val="4F1224C7"/>
     <w:multiLevelType w:val="hybridMultilevel"/>
     <w:tmpl w:val="026C68CA"/>
@@ -11503,7 +13111,7 @@
       </w:rPr>
     </w:lvl>
   </w:abstractNum>
-  <w:abstractNum w:abstractNumId="57" w15:restartNumberingAfterBreak="0">
+  <w:abstractNum w:abstractNumId="59" w15:restartNumberingAfterBreak="0">
     <w:nsid w:val="53E65E4A"/>
     <w:multiLevelType w:val="hybridMultilevel"/>
     <w:tmpl w:val="8C7E6872"/>
@@ -11616,7 +13224,7 @@
       </w:rPr>
     </w:lvl>
   </w:abstractNum>
-  <w:abstractNum w:abstractNumId="58" w15:restartNumberingAfterBreak="0">
+  <w:abstractNum w:abstractNumId="60" w15:restartNumberingAfterBreak="0">
     <w:nsid w:val="575945E6"/>
     <w:multiLevelType w:val="hybridMultilevel"/>
     <w:tmpl w:val="F0B62A5E"/>
@@ -11729,7 +13337,7 @@
       </w:rPr>
     </w:lvl>
   </w:abstractNum>
-  <w:abstractNum w:abstractNumId="59" w15:restartNumberingAfterBreak="0">
+  <w:abstractNum w:abstractNumId="61" w15:restartNumberingAfterBreak="0">
     <w:nsid w:val="57A64A4A"/>
     <w:multiLevelType w:val="hybridMultilevel"/>
     <w:tmpl w:val="57F61210"/>
@@ -11842,7 +13450,7 @@
       </w:rPr>
     </w:lvl>
   </w:abstractNum>
-  <w:abstractNum w:abstractNumId="60" w15:restartNumberingAfterBreak="0">
+  <w:abstractNum w:abstractNumId="62" w15:restartNumberingAfterBreak="0">
     <w:nsid w:val="580638E5"/>
     <w:multiLevelType w:val="hybridMultilevel"/>
     <w:tmpl w:val="F606E3EA"/>
@@ -11955,7 +13563,7 @@
       </w:rPr>
     </w:lvl>
   </w:abstractNum>
-  <w:abstractNum w:abstractNumId="61" w15:restartNumberingAfterBreak="0">
+  <w:abstractNum w:abstractNumId="63" w15:restartNumberingAfterBreak="0">
     <w:nsid w:val="5B41034E"/>
     <w:multiLevelType w:val="hybridMultilevel"/>
     <w:tmpl w:val="C7324AEC"/>
@@ -12068,7 +13676,7 @@
       </w:rPr>
     </w:lvl>
   </w:abstractNum>
-  <w:abstractNum w:abstractNumId="62" w15:restartNumberingAfterBreak="0">
+  <w:abstractNum w:abstractNumId="64" w15:restartNumberingAfterBreak="0">
     <w:nsid w:val="5BD1365B"/>
     <w:multiLevelType w:val="hybridMultilevel"/>
     <w:tmpl w:val="E5B0176A"/>
@@ -12181,7 +13789,7 @@
       </w:rPr>
     </w:lvl>
   </w:abstractNum>
-  <w:abstractNum w:abstractNumId="63" w15:restartNumberingAfterBreak="0">
+  <w:abstractNum w:abstractNumId="65" w15:restartNumberingAfterBreak="0">
     <w:nsid w:val="5EDB35EC"/>
     <w:multiLevelType w:val="hybridMultilevel"/>
     <w:tmpl w:val="74A42BD4"/>
@@ -12294,7 +13902,7 @@
       </w:rPr>
     </w:lvl>
   </w:abstractNum>
-  <w:abstractNum w:abstractNumId="64" w15:restartNumberingAfterBreak="0">
+  <w:abstractNum w:abstractNumId="66" w15:restartNumberingAfterBreak="0">
     <w:nsid w:val="5F6C7BC0"/>
     <w:multiLevelType w:val="hybridMultilevel"/>
     <w:tmpl w:val="4D24E3DC"/>
@@ -12407,7 +14015,7 @@
       </w:rPr>
     </w:lvl>
   </w:abstractNum>
-  <w:abstractNum w:abstractNumId="65" w15:restartNumberingAfterBreak="0">
+  <w:abstractNum w:abstractNumId="67" w15:restartNumberingAfterBreak="0">
     <w:nsid w:val="60224FA5"/>
     <w:multiLevelType w:val="hybridMultilevel"/>
     <w:tmpl w:val="7CE4CD1A"/>
@@ -12520,7 +14128,7 @@
       </w:rPr>
     </w:lvl>
   </w:abstractNum>
-  <w:abstractNum w:abstractNumId="66" w15:restartNumberingAfterBreak="0">
+  <w:abstractNum w:abstractNumId="68" w15:restartNumberingAfterBreak="0">
     <w:nsid w:val="60D33E1C"/>
     <w:multiLevelType w:val="hybridMultilevel"/>
     <w:tmpl w:val="83B05A04"/>
@@ -12633,7 +14241,7 @@
       </w:rPr>
     </w:lvl>
   </w:abstractNum>
-  <w:abstractNum w:abstractNumId="67" w15:restartNumberingAfterBreak="0">
+  <w:abstractNum w:abstractNumId="69" w15:restartNumberingAfterBreak="0">
     <w:nsid w:val="626B6AB0"/>
     <w:multiLevelType w:val="hybridMultilevel"/>
     <w:tmpl w:val="5B38FD5E"/>
@@ -12719,7 +14327,7 @@
       </w:pPr>
     </w:lvl>
   </w:abstractNum>
-  <w:abstractNum w:abstractNumId="68" w15:restartNumberingAfterBreak="0">
+  <w:abstractNum w:abstractNumId="70" w15:restartNumberingAfterBreak="0">
     <w:nsid w:val="63520FCD"/>
     <w:multiLevelType w:val="hybridMultilevel"/>
     <w:tmpl w:val="BC20B65E"/>
@@ -12832,7 +14440,7 @@
       </w:rPr>
     </w:lvl>
   </w:abstractNum>
-  <w:abstractNum w:abstractNumId="69" w15:restartNumberingAfterBreak="0">
+  <w:abstractNum w:abstractNumId="71" w15:restartNumberingAfterBreak="0">
     <w:nsid w:val="67712598"/>
     <w:multiLevelType w:val="hybridMultilevel"/>
     <w:tmpl w:val="CF662074"/>
@@ -12945,7 +14553,7 @@
       </w:rPr>
     </w:lvl>
   </w:abstractNum>
-  <w:abstractNum w:abstractNumId="70" w15:restartNumberingAfterBreak="0">
+  <w:abstractNum w:abstractNumId="72" w15:restartNumberingAfterBreak="0">
     <w:nsid w:val="685F5CFD"/>
     <w:multiLevelType w:val="hybridMultilevel"/>
     <w:tmpl w:val="3C88BD80"/>
@@ -13058,7 +14666,7 @@
       </w:rPr>
     </w:lvl>
   </w:abstractNum>
-  <w:abstractNum w:abstractNumId="71" w15:restartNumberingAfterBreak="0">
+  <w:abstractNum w:abstractNumId="73" w15:restartNumberingAfterBreak="0">
     <w:nsid w:val="68E30751"/>
     <w:multiLevelType w:val="hybridMultilevel"/>
     <w:tmpl w:val="C180F3BC"/>
@@ -13171,7 +14779,7 @@
       </w:rPr>
     </w:lvl>
   </w:abstractNum>
-  <w:abstractNum w:abstractNumId="72" w15:restartNumberingAfterBreak="0">
+  <w:abstractNum w:abstractNumId="74" w15:restartNumberingAfterBreak="0">
     <w:nsid w:val="690A7EF9"/>
     <w:multiLevelType w:val="hybridMultilevel"/>
     <w:tmpl w:val="DD549D3C"/>
@@ -13284,7 +14892,7 @@
       </w:rPr>
     </w:lvl>
   </w:abstractNum>
-  <w:abstractNum w:abstractNumId="73" w15:restartNumberingAfterBreak="0">
+  <w:abstractNum w:abstractNumId="75" w15:restartNumberingAfterBreak="0">
     <w:nsid w:val="69E07337"/>
     <w:multiLevelType w:val="hybridMultilevel"/>
     <w:tmpl w:val="8BD25784"/>
@@ -13397,7 +15005,7 @@
       </w:rPr>
     </w:lvl>
   </w:abstractNum>
-  <w:abstractNum w:abstractNumId="74" w15:restartNumberingAfterBreak="0">
+  <w:abstractNum w:abstractNumId="76" w15:restartNumberingAfterBreak="0">
     <w:nsid w:val="6A921E1A"/>
     <w:multiLevelType w:val="hybridMultilevel"/>
     <w:tmpl w:val="EC482F82"/>
@@ -13510,7 +15118,7 @@
       </w:rPr>
     </w:lvl>
   </w:abstractNum>
-  <w:abstractNum w:abstractNumId="75" w15:restartNumberingAfterBreak="0">
+  <w:abstractNum w:abstractNumId="77" w15:restartNumberingAfterBreak="0">
     <w:nsid w:val="6A992E25"/>
     <w:multiLevelType w:val="hybridMultilevel"/>
     <w:tmpl w:val="7CB82F38"/>
@@ -13623,7 +15231,7 @@
       </w:rPr>
     </w:lvl>
   </w:abstractNum>
-  <w:abstractNum w:abstractNumId="76" w15:restartNumberingAfterBreak="0">
+  <w:abstractNum w:abstractNumId="78" w15:restartNumberingAfterBreak="0">
     <w:nsid w:val="6C0B2D42"/>
     <w:multiLevelType w:val="hybridMultilevel"/>
     <w:tmpl w:val="D8408682"/>
@@ -13736,7 +15344,7 @@
       </w:rPr>
     </w:lvl>
   </w:abstractNum>
-  <w:abstractNum w:abstractNumId="77" w15:restartNumberingAfterBreak="0">
+  <w:abstractNum w:abstractNumId="79" w15:restartNumberingAfterBreak="0">
     <w:nsid w:val="6EE87CD0"/>
     <w:multiLevelType w:val="hybridMultilevel"/>
     <w:tmpl w:val="1326F5B2"/>
@@ -13849,7 +15457,7 @@
       </w:rPr>
     </w:lvl>
   </w:abstractNum>
-  <w:abstractNum w:abstractNumId="78" w15:restartNumberingAfterBreak="0">
+  <w:abstractNum w:abstractNumId="80" w15:restartNumberingAfterBreak="0">
     <w:nsid w:val="71550F8E"/>
     <w:multiLevelType w:val="hybridMultilevel"/>
     <w:tmpl w:val="42147756"/>
@@ -13962,7 +15570,7 @@
       </w:rPr>
     </w:lvl>
   </w:abstractNum>
-  <w:abstractNum w:abstractNumId="79" w15:restartNumberingAfterBreak="0">
+  <w:abstractNum w:abstractNumId="81" w15:restartNumberingAfterBreak="0">
     <w:nsid w:val="717C6830"/>
     <w:multiLevelType w:val="hybridMultilevel"/>
     <w:tmpl w:val="9BC6839A"/>
@@ -14075,7 +15683,7 @@
       </w:rPr>
     </w:lvl>
   </w:abstractNum>
-  <w:abstractNum w:abstractNumId="80" w15:restartNumberingAfterBreak="0">
+  <w:abstractNum w:abstractNumId="82" w15:restartNumberingAfterBreak="0">
     <w:nsid w:val="747D26C2"/>
     <w:multiLevelType w:val="hybridMultilevel"/>
     <w:tmpl w:val="585EA518"/>
@@ -14188,7 +15796,7 @@
       </w:rPr>
     </w:lvl>
   </w:abstractNum>
-  <w:abstractNum w:abstractNumId="81" w15:restartNumberingAfterBreak="0">
+  <w:abstractNum w:abstractNumId="83" w15:restartNumberingAfterBreak="0">
     <w:nsid w:val="74BC1C1B"/>
     <w:multiLevelType w:val="hybridMultilevel"/>
     <w:tmpl w:val="DF3A32BC"/>
@@ -14301,7 +15909,7 @@
       </w:rPr>
     </w:lvl>
   </w:abstractNum>
-  <w:abstractNum w:abstractNumId="82" w15:restartNumberingAfterBreak="0">
+  <w:abstractNum w:abstractNumId="84" w15:restartNumberingAfterBreak="0">
     <w:nsid w:val="78E404C7"/>
     <w:multiLevelType w:val="hybridMultilevel"/>
     <w:tmpl w:val="FB0ED528"/>
@@ -14387,7 +15995,7 @@
       </w:pPr>
     </w:lvl>
   </w:abstractNum>
-  <w:abstractNum w:abstractNumId="83" w15:restartNumberingAfterBreak="0">
+  <w:abstractNum w:abstractNumId="85" w15:restartNumberingAfterBreak="0">
     <w:nsid w:val="79F2025C"/>
     <w:multiLevelType w:val="hybridMultilevel"/>
     <w:tmpl w:val="856AB364"/>
@@ -14500,7 +16108,7 @@
       </w:rPr>
     </w:lvl>
   </w:abstractNum>
-  <w:abstractNum w:abstractNumId="84" w15:restartNumberingAfterBreak="0">
+  <w:abstractNum w:abstractNumId="86" w15:restartNumberingAfterBreak="0">
     <w:nsid w:val="7A880265"/>
     <w:multiLevelType w:val="hybridMultilevel"/>
     <w:tmpl w:val="00CE3C72"/>
@@ -14614,259 +16222,265 @@
     </w:lvl>
   </w:abstractNum>
   <w:num w:numId="1" w16cid:durableId="451706812">
-    <w:abstractNumId w:val="12"/>
+    <w:abstractNumId w:val="13"/>
   </w:num>
   <w:num w:numId="2" w16cid:durableId="943072337">
-    <w:abstractNumId w:val="63"/>
+    <w:abstractNumId w:val="65"/>
   </w:num>
   <w:num w:numId="3" w16cid:durableId="667709974">
-    <w:abstractNumId w:val="82"/>
+    <w:abstractNumId w:val="84"/>
   </w:num>
   <w:num w:numId="4" w16cid:durableId="42875176">
     <w:abstractNumId w:val="2"/>
   </w:num>
   <w:num w:numId="5" w16cid:durableId="1469126308">
-    <w:abstractNumId w:val="39"/>
+    <w:abstractNumId w:val="40"/>
   </w:num>
   <w:num w:numId="6" w16cid:durableId="2092892987">
-    <w:abstractNumId w:val="49"/>
+    <w:abstractNumId w:val="51"/>
   </w:num>
   <w:num w:numId="7" w16cid:durableId="722296573">
-    <w:abstractNumId w:val="72"/>
+    <w:abstractNumId w:val="74"/>
   </w:num>
   <w:num w:numId="8" w16cid:durableId="938299569">
-    <w:abstractNumId w:val="45"/>
+    <w:abstractNumId w:val="47"/>
   </w:num>
   <w:num w:numId="9" w16cid:durableId="1003119981">
     <w:abstractNumId w:val="1"/>
   </w:num>
   <w:num w:numId="10" w16cid:durableId="742533557">
+    <w:abstractNumId w:val="15"/>
+  </w:num>
+  <w:num w:numId="11" w16cid:durableId="1140876254">
     <w:abstractNumId w:val="14"/>
   </w:num>
-  <w:num w:numId="11" w16cid:durableId="1140876254">
-    <w:abstractNumId w:val="13"/>
-  </w:num>
   <w:num w:numId="12" w16cid:durableId="311175087">
-    <w:abstractNumId w:val="31"/>
+    <w:abstractNumId w:val="32"/>
   </w:num>
   <w:num w:numId="13" w16cid:durableId="1643578613">
-    <w:abstractNumId w:val="71"/>
+    <w:abstractNumId w:val="73"/>
   </w:num>
   <w:num w:numId="14" w16cid:durableId="28188523">
-    <w:abstractNumId w:val="16"/>
+    <w:abstractNumId w:val="17"/>
   </w:num>
   <w:num w:numId="15" w16cid:durableId="273635984">
     <w:abstractNumId w:val="0"/>
   </w:num>
   <w:num w:numId="16" w16cid:durableId="632515647">
-    <w:abstractNumId w:val="77"/>
+    <w:abstractNumId w:val="79"/>
   </w:num>
   <w:num w:numId="17" w16cid:durableId="1717313687">
     <w:abstractNumId w:val="3"/>
   </w:num>
   <w:num w:numId="18" w16cid:durableId="350423995">
+    <w:abstractNumId w:val="59"/>
+  </w:num>
+  <w:num w:numId="19" w16cid:durableId="1476485022">
+    <w:abstractNumId w:val="83"/>
+  </w:num>
+  <w:num w:numId="20" w16cid:durableId="798887380">
+    <w:abstractNumId w:val="29"/>
+  </w:num>
+  <w:num w:numId="21" w16cid:durableId="865338109">
+    <w:abstractNumId w:val="48"/>
+  </w:num>
+  <w:num w:numId="22" w16cid:durableId="1891963560">
+    <w:abstractNumId w:val="76"/>
+  </w:num>
+  <w:num w:numId="23" w16cid:durableId="337780777">
+    <w:abstractNumId w:val="75"/>
+  </w:num>
+  <w:num w:numId="24" w16cid:durableId="1319992471">
+    <w:abstractNumId w:val="7"/>
+  </w:num>
+  <w:num w:numId="25" w16cid:durableId="127862042">
+    <w:abstractNumId w:val="64"/>
+  </w:num>
+  <w:num w:numId="26" w16cid:durableId="1227882914">
+    <w:abstractNumId w:val="31"/>
+  </w:num>
+  <w:num w:numId="27" w16cid:durableId="780151792">
+    <w:abstractNumId w:val="49"/>
+  </w:num>
+  <w:num w:numId="28" w16cid:durableId="1863471563">
+    <w:abstractNumId w:val="11"/>
+  </w:num>
+  <w:num w:numId="29" w16cid:durableId="371878930">
     <w:abstractNumId w:val="57"/>
   </w:num>
-  <w:num w:numId="19" w16cid:durableId="1476485022">
-    <w:abstractNumId w:val="81"/>
+  <w:num w:numId="30" w16cid:durableId="388262574">
+    <w:abstractNumId w:val="77"/>
   </w:num>
-  <w:num w:numId="20" w16cid:durableId="798887380">
-    <w:abstractNumId w:val="28"/>
+  <w:num w:numId="31" w16cid:durableId="1178665434">
+    <w:abstractNumId w:val="55"/>
   </w:num>
-  <w:num w:numId="21" w16cid:durableId="865338109">
-    <w:abstractNumId w:val="46"/>
+  <w:num w:numId="32" w16cid:durableId="915287788">
+    <w:abstractNumId w:val="53"/>
   </w:num>
-  <w:num w:numId="22" w16cid:durableId="1891963560">
-    <w:abstractNumId w:val="74"/>
+  <w:num w:numId="33" w16cid:durableId="1896235540">
+    <w:abstractNumId w:val="50"/>
   </w:num>
-  <w:num w:numId="23" w16cid:durableId="337780777">
-    <w:abstractNumId w:val="73"/>
+  <w:num w:numId="34" w16cid:durableId="1107042679">
+    <w:abstractNumId w:val="8"/>
   </w:num>
-  <w:num w:numId="24" w16cid:durableId="1319992471">
-    <w:abstractNumId w:val="6"/>
+  <w:num w:numId="35" w16cid:durableId="874779833">
+    <w:abstractNumId w:val="38"/>
   </w:num>
-  <w:num w:numId="25" w16cid:durableId="127862042">
-    <w:abstractNumId w:val="62"/>
+  <w:num w:numId="36" w16cid:durableId="948898611">
+    <w:abstractNumId w:val="58"/>
   </w:num>
-  <w:num w:numId="26" w16cid:durableId="1227882914">
+  <w:num w:numId="37" w16cid:durableId="590242007">
+    <w:abstractNumId w:val="78"/>
+  </w:num>
+  <w:num w:numId="38" w16cid:durableId="857157669">
     <w:abstractNumId w:val="30"/>
   </w:num>
-  <w:num w:numId="27" w16cid:durableId="780151792">
-    <w:abstractNumId w:val="47"/>
-  </w:num>
-  <w:num w:numId="28" w16cid:durableId="1863471563">
-    <w:abstractNumId w:val="10"/>
-  </w:num>
-  <w:num w:numId="29" w16cid:durableId="371878930">
-    <w:abstractNumId w:val="55"/>
-  </w:num>
-  <w:num w:numId="30" w16cid:durableId="388262574">
-    <w:abstractNumId w:val="75"/>
-  </w:num>
-  <w:num w:numId="31" w16cid:durableId="1178665434">
-    <w:abstractNumId w:val="53"/>
-  </w:num>
-  <w:num w:numId="32" w16cid:durableId="915287788">
-    <w:abstractNumId w:val="51"/>
-  </w:num>
-  <w:num w:numId="33" w16cid:durableId="1896235540">
-    <w:abstractNumId w:val="48"/>
-  </w:num>
-  <w:num w:numId="34" w16cid:durableId="1107042679">
-    <w:abstractNumId w:val="7"/>
-  </w:num>
-  <w:num w:numId="35" w16cid:durableId="874779833">
-    <w:abstractNumId w:val="37"/>
-  </w:num>
-  <w:num w:numId="36" w16cid:durableId="948898611">
-    <w:abstractNumId w:val="56"/>
-  </w:num>
-  <w:num w:numId="37" w16cid:durableId="590242007">
-    <w:abstractNumId w:val="76"/>
-  </w:num>
-  <w:num w:numId="38" w16cid:durableId="857157669">
-    <w:abstractNumId w:val="29"/>
-  </w:num>
   <w:num w:numId="39" w16cid:durableId="906645066">
-    <w:abstractNumId w:val="40"/>
+    <w:abstractNumId w:val="41"/>
   </w:num>
   <w:num w:numId="40" w16cid:durableId="780346730">
+    <w:abstractNumId w:val="19"/>
+  </w:num>
+  <w:num w:numId="41" w16cid:durableId="1991328286">
+    <w:abstractNumId w:val="68"/>
+  </w:num>
+  <w:num w:numId="42" w16cid:durableId="1379402897">
+    <w:abstractNumId w:val="9"/>
+  </w:num>
+  <w:num w:numId="43" w16cid:durableId="1461269641">
+    <w:abstractNumId w:val="22"/>
+  </w:num>
+  <w:num w:numId="44" w16cid:durableId="2044283027">
+    <w:abstractNumId w:val="86"/>
+  </w:num>
+  <w:num w:numId="45" w16cid:durableId="1396320795">
+    <w:abstractNumId w:val="16"/>
+  </w:num>
+  <w:num w:numId="46" w16cid:durableId="1484538646">
+    <w:abstractNumId w:val="61"/>
+  </w:num>
+  <w:num w:numId="47" w16cid:durableId="1667320133">
+    <w:abstractNumId w:val="33"/>
+  </w:num>
+  <w:num w:numId="48" w16cid:durableId="894658374">
+    <w:abstractNumId w:val="24"/>
+  </w:num>
+  <w:num w:numId="49" w16cid:durableId="41682562">
+    <w:abstractNumId w:val="67"/>
+  </w:num>
+  <w:num w:numId="50" w16cid:durableId="681009789">
+    <w:abstractNumId w:val="12"/>
+  </w:num>
+  <w:num w:numId="51" w16cid:durableId="1973946117">
+    <w:abstractNumId w:val="26"/>
+  </w:num>
+  <w:num w:numId="52" w16cid:durableId="267203936">
+    <w:abstractNumId w:val="71"/>
+  </w:num>
+  <w:num w:numId="53" w16cid:durableId="1364747124">
+    <w:abstractNumId w:val="23"/>
+  </w:num>
+  <w:num w:numId="54" w16cid:durableId="465391243">
+    <w:abstractNumId w:val="70"/>
+  </w:num>
+  <w:num w:numId="55" w16cid:durableId="1051079903">
     <w:abstractNumId w:val="18"/>
   </w:num>
-  <w:num w:numId="41" w16cid:durableId="1991328286">
-    <w:abstractNumId w:val="66"/>
-  </w:num>
-  <w:num w:numId="42" w16cid:durableId="1379402897">
-    <w:abstractNumId w:val="8"/>
-  </w:num>
-  <w:num w:numId="43" w16cid:durableId="1461269641">
-    <w:abstractNumId w:val="21"/>
-  </w:num>
-  <w:num w:numId="44" w16cid:durableId="2044283027">
-    <w:abstractNumId w:val="84"/>
-  </w:num>
-  <w:num w:numId="45" w16cid:durableId="1396320795">
-    <w:abstractNumId w:val="15"/>
-  </w:num>
-  <w:num w:numId="46" w16cid:durableId="1484538646">
-    <w:abstractNumId w:val="59"/>
-  </w:num>
-  <w:num w:numId="47" w16cid:durableId="1667320133">
-    <w:abstractNumId w:val="32"/>
-  </w:num>
-  <w:num w:numId="48" w16cid:durableId="894658374">
-    <w:abstractNumId w:val="23"/>
-  </w:num>
-  <w:num w:numId="49" w16cid:durableId="41682562">
-    <w:abstractNumId w:val="65"/>
-  </w:num>
-  <w:num w:numId="50" w16cid:durableId="681009789">
-    <w:abstractNumId w:val="11"/>
-  </w:num>
-  <w:num w:numId="51" w16cid:durableId="1973946117">
-    <w:abstractNumId w:val="25"/>
-  </w:num>
-  <w:num w:numId="52" w16cid:durableId="267203936">
-    <w:abstractNumId w:val="69"/>
-  </w:num>
-  <w:num w:numId="53" w16cid:durableId="1364747124">
-    <w:abstractNumId w:val="22"/>
-  </w:num>
-  <w:num w:numId="54" w16cid:durableId="465391243">
-    <w:abstractNumId w:val="68"/>
-  </w:num>
-  <w:num w:numId="55" w16cid:durableId="1051079903">
-    <w:abstractNumId w:val="17"/>
-  </w:num>
   <w:num w:numId="56" w16cid:durableId="1185172641">
-    <w:abstractNumId w:val="80"/>
+    <w:abstractNumId w:val="82"/>
   </w:num>
   <w:num w:numId="57" w16cid:durableId="762216263">
     <w:abstractNumId w:val="5"/>
   </w:num>
   <w:num w:numId="58" w16cid:durableId="523446550">
-    <w:abstractNumId w:val="70"/>
+    <w:abstractNumId w:val="72"/>
   </w:num>
   <w:num w:numId="59" w16cid:durableId="1654337723">
-    <w:abstractNumId w:val="38"/>
+    <w:abstractNumId w:val="39"/>
   </w:num>
   <w:num w:numId="60" w16cid:durableId="362248408">
+    <w:abstractNumId w:val="56"/>
+  </w:num>
+  <w:num w:numId="61" w16cid:durableId="1846439190">
+    <w:abstractNumId w:val="35"/>
+  </w:num>
+  <w:num w:numId="62" w16cid:durableId="391924560">
+    <w:abstractNumId w:val="10"/>
+  </w:num>
+  <w:num w:numId="63" w16cid:durableId="1929540848">
+    <w:abstractNumId w:val="63"/>
+  </w:num>
+  <w:num w:numId="64" w16cid:durableId="1962763530">
+    <w:abstractNumId w:val="80"/>
+  </w:num>
+  <w:num w:numId="65" w16cid:durableId="938829965">
+    <w:abstractNumId w:val="66"/>
+  </w:num>
+  <w:num w:numId="66" w16cid:durableId="700667380">
+    <w:abstractNumId w:val="52"/>
+  </w:num>
+  <w:num w:numId="67" w16cid:durableId="1385057277">
+    <w:abstractNumId w:val="44"/>
+  </w:num>
+  <w:num w:numId="68" w16cid:durableId="1032657564">
+    <w:abstractNumId w:val="60"/>
+  </w:num>
+  <w:num w:numId="69" w16cid:durableId="86078716">
+    <w:abstractNumId w:val="37"/>
+  </w:num>
+  <w:num w:numId="70" w16cid:durableId="751463082">
+    <w:abstractNumId w:val="46"/>
+  </w:num>
+  <w:num w:numId="71" w16cid:durableId="1436942437">
+    <w:abstractNumId w:val="42"/>
+  </w:num>
+  <w:num w:numId="72" w16cid:durableId="745421061">
+    <w:abstractNumId w:val="25"/>
+  </w:num>
+  <w:num w:numId="73" w16cid:durableId="1640721056">
     <w:abstractNumId w:val="54"/>
   </w:num>
-  <w:num w:numId="61" w16cid:durableId="1846439190">
+  <w:num w:numId="74" w16cid:durableId="1332876128">
+    <w:abstractNumId w:val="85"/>
+  </w:num>
+  <w:num w:numId="75" w16cid:durableId="1947536825">
     <w:abstractNumId w:val="34"/>
   </w:num>
-  <w:num w:numId="62" w16cid:durableId="391924560">
-    <w:abstractNumId w:val="9"/>
-  </w:num>
-  <w:num w:numId="63" w16cid:durableId="1929540848">
-    <w:abstractNumId w:val="61"/>
-  </w:num>
-  <w:num w:numId="64" w16cid:durableId="1962763530">
-    <w:abstractNumId w:val="78"/>
-  </w:num>
-  <w:num w:numId="65" w16cid:durableId="938829965">
-    <w:abstractNumId w:val="64"/>
-  </w:num>
-  <w:num w:numId="66" w16cid:durableId="700667380">
-    <w:abstractNumId w:val="50"/>
-  </w:num>
-  <w:num w:numId="67" w16cid:durableId="1385057277">
-    <w:abstractNumId w:val="42"/>
-  </w:num>
-  <w:num w:numId="68" w16cid:durableId="1032657564">
-    <w:abstractNumId w:val="58"/>
-  </w:num>
-  <w:num w:numId="69" w16cid:durableId="86078716">
-    <w:abstractNumId w:val="36"/>
-  </w:num>
-  <w:num w:numId="70" w16cid:durableId="751463082">
-    <w:abstractNumId w:val="44"/>
-  </w:num>
-  <w:num w:numId="71" w16cid:durableId="1436942437">
-    <w:abstractNumId w:val="41"/>
-  </w:num>
-  <w:num w:numId="72" w16cid:durableId="745421061">
-    <w:abstractNumId w:val="24"/>
-  </w:num>
-  <w:num w:numId="73" w16cid:durableId="1640721056">
-    <w:abstractNumId w:val="52"/>
-  </w:num>
-  <w:num w:numId="74" w16cid:durableId="1332876128">
-    <w:abstractNumId w:val="83"/>
-  </w:num>
-  <w:num w:numId="75" w16cid:durableId="1947536825">
-    <w:abstractNumId w:val="33"/>
-  </w:num>
   <w:num w:numId="76" w16cid:durableId="624190089">
-    <w:abstractNumId w:val="67"/>
+    <w:abstractNumId w:val="69"/>
   </w:num>
   <w:num w:numId="77" w16cid:durableId="2114353150">
-    <w:abstractNumId w:val="19"/>
+    <w:abstractNumId w:val="20"/>
   </w:num>
   <w:num w:numId="78" w16cid:durableId="1205942063">
-    <w:abstractNumId w:val="35"/>
+    <w:abstractNumId w:val="36"/>
   </w:num>
   <w:num w:numId="79" w16cid:durableId="1646620926">
     <w:abstractNumId w:val="4"/>
   </w:num>
   <w:num w:numId="80" w16cid:durableId="118576681">
-    <w:abstractNumId w:val="26"/>
+    <w:abstractNumId w:val="27"/>
   </w:num>
   <w:num w:numId="81" w16cid:durableId="1522665152">
-    <w:abstractNumId w:val="27"/>
+    <w:abstractNumId w:val="28"/>
   </w:num>
   <w:num w:numId="82" w16cid:durableId="776218829">
-    <w:abstractNumId w:val="43"/>
+    <w:abstractNumId w:val="45"/>
   </w:num>
   <w:num w:numId="83" w16cid:durableId="112216851">
-    <w:abstractNumId w:val="60"/>
+    <w:abstractNumId w:val="62"/>
   </w:num>
   <w:num w:numId="84" w16cid:durableId="1655597904">
-    <w:abstractNumId w:val="20"/>
+    <w:abstractNumId w:val="21"/>
   </w:num>
   <w:num w:numId="85" w16cid:durableId="1085298509">
-    <w:abstractNumId w:val="79"/>
+    <w:abstractNumId w:val="81"/>
+  </w:num>
+  <w:num w:numId="86" w16cid:durableId="280261920">
+    <w:abstractNumId w:val="6"/>
+  </w:num>
+  <w:num w:numId="87" w16cid:durableId="1878079943">
+    <w:abstractNumId w:val="43"/>
   </w:num>
 </w:numbering>
 </file>

</xml_diff>

<commit_message>
docker - image file updated
</commit_message>
<xml_diff>
--- a/Docker/3-image.docx
+++ b/Docker/3-image.docx
@@ -5009,6 +5009,7 @@
       <w:pPr>
         <w:pStyle w:val="ListParagraph"/>
         <w:ind w:left="360"/>
+        <w:jc w:val="both"/>
         <w:rPr>
           <w:rFonts w:asciiTheme="majorBidi" w:hAnsiTheme="majorBidi" w:cstheme="majorBidi"/>
           <w:sz w:val="28"/>
@@ -5032,6 +5033,7 @@
           <w:numId w:val="12"/>
         </w:numPr>
         <w:ind w:left="360"/>
+        <w:jc w:val="both"/>
         <w:rPr>
           <w:rFonts w:asciiTheme="majorBidi" w:hAnsiTheme="majorBidi" w:cstheme="majorBidi"/>
           <w:sz w:val="28"/>
@@ -5051,6 +5053,7 @@
       <w:pPr>
         <w:pStyle w:val="ListParagraph"/>
         <w:ind w:left="360"/>
+        <w:jc w:val="both"/>
         <w:rPr>
           <w:rFonts w:asciiTheme="majorBidi" w:hAnsiTheme="majorBidi" w:cstheme="majorBidi"/>
           <w:sz w:val="28"/>
@@ -5074,6 +5077,7 @@
           <w:numId w:val="12"/>
         </w:numPr>
         <w:ind w:left="360"/>
+        <w:jc w:val="both"/>
         <w:rPr>
           <w:rFonts w:asciiTheme="majorBidi" w:hAnsiTheme="majorBidi" w:cstheme="majorBidi"/>
           <w:sz w:val="28"/>
@@ -5094,6 +5098,7 @@
         <w:pStyle w:val="ListParagraph"/>
         <w:spacing w:after="120"/>
         <w:ind w:left="360"/>
+        <w:jc w:val="both"/>
         <w:rPr>
           <w:rFonts w:asciiTheme="majorBidi" w:hAnsiTheme="majorBidi" w:cstheme="majorBidi"/>
           <w:sz w:val="28"/>
@@ -5733,17 +5738,7 @@
           <w:sz w:val="36"/>
           <w:szCs w:val="36"/>
         </w:rPr>
-        <w:t xml:space="preserve">Multi </w:t>
-      </w:r>
-      <w:r>
-        <w:rPr>
-          <w:rFonts w:asciiTheme="majorBidi" w:hAnsiTheme="majorBidi" w:cstheme="majorBidi"/>
-          <w:b/>
-          <w:bCs/>
-          <w:sz w:val="36"/>
-          <w:szCs w:val="36"/>
-        </w:rPr>
-        <w:t>multi-architecture image</w:t>
+        <w:t>Multi multi-architecture image</w:t>
       </w:r>
       <w:r>
         <w:rPr>
@@ -6532,6 +6527,7 @@
     <w:p>
       <w:pPr>
         <w:spacing w:after="60"/>
+        <w:jc w:val="both"/>
         <w:rPr>
           <w:rFonts w:asciiTheme="majorBidi" w:hAnsiTheme="majorBidi" w:cstheme="majorBidi"/>
           <w:sz w:val="28"/>
@@ -6550,6 +6546,7 @@
     <w:p>
       <w:pPr>
         <w:spacing w:after="60"/>
+        <w:jc w:val="both"/>
         <w:rPr>
           <w:rFonts w:asciiTheme="majorBidi" w:hAnsiTheme="majorBidi" w:cstheme="majorBidi"/>
           <w:sz w:val="28"/>
@@ -6568,6 +6565,7 @@
     <w:p>
       <w:pPr>
         <w:spacing w:after="60"/>
+        <w:jc w:val="both"/>
         <w:rPr>
           <w:rFonts w:asciiTheme="majorBidi" w:hAnsiTheme="majorBidi" w:cstheme="majorBidi"/>
           <w:sz w:val="28"/>
@@ -6591,6 +6589,7 @@
           <w:numId w:val="87"/>
         </w:numPr>
         <w:ind w:left="504"/>
+        <w:jc w:val="both"/>
         <w:rPr>
           <w:rFonts w:asciiTheme="majorBidi" w:hAnsiTheme="majorBidi" w:cstheme="majorBidi"/>
           <w:sz w:val="28"/>
@@ -6615,6 +6614,7 @@
         </w:numPr>
         <w:spacing w:after="60"/>
         <w:ind w:left="504"/>
+        <w:jc w:val="both"/>
         <w:rPr>
           <w:rFonts w:asciiTheme="majorBidi" w:hAnsiTheme="majorBidi" w:cstheme="majorBidi"/>
           <w:sz w:val="28"/>
@@ -6646,6 +6646,2692 @@
           <w:szCs w:val="28"/>
         </w:rPr>
         <w:t>One blueprint vs. a catalog of blueprints.</w:t>
+      </w:r>
+    </w:p>
+    <w:p>
+      <w:pPr>
+        <w:jc w:val="both"/>
+        <w:rPr>
+          <w:rFonts w:asciiTheme="majorBidi" w:hAnsiTheme="majorBidi" w:cstheme="majorBidi"/>
+          <w:b/>
+          <w:bCs/>
+          <w:sz w:val="36"/>
+          <w:szCs w:val="36"/>
+        </w:rPr>
+      </w:pPr>
+      <w:r>
+        <w:rPr>
+          <w:rFonts w:asciiTheme="majorBidi" w:hAnsiTheme="majorBidi" w:cstheme="majorBidi"/>
+          <w:b/>
+          <w:bCs/>
+          <w:sz w:val="36"/>
+          <w:szCs w:val="36"/>
+        </w:rPr>
+        <w:lastRenderedPageBreak/>
+        <w:t>Image Portability &amp; Snapshotting</w:t>
+      </w:r>
+      <w:r>
+        <w:rPr>
+          <w:rFonts w:asciiTheme="majorBidi" w:hAnsiTheme="majorBidi" w:cstheme="majorBidi"/>
+          <w:b/>
+          <w:bCs/>
+          <w:sz w:val="36"/>
+          <w:szCs w:val="36"/>
+        </w:rPr>
+        <w:t>:</w:t>
+      </w:r>
+    </w:p>
+    <w:p>
+      <w:pPr>
+        <w:spacing w:after="120"/>
+        <w:jc w:val="both"/>
+        <w:rPr>
+          <w:rFonts w:asciiTheme="majorBidi" w:hAnsiTheme="majorBidi" w:cstheme="majorBidi"/>
+          <w:b/>
+          <w:bCs/>
+          <w:sz w:val="32"/>
+          <w:szCs w:val="32"/>
+        </w:rPr>
+      </w:pPr>
+      <w:r>
+        <w:rPr>
+          <w:rFonts w:asciiTheme="majorBidi" w:hAnsiTheme="majorBidi" w:cstheme="majorBidi"/>
+          <w:b/>
+          <w:bCs/>
+          <w:i/>
+          <w:iCs/>
+          <w:sz w:val="32"/>
+          <w:szCs w:val="32"/>
+        </w:rPr>
+        <w:t>docker commit</w:t>
+      </w:r>
+      <w:r>
+        <w:rPr>
+          <w:rFonts w:asciiTheme="majorBidi" w:hAnsiTheme="majorBidi" w:cstheme="majorBidi"/>
+          <w:b/>
+          <w:bCs/>
+          <w:sz w:val="32"/>
+          <w:szCs w:val="32"/>
+        </w:rPr>
+        <w:t xml:space="preserve"> command:</w:t>
+      </w:r>
+    </w:p>
+    <w:p>
+      <w:pPr>
+        <w:spacing w:after="120"/>
+        <w:jc w:val="both"/>
+        <w:rPr>
+          <w:rFonts w:asciiTheme="majorBidi" w:hAnsiTheme="majorBidi" w:cstheme="majorBidi"/>
+          <w:sz w:val="28"/>
+          <w:szCs w:val="28"/>
+        </w:rPr>
+      </w:pPr>
+      <w:r>
+        <w:rPr>
+          <w:rFonts w:asciiTheme="majorBidi" w:hAnsiTheme="majorBidi" w:cstheme="majorBidi"/>
+          <w:sz w:val="28"/>
+          <w:szCs w:val="28"/>
+        </w:rPr>
+        <w:t>docker commit creates a new image from a container’s current state.</w:t>
+      </w:r>
+    </w:p>
+    <w:p>
+      <w:pPr>
+        <w:spacing w:after="120"/>
+        <w:jc w:val="both"/>
+        <w:rPr>
+          <w:rFonts w:asciiTheme="majorBidi" w:hAnsiTheme="majorBidi" w:cstheme="majorBidi"/>
+          <w:sz w:val="28"/>
+          <w:szCs w:val="28"/>
+        </w:rPr>
+      </w:pPr>
+      <w:r>
+        <w:rPr>
+          <w:rFonts w:asciiTheme="majorBidi" w:hAnsiTheme="majorBidi" w:cstheme="majorBidi"/>
+          <w:sz w:val="28"/>
+          <w:szCs w:val="28"/>
+        </w:rPr>
+        <w:t>Basic form:</w:t>
+      </w:r>
+      <w:r>
+        <w:rPr>
+          <w:rFonts w:asciiTheme="majorBidi" w:hAnsiTheme="majorBidi" w:cstheme="majorBidi"/>
+          <w:sz w:val="28"/>
+          <w:szCs w:val="28"/>
+        </w:rPr>
+        <w:t xml:space="preserve"> </w:t>
+      </w:r>
+    </w:p>
+    <w:p>
+      <w:pPr>
+        <w:spacing w:after="120"/>
+        <w:jc w:val="both"/>
+        <w:rPr>
+          <w:rFonts w:asciiTheme="majorBidi" w:hAnsiTheme="majorBidi" w:cstheme="majorBidi"/>
+          <w:sz w:val="28"/>
+          <w:szCs w:val="28"/>
+        </w:rPr>
+      </w:pPr>
+      <w:r>
+        <w:rPr>
+          <w:rFonts w:asciiTheme="majorBidi" w:hAnsiTheme="majorBidi" w:cstheme="majorBidi"/>
+          <w:b/>
+          <w:bCs/>
+          <w:i/>
+          <w:iCs/>
+          <w:sz w:val="28"/>
+          <w:szCs w:val="28"/>
+        </w:rPr>
+        <w:t>docker commit &lt;container&gt; &lt;new-image-name&gt;:&lt;tag&gt;</w:t>
+      </w:r>
+      <w:r>
+        <w:rPr>
+          <w:rFonts w:asciiTheme="majorBidi" w:hAnsiTheme="majorBidi" w:cstheme="majorBidi"/>
+          <w:b/>
+          <w:bCs/>
+          <w:i/>
+          <w:iCs/>
+          <w:sz w:val="28"/>
+          <w:szCs w:val="28"/>
+        </w:rPr>
+        <w:t xml:space="preserve"> </w:t>
+      </w:r>
+      <w:r>
+        <w:rPr>
+          <w:rFonts w:asciiTheme="majorBidi" w:hAnsiTheme="majorBidi" w:cstheme="majorBidi"/>
+          <w:sz w:val="28"/>
+          <w:szCs w:val="28"/>
+        </w:rPr>
+        <w:t>→</w:t>
+      </w:r>
+      <w:r>
+        <w:rPr>
+          <w:rFonts w:asciiTheme="majorBidi" w:hAnsiTheme="majorBidi" w:cstheme="majorBidi"/>
+          <w:b/>
+          <w:bCs/>
+          <w:i/>
+          <w:iCs/>
+          <w:sz w:val="28"/>
+          <w:szCs w:val="28"/>
+        </w:rPr>
+        <w:t xml:space="preserve"> </w:t>
+      </w:r>
+      <w:r>
+        <w:rPr>
+          <w:rFonts w:asciiTheme="majorBidi" w:hAnsiTheme="majorBidi" w:cstheme="majorBidi"/>
+          <w:sz w:val="28"/>
+          <w:szCs w:val="28"/>
+        </w:rPr>
+        <w:t>Docker takes the container’s writable layer</w:t>
+      </w:r>
+      <w:r>
+        <w:rPr>
+          <w:rFonts w:asciiTheme="majorBidi" w:hAnsiTheme="majorBidi" w:cstheme="majorBidi"/>
+          <w:sz w:val="28"/>
+          <w:szCs w:val="28"/>
+        </w:rPr>
+        <w:t>.</w:t>
+      </w:r>
+      <w:r>
+        <w:rPr>
+          <w:rFonts w:asciiTheme="majorBidi" w:hAnsiTheme="majorBidi" w:cstheme="majorBidi"/>
+          <w:sz w:val="28"/>
+          <w:szCs w:val="28"/>
+        </w:rPr>
+        <w:t xml:space="preserve"> </w:t>
+      </w:r>
+      <w:r>
+        <w:rPr>
+          <w:rFonts w:asciiTheme="majorBidi" w:hAnsiTheme="majorBidi" w:cstheme="majorBidi"/>
+          <w:sz w:val="28"/>
+          <w:szCs w:val="28"/>
+        </w:rPr>
+        <w:t>T</w:t>
+      </w:r>
+      <w:r>
+        <w:rPr>
+          <w:rFonts w:asciiTheme="majorBidi" w:hAnsiTheme="majorBidi" w:cstheme="majorBidi"/>
+          <w:sz w:val="28"/>
+          <w:szCs w:val="28"/>
+        </w:rPr>
+        <w:t xml:space="preserve">he changes made </w:t>
+      </w:r>
+      <w:proofErr w:type="gramStart"/>
+      <w:r>
+        <w:rPr>
+          <w:rFonts w:asciiTheme="majorBidi" w:hAnsiTheme="majorBidi" w:cstheme="majorBidi"/>
+          <w:sz w:val="28"/>
+          <w:szCs w:val="28"/>
+        </w:rPr>
+        <w:t>since</w:t>
+      </w:r>
+      <w:proofErr w:type="gramEnd"/>
+      <w:r>
+        <w:rPr>
+          <w:rFonts w:asciiTheme="majorBidi" w:hAnsiTheme="majorBidi" w:cstheme="majorBidi"/>
+          <w:sz w:val="28"/>
+          <w:szCs w:val="28"/>
+        </w:rPr>
+        <w:t xml:space="preserve"> it was created from its base image and turns that into a new image layer. Then it stacks that layer on top of the original image and creates a new image reference.</w:t>
+      </w:r>
+    </w:p>
+    <w:p>
+      <w:pPr>
+        <w:spacing w:after="120"/>
+        <w:jc w:val="both"/>
+        <w:rPr>
+          <w:rFonts w:asciiTheme="majorBidi" w:hAnsiTheme="majorBidi" w:cstheme="majorBidi"/>
+          <w:sz w:val="28"/>
+          <w:szCs w:val="28"/>
+        </w:rPr>
+      </w:pPr>
+      <w:r>
+        <w:rPr>
+          <w:rFonts w:asciiTheme="majorBidi" w:hAnsiTheme="majorBidi" w:cstheme="majorBidi"/>
+          <w:sz w:val="28"/>
+          <w:szCs w:val="28"/>
+          <w:u w:val="single"/>
+        </w:rPr>
+        <w:t>So conceptually:</w:t>
+      </w:r>
+      <w:r>
+        <w:rPr>
+          <w:rFonts w:asciiTheme="majorBidi" w:hAnsiTheme="majorBidi" w:cstheme="majorBidi"/>
+          <w:sz w:val="28"/>
+          <w:szCs w:val="28"/>
+        </w:rPr>
+        <w:t xml:space="preserve"> </w:t>
+      </w:r>
+      <w:r>
+        <w:rPr>
+          <w:rFonts w:asciiTheme="majorBidi" w:hAnsiTheme="majorBidi" w:cstheme="majorBidi"/>
+          <w:sz w:val="28"/>
+          <w:szCs w:val="28"/>
+        </w:rPr>
+        <w:t>Base image</w:t>
+      </w:r>
+      <w:r>
+        <w:rPr>
+          <w:rFonts w:asciiTheme="majorBidi" w:hAnsiTheme="majorBidi" w:cstheme="majorBidi"/>
+          <w:sz w:val="28"/>
+          <w:szCs w:val="28"/>
+        </w:rPr>
+        <w:t xml:space="preserve"> + </w:t>
+      </w:r>
+      <w:r>
+        <w:rPr>
+          <w:rFonts w:asciiTheme="majorBidi" w:hAnsiTheme="majorBidi" w:cstheme="majorBidi"/>
+          <w:sz w:val="28"/>
+          <w:szCs w:val="28"/>
+        </w:rPr>
+        <w:t>container modifications</w:t>
+      </w:r>
+      <w:r>
+        <w:rPr>
+          <w:rFonts w:asciiTheme="majorBidi" w:hAnsiTheme="majorBidi" w:cstheme="majorBidi"/>
+          <w:sz w:val="28"/>
+          <w:szCs w:val="28"/>
+        </w:rPr>
+        <w:t xml:space="preserve"> </w:t>
+      </w:r>
+      <w:r>
+        <w:rPr>
+          <w:rFonts w:asciiTheme="majorBidi" w:hAnsiTheme="majorBidi" w:cstheme="majorBidi"/>
+          <w:sz w:val="28"/>
+          <w:szCs w:val="28"/>
+        </w:rPr>
+        <w:t>= new image</w:t>
+      </w:r>
+    </w:p>
+    <w:p>
+      <w:pPr>
+        <w:spacing w:after="60"/>
+        <w:jc w:val="both"/>
+        <w:rPr>
+          <w:rFonts w:asciiTheme="majorBidi" w:hAnsiTheme="majorBidi" w:cstheme="majorBidi"/>
+          <w:sz w:val="28"/>
+          <w:szCs w:val="28"/>
+        </w:rPr>
+      </w:pPr>
+      <w:r>
+        <w:rPr>
+          <w:rFonts w:asciiTheme="majorBidi" w:hAnsiTheme="majorBidi" w:cstheme="majorBidi"/>
+          <w:sz w:val="28"/>
+          <w:szCs w:val="28"/>
+        </w:rPr>
+        <w:t>It does not include:</w:t>
+      </w:r>
+    </w:p>
+    <w:p>
+      <w:pPr>
+        <w:pStyle w:val="ListParagraph"/>
+        <w:numPr>
+          <w:ilvl w:val="0"/>
+          <w:numId w:val="88"/>
+        </w:numPr>
+        <w:ind w:left="360"/>
+        <w:jc w:val="both"/>
+        <w:rPr>
+          <w:rFonts w:asciiTheme="majorBidi" w:hAnsiTheme="majorBidi" w:cstheme="majorBidi"/>
+          <w:sz w:val="28"/>
+          <w:szCs w:val="28"/>
+        </w:rPr>
+      </w:pPr>
+      <w:r>
+        <w:rPr>
+          <w:rFonts w:asciiTheme="majorBidi" w:hAnsiTheme="majorBidi" w:cstheme="majorBidi"/>
+          <w:sz w:val="28"/>
+          <w:szCs w:val="28"/>
+        </w:rPr>
+        <w:t>Mounted volumes</w:t>
+      </w:r>
+    </w:p>
+    <w:p>
+      <w:pPr>
+        <w:pStyle w:val="ListParagraph"/>
+        <w:numPr>
+          <w:ilvl w:val="0"/>
+          <w:numId w:val="88"/>
+        </w:numPr>
+        <w:ind w:left="360"/>
+        <w:jc w:val="both"/>
+        <w:rPr>
+          <w:rFonts w:asciiTheme="majorBidi" w:hAnsiTheme="majorBidi" w:cstheme="majorBidi"/>
+          <w:sz w:val="28"/>
+          <w:szCs w:val="28"/>
+        </w:rPr>
+      </w:pPr>
+      <w:r>
+        <w:rPr>
+          <w:rFonts w:asciiTheme="majorBidi" w:hAnsiTheme="majorBidi" w:cstheme="majorBidi"/>
+          <w:sz w:val="28"/>
+          <w:szCs w:val="28"/>
+        </w:rPr>
+        <w:t>External bind mounts</w:t>
+      </w:r>
+    </w:p>
+    <w:p>
+      <w:pPr>
+        <w:pStyle w:val="ListParagraph"/>
+        <w:numPr>
+          <w:ilvl w:val="0"/>
+          <w:numId w:val="88"/>
+        </w:numPr>
+        <w:spacing w:after="120"/>
+        <w:ind w:left="360"/>
+        <w:jc w:val="both"/>
+        <w:rPr>
+          <w:rFonts w:asciiTheme="majorBidi" w:hAnsiTheme="majorBidi" w:cstheme="majorBidi"/>
+          <w:sz w:val="28"/>
+          <w:szCs w:val="28"/>
+        </w:rPr>
+      </w:pPr>
+      <w:r>
+        <w:rPr>
+          <w:rFonts w:asciiTheme="majorBidi" w:hAnsiTheme="majorBidi" w:cstheme="majorBidi"/>
+          <w:sz w:val="28"/>
+          <w:szCs w:val="28"/>
+        </w:rPr>
+        <w:t>Runtime-only state like network connections</w:t>
+      </w:r>
+    </w:p>
+    <w:p>
+      <w:pPr>
+        <w:spacing w:after="120"/>
+        <w:jc w:val="both"/>
+        <w:rPr>
+          <w:rFonts w:asciiTheme="majorBidi" w:hAnsiTheme="majorBidi" w:cstheme="majorBidi"/>
+          <w:sz w:val="28"/>
+          <w:szCs w:val="28"/>
+        </w:rPr>
+      </w:pPr>
+      <w:r>
+        <w:rPr>
+          <w:rFonts w:asciiTheme="majorBidi" w:hAnsiTheme="majorBidi" w:cstheme="majorBidi"/>
+          <w:sz w:val="28"/>
+          <w:szCs w:val="28"/>
+        </w:rPr>
+        <w:t>It only captures the container’s filesystem changes inside its writable layer.</w:t>
+      </w:r>
+    </w:p>
+    <w:p>
+      <w:pPr>
+        <w:spacing w:after="120"/>
+        <w:jc w:val="both"/>
+        <w:rPr>
+          <w:rFonts w:asciiTheme="majorBidi" w:hAnsiTheme="majorBidi" w:cstheme="majorBidi"/>
+          <w:sz w:val="28"/>
+          <w:szCs w:val="28"/>
+        </w:rPr>
+      </w:pPr>
+      <w:r>
+        <w:rPr>
+          <w:rFonts w:asciiTheme="majorBidi" w:hAnsiTheme="majorBidi" w:cstheme="majorBidi"/>
+          <w:b/>
+          <w:bCs/>
+          <w:i/>
+          <w:iCs/>
+          <w:sz w:val="28"/>
+          <w:szCs w:val="28"/>
+        </w:rPr>
+        <w:t>docker commit</w:t>
+      </w:r>
+      <w:r>
+        <w:rPr>
+          <w:rFonts w:asciiTheme="majorBidi" w:hAnsiTheme="majorBidi" w:cstheme="majorBidi"/>
+          <w:sz w:val="28"/>
+          <w:szCs w:val="28"/>
+        </w:rPr>
+        <w:t xml:space="preserve"> is basically a filesystem snapshot.</w:t>
+      </w:r>
+      <w:r>
+        <w:rPr>
+          <w:rFonts w:asciiTheme="majorBidi" w:hAnsiTheme="majorBidi" w:cstheme="majorBidi"/>
+          <w:sz w:val="28"/>
+          <w:szCs w:val="28"/>
+        </w:rPr>
+        <w:t xml:space="preserve"> </w:t>
+      </w:r>
+      <w:r>
+        <w:rPr>
+          <w:rFonts w:asciiTheme="majorBidi" w:hAnsiTheme="majorBidi" w:cstheme="majorBidi"/>
+          <w:sz w:val="28"/>
+          <w:szCs w:val="28"/>
+        </w:rPr>
+        <w:t xml:space="preserve">It does not record the command history like a </w:t>
+      </w:r>
+      <w:proofErr w:type="spellStart"/>
+      <w:r>
+        <w:rPr>
+          <w:rFonts w:asciiTheme="majorBidi" w:hAnsiTheme="majorBidi" w:cstheme="majorBidi"/>
+          <w:sz w:val="28"/>
+          <w:szCs w:val="28"/>
+        </w:rPr>
+        <w:t>Dockerfile</w:t>
+      </w:r>
+      <w:proofErr w:type="spellEnd"/>
+      <w:r>
+        <w:rPr>
+          <w:rFonts w:asciiTheme="majorBidi" w:hAnsiTheme="majorBidi" w:cstheme="majorBidi"/>
+          <w:sz w:val="28"/>
+          <w:szCs w:val="28"/>
+        </w:rPr>
+        <w:t xml:space="preserve"> does.</w:t>
+      </w:r>
+    </w:p>
+    <w:p>
+      <w:pPr>
+        <w:jc w:val="both"/>
+        <w:rPr>
+          <w:rFonts w:asciiTheme="majorBidi" w:hAnsiTheme="majorBidi" w:cstheme="majorBidi"/>
+          <w:sz w:val="28"/>
+          <w:szCs w:val="28"/>
+        </w:rPr>
+      </w:pPr>
+      <w:proofErr w:type="gramStart"/>
+      <w:r>
+        <w:rPr>
+          <w:rFonts w:asciiTheme="majorBidi" w:hAnsiTheme="majorBidi" w:cstheme="majorBidi"/>
+          <w:sz w:val="28"/>
+          <w:szCs w:val="28"/>
+        </w:rPr>
+        <w:t>So</w:t>
+      </w:r>
+      <w:proofErr w:type="gramEnd"/>
+      <w:r>
+        <w:rPr>
+          <w:rFonts w:asciiTheme="majorBidi" w:hAnsiTheme="majorBidi" w:cstheme="majorBidi"/>
+          <w:sz w:val="28"/>
+          <w:szCs w:val="28"/>
+        </w:rPr>
+        <w:t xml:space="preserve"> if you installed packages manually inside a container and then commit it, the new image contains those packages</w:t>
+      </w:r>
+      <w:r>
+        <w:rPr>
+          <w:rFonts w:asciiTheme="majorBidi" w:hAnsiTheme="majorBidi" w:cstheme="majorBidi"/>
+          <w:sz w:val="28"/>
+          <w:szCs w:val="28"/>
+        </w:rPr>
+        <w:t>.</w:t>
+      </w:r>
+      <w:r>
+        <w:rPr>
+          <w:rFonts w:asciiTheme="majorBidi" w:hAnsiTheme="majorBidi" w:cstheme="majorBidi"/>
+          <w:sz w:val="28"/>
+          <w:szCs w:val="28"/>
+        </w:rPr>
+        <w:t xml:space="preserve"> but there is no reproducible build recipe. It’s a black box snapshot.</w:t>
+      </w:r>
+    </w:p>
+    <w:p>
+      <w:pPr>
+        <w:spacing w:after="120"/>
+        <w:jc w:val="both"/>
+        <w:rPr>
+          <w:rFonts w:asciiTheme="majorBidi" w:hAnsiTheme="majorBidi" w:cstheme="majorBidi"/>
+          <w:sz w:val="28"/>
+          <w:szCs w:val="28"/>
+        </w:rPr>
+      </w:pPr>
+      <w:r>
+        <w:rPr>
+          <w:rFonts w:asciiTheme="majorBidi" w:hAnsiTheme="majorBidi" w:cstheme="majorBidi"/>
+          <w:sz w:val="28"/>
+          <w:szCs w:val="28"/>
+        </w:rPr>
+        <w:t>Important options:</w:t>
+      </w:r>
+    </w:p>
+    <w:p>
+      <w:pPr>
+        <w:pStyle w:val="ListParagraph"/>
+        <w:numPr>
+          <w:ilvl w:val="0"/>
+          <w:numId w:val="89"/>
+        </w:numPr>
+        <w:ind w:left="360"/>
+        <w:rPr>
+          <w:rFonts w:asciiTheme="majorBidi" w:hAnsiTheme="majorBidi" w:cstheme="majorBidi"/>
+          <w:sz w:val="28"/>
+          <w:szCs w:val="28"/>
+        </w:rPr>
+      </w:pPr>
+      <w:r>
+        <w:rPr>
+          <w:rFonts w:asciiTheme="majorBidi" w:hAnsiTheme="majorBidi" w:cstheme="majorBidi"/>
+          <w:sz w:val="28"/>
+          <w:szCs w:val="28"/>
+        </w:rPr>
+        <w:t>You can also add metadata during commit:</w:t>
+      </w:r>
+    </w:p>
+    <w:p>
+      <w:pPr>
+        <w:pStyle w:val="ListParagraph"/>
+        <w:ind w:left="360"/>
+        <w:rPr>
+          <w:rFonts w:asciiTheme="majorBidi" w:hAnsiTheme="majorBidi" w:cstheme="majorBidi"/>
+          <w:b/>
+          <w:bCs/>
+          <w:i/>
+          <w:iCs/>
+          <w:sz w:val="28"/>
+          <w:szCs w:val="28"/>
+        </w:rPr>
+      </w:pPr>
+      <w:r>
+        <w:rPr>
+          <w:rFonts w:asciiTheme="majorBidi" w:hAnsiTheme="majorBidi" w:cstheme="majorBidi"/>
+          <w:b/>
+          <w:bCs/>
+          <w:i/>
+          <w:iCs/>
+          <w:sz w:val="28"/>
+          <w:szCs w:val="28"/>
+        </w:rPr>
+        <w:t>docker commit -m "added debugging tools" -a "</w:t>
+      </w:r>
+      <w:proofErr w:type="spellStart"/>
+      <w:r>
+        <w:rPr>
+          <w:rFonts w:asciiTheme="majorBidi" w:hAnsiTheme="majorBidi" w:cstheme="majorBidi"/>
+          <w:b/>
+          <w:bCs/>
+          <w:i/>
+          <w:iCs/>
+          <w:sz w:val="28"/>
+          <w:szCs w:val="28"/>
+        </w:rPr>
+        <w:t>YourName</w:t>
+      </w:r>
+      <w:proofErr w:type="spellEnd"/>
+      <w:r>
+        <w:rPr>
+          <w:rFonts w:asciiTheme="majorBidi" w:hAnsiTheme="majorBidi" w:cstheme="majorBidi"/>
+          <w:b/>
+          <w:bCs/>
+          <w:i/>
+          <w:iCs/>
+          <w:sz w:val="28"/>
+          <w:szCs w:val="28"/>
+        </w:rPr>
+        <w:t xml:space="preserve">" </w:t>
+      </w:r>
+      <w:proofErr w:type="spellStart"/>
+      <w:r>
+        <w:rPr>
+          <w:rFonts w:asciiTheme="majorBidi" w:hAnsiTheme="majorBidi" w:cstheme="majorBidi"/>
+          <w:b/>
+          <w:bCs/>
+          <w:i/>
+          <w:iCs/>
+          <w:sz w:val="28"/>
+          <w:szCs w:val="28"/>
+        </w:rPr>
+        <w:t>mycontainer</w:t>
+      </w:r>
+      <w:proofErr w:type="spellEnd"/>
+      <w:r>
+        <w:rPr>
+          <w:rFonts w:asciiTheme="majorBidi" w:hAnsiTheme="majorBidi" w:cstheme="majorBidi"/>
+          <w:b/>
+          <w:bCs/>
+          <w:i/>
+          <w:iCs/>
+          <w:sz w:val="28"/>
+          <w:szCs w:val="28"/>
+        </w:rPr>
+        <w:t xml:space="preserve"> </w:t>
+      </w:r>
+      <w:proofErr w:type="spellStart"/>
+      <w:proofErr w:type="gramStart"/>
+      <w:r>
+        <w:rPr>
+          <w:rFonts w:asciiTheme="majorBidi" w:hAnsiTheme="majorBidi" w:cstheme="majorBidi"/>
+          <w:b/>
+          <w:bCs/>
+          <w:i/>
+          <w:iCs/>
+          <w:sz w:val="28"/>
+          <w:szCs w:val="28"/>
+        </w:rPr>
+        <w:t>myimage:debug</w:t>
+      </w:r>
+      <w:proofErr w:type="spellEnd"/>
+      <w:proofErr w:type="gramEnd"/>
+    </w:p>
+    <w:p>
+      <w:pPr>
+        <w:pStyle w:val="ListParagraph"/>
+        <w:numPr>
+          <w:ilvl w:val="0"/>
+          <w:numId w:val="89"/>
+        </w:numPr>
+        <w:ind w:left="360"/>
+        <w:rPr>
+          <w:rFonts w:asciiTheme="majorBidi" w:hAnsiTheme="majorBidi" w:cstheme="majorBidi"/>
+          <w:sz w:val="28"/>
+          <w:szCs w:val="28"/>
+        </w:rPr>
+      </w:pPr>
+      <w:r>
+        <w:rPr>
+          <w:rFonts w:asciiTheme="majorBidi" w:hAnsiTheme="majorBidi" w:cstheme="majorBidi"/>
+          <w:sz w:val="28"/>
+          <w:szCs w:val="28"/>
+        </w:rPr>
+        <w:t>You can even override the default command:</w:t>
+      </w:r>
+    </w:p>
+    <w:p>
+      <w:pPr>
+        <w:pStyle w:val="ListParagraph"/>
+        <w:spacing w:after="120"/>
+        <w:ind w:left="360"/>
+        <w:rPr>
+          <w:rFonts w:asciiTheme="majorBidi" w:hAnsiTheme="majorBidi" w:cstheme="majorBidi"/>
+          <w:b/>
+          <w:bCs/>
+          <w:i/>
+          <w:iCs/>
+          <w:sz w:val="28"/>
+          <w:szCs w:val="28"/>
+        </w:rPr>
+      </w:pPr>
+      <w:r>
+        <w:rPr>
+          <w:rFonts w:asciiTheme="majorBidi" w:hAnsiTheme="majorBidi" w:cstheme="majorBidi"/>
+          <w:b/>
+          <w:bCs/>
+          <w:i/>
+          <w:iCs/>
+          <w:sz w:val="28"/>
+          <w:szCs w:val="28"/>
+        </w:rPr>
+        <w:t xml:space="preserve">docker commit --change='CMD ["bash"]' </w:t>
+      </w:r>
+      <w:proofErr w:type="spellStart"/>
+      <w:r>
+        <w:rPr>
+          <w:rFonts w:asciiTheme="majorBidi" w:hAnsiTheme="majorBidi" w:cstheme="majorBidi"/>
+          <w:b/>
+          <w:bCs/>
+          <w:i/>
+          <w:iCs/>
+          <w:sz w:val="28"/>
+          <w:szCs w:val="28"/>
+        </w:rPr>
+        <w:t>mycontainer</w:t>
+      </w:r>
+      <w:proofErr w:type="spellEnd"/>
+      <w:r>
+        <w:rPr>
+          <w:rFonts w:asciiTheme="majorBidi" w:hAnsiTheme="majorBidi" w:cstheme="majorBidi"/>
+          <w:b/>
+          <w:bCs/>
+          <w:i/>
+          <w:iCs/>
+          <w:sz w:val="28"/>
+          <w:szCs w:val="28"/>
+        </w:rPr>
+        <w:t xml:space="preserve"> </w:t>
+      </w:r>
+      <w:proofErr w:type="spellStart"/>
+      <w:proofErr w:type="gramStart"/>
+      <w:r>
+        <w:rPr>
+          <w:rFonts w:asciiTheme="majorBidi" w:hAnsiTheme="majorBidi" w:cstheme="majorBidi"/>
+          <w:b/>
+          <w:bCs/>
+          <w:i/>
+          <w:iCs/>
+          <w:sz w:val="28"/>
+          <w:szCs w:val="28"/>
+        </w:rPr>
+        <w:t>myimage:newcmd</w:t>
+      </w:r>
+      <w:proofErr w:type="spellEnd"/>
+      <w:proofErr w:type="gramEnd"/>
+    </w:p>
+    <w:p>
+      <w:pPr>
+        <w:spacing w:after="120"/>
+        <w:rPr>
+          <w:rFonts w:asciiTheme="majorBidi" w:hAnsiTheme="majorBidi" w:cstheme="majorBidi"/>
+          <w:b/>
+          <w:bCs/>
+          <w:sz w:val="32"/>
+          <w:szCs w:val="32"/>
+        </w:rPr>
+      </w:pPr>
+      <w:r>
+        <w:rPr>
+          <w:rFonts w:asciiTheme="majorBidi" w:hAnsiTheme="majorBidi" w:cstheme="majorBidi"/>
+          <w:b/>
+          <w:bCs/>
+          <w:i/>
+          <w:iCs/>
+          <w:sz w:val="32"/>
+          <w:szCs w:val="32"/>
+        </w:rPr>
+        <w:t>docker save</w:t>
+      </w:r>
+      <w:r>
+        <w:rPr>
+          <w:rFonts w:asciiTheme="majorBidi" w:hAnsiTheme="majorBidi" w:cstheme="majorBidi"/>
+          <w:b/>
+          <w:bCs/>
+          <w:sz w:val="32"/>
+          <w:szCs w:val="32"/>
+        </w:rPr>
+        <w:t xml:space="preserve"> command:</w:t>
+      </w:r>
+    </w:p>
+    <w:p>
+      <w:pPr>
+        <w:spacing w:after="120"/>
+        <w:rPr>
+          <w:rFonts w:asciiTheme="majorBidi" w:hAnsiTheme="majorBidi" w:cstheme="majorBidi"/>
+          <w:sz w:val="28"/>
+          <w:szCs w:val="28"/>
+        </w:rPr>
+      </w:pPr>
+      <w:r>
+        <w:rPr>
+          <w:rFonts w:asciiTheme="majorBidi" w:hAnsiTheme="majorBidi" w:cstheme="majorBidi"/>
+          <w:sz w:val="28"/>
+          <w:szCs w:val="28"/>
+        </w:rPr>
+        <w:t>docker save exports one or more images into a tar archive file.</w:t>
+      </w:r>
+    </w:p>
+    <w:p>
+      <w:pPr>
+        <w:spacing w:after="60"/>
+        <w:rPr>
+          <w:rFonts w:asciiTheme="majorBidi" w:hAnsiTheme="majorBidi" w:cstheme="majorBidi"/>
+          <w:sz w:val="28"/>
+          <w:szCs w:val="28"/>
+        </w:rPr>
+      </w:pPr>
+      <w:r>
+        <w:rPr>
+          <w:rFonts w:asciiTheme="majorBidi" w:hAnsiTheme="majorBidi" w:cstheme="majorBidi"/>
+          <w:sz w:val="28"/>
+          <w:szCs w:val="28"/>
+        </w:rPr>
+        <w:t>It saves the complete image:</w:t>
+      </w:r>
+    </w:p>
+    <w:p>
+      <w:pPr>
+        <w:pStyle w:val="ListParagraph"/>
+        <w:numPr>
+          <w:ilvl w:val="0"/>
+          <w:numId w:val="89"/>
+        </w:numPr>
+        <w:ind w:left="360"/>
+        <w:rPr>
+          <w:rFonts w:asciiTheme="majorBidi" w:hAnsiTheme="majorBidi" w:cstheme="majorBidi"/>
+          <w:sz w:val="28"/>
+          <w:szCs w:val="28"/>
+        </w:rPr>
+      </w:pPr>
+      <w:r>
+        <w:rPr>
+          <w:rFonts w:asciiTheme="majorBidi" w:hAnsiTheme="majorBidi" w:cstheme="majorBidi"/>
+          <w:sz w:val="28"/>
+          <w:szCs w:val="28"/>
+        </w:rPr>
+        <w:t>all layers</w:t>
+      </w:r>
+    </w:p>
+    <w:p>
+      <w:pPr>
+        <w:pStyle w:val="ListParagraph"/>
+        <w:numPr>
+          <w:ilvl w:val="0"/>
+          <w:numId w:val="89"/>
+        </w:numPr>
+        <w:ind w:left="360"/>
+        <w:rPr>
+          <w:rFonts w:asciiTheme="majorBidi" w:hAnsiTheme="majorBidi" w:cstheme="majorBidi"/>
+          <w:sz w:val="28"/>
+          <w:szCs w:val="28"/>
+        </w:rPr>
+      </w:pPr>
+      <w:r>
+        <w:rPr>
+          <w:rFonts w:asciiTheme="majorBidi" w:hAnsiTheme="majorBidi" w:cstheme="majorBidi"/>
+          <w:sz w:val="28"/>
+          <w:szCs w:val="28"/>
+        </w:rPr>
+        <w:t>metadata</w:t>
+      </w:r>
+    </w:p>
+    <w:p>
+      <w:pPr>
+        <w:pStyle w:val="ListParagraph"/>
+        <w:numPr>
+          <w:ilvl w:val="0"/>
+          <w:numId w:val="89"/>
+        </w:numPr>
+        <w:ind w:left="360"/>
+        <w:rPr>
+          <w:rFonts w:asciiTheme="majorBidi" w:hAnsiTheme="majorBidi" w:cstheme="majorBidi"/>
+          <w:sz w:val="28"/>
+          <w:szCs w:val="28"/>
+        </w:rPr>
+      </w:pPr>
+      <w:r>
+        <w:rPr>
+          <w:rFonts w:asciiTheme="majorBidi" w:hAnsiTheme="majorBidi" w:cstheme="majorBidi"/>
+          <w:sz w:val="28"/>
+          <w:szCs w:val="28"/>
+        </w:rPr>
+        <w:t>tags</w:t>
+      </w:r>
+    </w:p>
+    <w:p>
+      <w:pPr>
+        <w:pStyle w:val="ListParagraph"/>
+        <w:numPr>
+          <w:ilvl w:val="0"/>
+          <w:numId w:val="89"/>
+        </w:numPr>
+        <w:spacing w:after="120"/>
+        <w:ind w:left="360"/>
+        <w:rPr>
+          <w:rFonts w:asciiTheme="majorBidi" w:hAnsiTheme="majorBidi" w:cstheme="majorBidi"/>
+          <w:sz w:val="28"/>
+          <w:szCs w:val="28"/>
+        </w:rPr>
+      </w:pPr>
+      <w:r>
+        <w:rPr>
+          <w:rFonts w:asciiTheme="majorBidi" w:hAnsiTheme="majorBidi" w:cstheme="majorBidi"/>
+          <w:sz w:val="28"/>
+          <w:szCs w:val="28"/>
+        </w:rPr>
+        <w:t>manifest</w:t>
+      </w:r>
+    </w:p>
+    <w:p>
+      <w:pPr>
+        <w:spacing w:after="120"/>
+        <w:rPr>
+          <w:rFonts w:asciiTheme="majorBidi" w:hAnsiTheme="majorBidi" w:cstheme="majorBidi"/>
+          <w:sz w:val="28"/>
+          <w:szCs w:val="28"/>
+        </w:rPr>
+      </w:pPr>
+      <w:r>
+        <w:rPr>
+          <w:rFonts w:asciiTheme="majorBidi" w:hAnsiTheme="majorBidi" w:cstheme="majorBidi"/>
+          <w:sz w:val="28"/>
+          <w:szCs w:val="28"/>
+        </w:rPr>
+        <w:t>Example:</w:t>
+      </w:r>
+    </w:p>
+    <w:p>
+      <w:pPr>
+        <w:rPr>
+          <w:rFonts w:asciiTheme="majorBidi" w:hAnsiTheme="majorBidi" w:cstheme="majorBidi"/>
+          <w:i/>
+          <w:iCs/>
+          <w:sz w:val="28"/>
+          <w:szCs w:val="28"/>
+        </w:rPr>
+      </w:pPr>
+      <w:r>
+        <w:rPr>
+          <w:rFonts w:asciiTheme="majorBidi" w:hAnsiTheme="majorBidi" w:cstheme="majorBidi"/>
+          <w:b/>
+          <w:bCs/>
+          <w:i/>
+          <w:iCs/>
+          <w:sz w:val="28"/>
+          <w:szCs w:val="28"/>
+        </w:rPr>
+        <w:t xml:space="preserve">docker save -o nginx.tar </w:t>
+      </w:r>
+      <w:proofErr w:type="spellStart"/>
+      <w:proofErr w:type="gramStart"/>
+      <w:r>
+        <w:rPr>
+          <w:rFonts w:asciiTheme="majorBidi" w:hAnsiTheme="majorBidi" w:cstheme="majorBidi"/>
+          <w:b/>
+          <w:bCs/>
+          <w:i/>
+          <w:iCs/>
+          <w:sz w:val="28"/>
+          <w:szCs w:val="28"/>
+        </w:rPr>
+        <w:t>nginx:latest</w:t>
+      </w:r>
+      <w:proofErr w:type="spellEnd"/>
+      <w:proofErr w:type="gramEnd"/>
+      <w:r>
+        <w:rPr>
+          <w:rFonts w:asciiTheme="majorBidi" w:hAnsiTheme="majorBidi" w:cstheme="majorBidi"/>
+          <w:i/>
+          <w:iCs/>
+          <w:sz w:val="28"/>
+          <w:szCs w:val="28"/>
+        </w:rPr>
+        <w:t xml:space="preserve"> </w:t>
+      </w:r>
+      <w:r>
+        <w:rPr>
+          <w:rFonts w:asciiTheme="majorBidi" w:hAnsiTheme="majorBidi" w:cstheme="majorBidi"/>
+          <w:sz w:val="28"/>
+          <w:szCs w:val="28"/>
+        </w:rPr>
+        <w:t>→</w:t>
+      </w:r>
+      <w:r>
+        <w:rPr>
+          <w:rFonts w:asciiTheme="majorBidi" w:hAnsiTheme="majorBidi" w:cstheme="majorBidi"/>
+          <w:b/>
+          <w:bCs/>
+          <w:i/>
+          <w:iCs/>
+          <w:sz w:val="28"/>
+          <w:szCs w:val="28"/>
+        </w:rPr>
+        <w:t xml:space="preserve"> </w:t>
+      </w:r>
+      <w:r>
+        <w:rPr>
+          <w:rFonts w:asciiTheme="majorBidi" w:hAnsiTheme="majorBidi" w:cstheme="majorBidi"/>
+          <w:sz w:val="28"/>
+          <w:szCs w:val="28"/>
+        </w:rPr>
+        <w:t>Now you have a file (nginx.tar) that contains the full image structure.</w:t>
+      </w:r>
+    </w:p>
+    <w:p>
+      <w:pPr>
+        <w:rPr>
+          <w:rFonts w:asciiTheme="majorBidi" w:hAnsiTheme="majorBidi" w:cstheme="majorBidi"/>
+          <w:sz w:val="28"/>
+          <w:szCs w:val="28"/>
+        </w:rPr>
+      </w:pPr>
+      <w:r>
+        <w:rPr>
+          <w:rFonts w:asciiTheme="majorBidi" w:hAnsiTheme="majorBidi" w:cstheme="majorBidi"/>
+          <w:sz w:val="28"/>
+          <w:szCs w:val="28"/>
+        </w:rPr>
+        <w:lastRenderedPageBreak/>
+        <w:t>You can also save multiple images:</w:t>
+      </w:r>
+    </w:p>
+    <w:p>
+      <w:pPr>
+        <w:rPr>
+          <w:rFonts w:asciiTheme="majorBidi" w:hAnsiTheme="majorBidi" w:cstheme="majorBidi"/>
+          <w:sz w:val="28"/>
+          <w:szCs w:val="28"/>
+        </w:rPr>
+      </w:pPr>
+      <w:r>
+        <w:rPr>
+          <w:rFonts w:asciiTheme="majorBidi" w:hAnsiTheme="majorBidi" w:cstheme="majorBidi"/>
+          <w:sz w:val="28"/>
+          <w:szCs w:val="28"/>
+        </w:rPr>
+        <w:t xml:space="preserve">docker save -o images.tar nginx </w:t>
+      </w:r>
+      <w:proofErr w:type="spellStart"/>
+      <w:r>
+        <w:rPr>
+          <w:rFonts w:asciiTheme="majorBidi" w:hAnsiTheme="majorBidi" w:cstheme="majorBidi"/>
+          <w:sz w:val="28"/>
+          <w:szCs w:val="28"/>
+        </w:rPr>
+        <w:t>redis</w:t>
+      </w:r>
+      <w:proofErr w:type="spellEnd"/>
+      <w:r>
+        <w:rPr>
+          <w:rFonts w:asciiTheme="majorBidi" w:hAnsiTheme="majorBidi" w:cstheme="majorBidi"/>
+          <w:sz w:val="28"/>
+          <w:szCs w:val="28"/>
+        </w:rPr>
+        <w:t xml:space="preserve"> alpine</w:t>
+      </w:r>
+    </w:p>
+    <w:p>
+      <w:pPr>
+        <w:rPr>
+          <w:rFonts w:asciiTheme="majorBidi" w:hAnsiTheme="majorBidi" w:cstheme="majorBidi"/>
+          <w:sz w:val="28"/>
+          <w:szCs w:val="28"/>
+          <w:u w:val="single"/>
+        </w:rPr>
+      </w:pPr>
+      <w:r>
+        <w:rPr>
+          <w:rFonts w:asciiTheme="majorBidi" w:hAnsiTheme="majorBidi" w:cstheme="majorBidi"/>
+          <w:sz w:val="28"/>
+          <w:szCs w:val="28"/>
+          <w:u w:val="single"/>
+        </w:rPr>
+        <w:t>How it works</w:t>
+      </w:r>
+      <w:r>
+        <w:rPr>
+          <w:rFonts w:asciiTheme="majorBidi" w:hAnsiTheme="majorBidi" w:cstheme="majorBidi"/>
+          <w:sz w:val="28"/>
+          <w:szCs w:val="28"/>
+          <w:u w:val="single"/>
+        </w:rPr>
+        <w:t>:</w:t>
+      </w:r>
+    </w:p>
+    <w:p>
+      <w:pPr>
+        <w:rPr>
+          <w:rFonts w:asciiTheme="majorBidi" w:hAnsiTheme="majorBidi" w:cstheme="majorBidi"/>
+          <w:sz w:val="28"/>
+          <w:szCs w:val="28"/>
+        </w:rPr>
+      </w:pPr>
+      <w:r>
+        <w:rPr>
+          <w:rFonts w:asciiTheme="majorBidi" w:hAnsiTheme="majorBidi" w:cstheme="majorBidi"/>
+          <w:sz w:val="28"/>
+          <w:szCs w:val="28"/>
+        </w:rPr>
+        <w:t>Docker collects the image layers from its local storage (/var/lib/docker) and packs them into a tar archive along with manifest and repository metadata.</w:t>
+      </w:r>
+    </w:p>
+    <w:p>
+      <w:pPr>
+        <w:rPr>
+          <w:rFonts w:asciiTheme="majorBidi" w:hAnsiTheme="majorBidi" w:cstheme="majorBidi"/>
+          <w:sz w:val="28"/>
+          <w:szCs w:val="28"/>
+        </w:rPr>
+      </w:pPr>
+      <w:r>
+        <w:rPr>
+          <w:rFonts w:asciiTheme="majorBidi" w:hAnsiTheme="majorBidi" w:cstheme="majorBidi"/>
+          <w:sz w:val="28"/>
+          <w:szCs w:val="28"/>
+        </w:rPr>
+        <w:t>This is image-level export</w:t>
+      </w:r>
+      <w:r>
+        <w:rPr>
+          <w:rFonts w:asciiTheme="majorBidi" w:hAnsiTheme="majorBidi" w:cstheme="majorBidi"/>
+          <w:sz w:val="28"/>
+          <w:szCs w:val="28"/>
+        </w:rPr>
+        <w:t>,</w:t>
+      </w:r>
+      <w:r>
+        <w:rPr>
+          <w:rFonts w:asciiTheme="majorBidi" w:hAnsiTheme="majorBidi" w:cstheme="majorBidi"/>
+          <w:sz w:val="28"/>
+          <w:szCs w:val="28"/>
+        </w:rPr>
+        <w:t xml:space="preserve"> not container filesystem export.</w:t>
+      </w:r>
+    </w:p>
+    <w:p>
+      <w:pPr>
+        <w:rPr>
+          <w:rFonts w:asciiTheme="majorBidi" w:hAnsiTheme="majorBidi" w:cstheme="majorBidi"/>
+          <w:b/>
+          <w:bCs/>
+          <w:sz w:val="32"/>
+          <w:szCs w:val="32"/>
+        </w:rPr>
+      </w:pPr>
+      <w:r>
+        <w:rPr>
+          <w:rFonts w:asciiTheme="majorBidi" w:hAnsiTheme="majorBidi" w:cstheme="majorBidi"/>
+          <w:b/>
+          <w:bCs/>
+          <w:i/>
+          <w:iCs/>
+          <w:sz w:val="32"/>
+          <w:szCs w:val="32"/>
+        </w:rPr>
+        <w:t>docker load</w:t>
+      </w:r>
+      <w:r>
+        <w:rPr>
+          <w:rFonts w:asciiTheme="majorBidi" w:hAnsiTheme="majorBidi" w:cstheme="majorBidi"/>
+          <w:b/>
+          <w:bCs/>
+          <w:sz w:val="32"/>
+          <w:szCs w:val="32"/>
+        </w:rPr>
+        <w:t xml:space="preserve"> command:</w:t>
+      </w:r>
+    </w:p>
+    <w:p>
+      <w:pPr>
+        <w:rPr>
+          <w:rFonts w:asciiTheme="majorBidi" w:hAnsiTheme="majorBidi" w:cstheme="majorBidi"/>
+          <w:sz w:val="28"/>
+          <w:szCs w:val="28"/>
+        </w:rPr>
+      </w:pPr>
+      <w:r>
+        <w:rPr>
+          <w:rFonts w:asciiTheme="majorBidi" w:hAnsiTheme="majorBidi" w:cstheme="majorBidi"/>
+          <w:sz w:val="28"/>
+          <w:szCs w:val="28"/>
+        </w:rPr>
+        <w:t xml:space="preserve">docker load imports an image from a tar archive created by </w:t>
+      </w:r>
+      <w:r>
+        <w:rPr>
+          <w:rFonts w:asciiTheme="majorBidi" w:hAnsiTheme="majorBidi" w:cstheme="majorBidi"/>
+          <w:b/>
+          <w:bCs/>
+          <w:i/>
+          <w:iCs/>
+          <w:sz w:val="28"/>
+          <w:szCs w:val="28"/>
+        </w:rPr>
+        <w:t>docker save</w:t>
+      </w:r>
+      <w:r>
+        <w:rPr>
+          <w:rFonts w:asciiTheme="majorBidi" w:hAnsiTheme="majorBidi" w:cstheme="majorBidi"/>
+          <w:sz w:val="28"/>
+          <w:szCs w:val="28"/>
+        </w:rPr>
+        <w:t>.</w:t>
+      </w:r>
+    </w:p>
+    <w:p>
+      <w:pPr>
+        <w:rPr>
+          <w:rFonts w:asciiTheme="majorBidi" w:hAnsiTheme="majorBidi" w:cstheme="majorBidi"/>
+          <w:sz w:val="28"/>
+          <w:szCs w:val="28"/>
+        </w:rPr>
+      </w:pPr>
+      <w:r>
+        <w:rPr>
+          <w:rFonts w:asciiTheme="majorBidi" w:hAnsiTheme="majorBidi" w:cstheme="majorBidi"/>
+          <w:sz w:val="28"/>
+          <w:szCs w:val="28"/>
+        </w:rPr>
+        <w:t>Example:</w:t>
+      </w:r>
+    </w:p>
+    <w:p>
+      <w:pPr>
+        <w:rPr>
+          <w:rFonts w:asciiTheme="majorBidi" w:hAnsiTheme="majorBidi" w:cstheme="majorBidi"/>
+          <w:b/>
+          <w:bCs/>
+          <w:i/>
+          <w:iCs/>
+          <w:sz w:val="28"/>
+          <w:szCs w:val="28"/>
+        </w:rPr>
+      </w:pPr>
+      <w:r>
+        <w:rPr>
+          <w:rFonts w:asciiTheme="majorBidi" w:hAnsiTheme="majorBidi" w:cstheme="majorBidi"/>
+          <w:b/>
+          <w:bCs/>
+          <w:i/>
+          <w:iCs/>
+          <w:sz w:val="28"/>
+          <w:szCs w:val="28"/>
+        </w:rPr>
+        <w:t>docker load -</w:t>
+      </w:r>
+      <w:proofErr w:type="spellStart"/>
+      <w:r>
+        <w:rPr>
+          <w:rFonts w:asciiTheme="majorBidi" w:hAnsiTheme="majorBidi" w:cstheme="majorBidi"/>
+          <w:b/>
+          <w:bCs/>
+          <w:i/>
+          <w:iCs/>
+          <w:sz w:val="28"/>
+          <w:szCs w:val="28"/>
+        </w:rPr>
+        <w:t>i</w:t>
+      </w:r>
+      <w:proofErr w:type="spellEnd"/>
+      <w:r>
+        <w:rPr>
+          <w:rFonts w:asciiTheme="majorBidi" w:hAnsiTheme="majorBidi" w:cstheme="majorBidi"/>
+          <w:b/>
+          <w:bCs/>
+          <w:i/>
+          <w:iCs/>
+          <w:sz w:val="28"/>
+          <w:szCs w:val="28"/>
+        </w:rPr>
+        <w:t xml:space="preserve"> nginx.tar</w:t>
+      </w:r>
+      <w:r>
+        <w:rPr>
+          <w:rFonts w:asciiTheme="majorBidi" w:hAnsiTheme="majorBidi" w:cstheme="majorBidi"/>
+          <w:i/>
+          <w:iCs/>
+          <w:sz w:val="28"/>
+          <w:szCs w:val="28"/>
+        </w:rPr>
+        <w:t xml:space="preserve"> </w:t>
+      </w:r>
+      <w:r>
+        <w:rPr>
+          <w:rFonts w:asciiTheme="majorBidi" w:hAnsiTheme="majorBidi" w:cstheme="majorBidi"/>
+          <w:sz w:val="28"/>
+          <w:szCs w:val="28"/>
+        </w:rPr>
+        <w:t>→</w:t>
+      </w:r>
+      <w:r>
+        <w:rPr>
+          <w:rFonts w:asciiTheme="majorBidi" w:hAnsiTheme="majorBidi" w:cstheme="majorBidi"/>
+          <w:b/>
+          <w:bCs/>
+          <w:i/>
+          <w:iCs/>
+          <w:sz w:val="28"/>
+          <w:szCs w:val="28"/>
+        </w:rPr>
+        <w:t xml:space="preserve"> </w:t>
+      </w:r>
+      <w:r>
+        <w:rPr>
+          <w:rFonts w:asciiTheme="majorBidi" w:hAnsiTheme="majorBidi" w:cstheme="majorBidi"/>
+          <w:sz w:val="28"/>
+          <w:szCs w:val="28"/>
+        </w:rPr>
+        <w:t>After this, the image appears in docker images with its original tags.</w:t>
+      </w:r>
+    </w:p>
+    <w:p>
+      <w:pPr>
+        <w:rPr>
+          <w:rFonts w:asciiTheme="majorBidi" w:hAnsiTheme="majorBidi" w:cstheme="majorBidi"/>
+          <w:b/>
+          <w:bCs/>
+          <w:i/>
+          <w:iCs/>
+          <w:sz w:val="28"/>
+          <w:szCs w:val="28"/>
+        </w:rPr>
+      </w:pPr>
+      <w:r>
+        <w:rPr>
+          <w:rFonts w:asciiTheme="majorBidi" w:hAnsiTheme="majorBidi" w:cstheme="majorBidi"/>
+          <w:sz w:val="28"/>
+          <w:szCs w:val="28"/>
+        </w:rPr>
+        <w:t xml:space="preserve">Without </w:t>
+      </w:r>
+      <w:r>
+        <w:rPr>
+          <w:rFonts w:asciiTheme="majorBidi" w:hAnsiTheme="majorBidi" w:cstheme="majorBidi"/>
+          <w:b/>
+          <w:bCs/>
+          <w:i/>
+          <w:iCs/>
+          <w:sz w:val="28"/>
+          <w:szCs w:val="28"/>
+        </w:rPr>
+        <w:t>-</w:t>
+      </w:r>
+      <w:proofErr w:type="spellStart"/>
+      <w:r>
+        <w:rPr>
+          <w:rFonts w:asciiTheme="majorBidi" w:hAnsiTheme="majorBidi" w:cstheme="majorBidi"/>
+          <w:b/>
+          <w:bCs/>
+          <w:i/>
+          <w:iCs/>
+          <w:sz w:val="28"/>
+          <w:szCs w:val="28"/>
+        </w:rPr>
+        <w:t>i</w:t>
+      </w:r>
+      <w:proofErr w:type="spellEnd"/>
+      <w:r>
+        <w:rPr>
+          <w:rFonts w:asciiTheme="majorBidi" w:hAnsiTheme="majorBidi" w:cstheme="majorBidi"/>
+          <w:sz w:val="28"/>
+          <w:szCs w:val="28"/>
+        </w:rPr>
+        <w:t>, it reads from stdin</w:t>
+      </w:r>
+      <w:r>
+        <w:rPr>
+          <w:rFonts w:asciiTheme="majorBidi" w:hAnsiTheme="majorBidi" w:cstheme="majorBidi"/>
+          <w:i/>
+          <w:iCs/>
+          <w:sz w:val="28"/>
+          <w:szCs w:val="28"/>
+        </w:rPr>
+        <w:t xml:space="preserve"> </w:t>
+      </w:r>
+      <w:r>
+        <w:rPr>
+          <w:rFonts w:asciiTheme="majorBidi" w:hAnsiTheme="majorBidi" w:cstheme="majorBidi"/>
+          <w:sz w:val="28"/>
+          <w:szCs w:val="28"/>
+        </w:rPr>
+        <w:t>→</w:t>
+      </w:r>
+      <w:r>
+        <w:rPr>
+          <w:rFonts w:asciiTheme="majorBidi" w:hAnsiTheme="majorBidi" w:cstheme="majorBidi"/>
+          <w:sz w:val="28"/>
+          <w:szCs w:val="28"/>
+        </w:rPr>
+        <w:t xml:space="preserve"> </w:t>
+      </w:r>
+      <w:r>
+        <w:rPr>
+          <w:rFonts w:asciiTheme="majorBidi" w:hAnsiTheme="majorBidi" w:cstheme="majorBidi"/>
+          <w:b/>
+          <w:bCs/>
+          <w:i/>
+          <w:iCs/>
+          <w:sz w:val="28"/>
+          <w:szCs w:val="28"/>
+        </w:rPr>
+        <w:t>cat nginx.tar | docker load</w:t>
+      </w:r>
+    </w:p>
+    <w:p>
+      <w:pPr>
+        <w:rPr>
+          <w:rFonts w:asciiTheme="majorBidi" w:hAnsiTheme="majorBidi" w:cstheme="majorBidi"/>
+          <w:sz w:val="28"/>
+          <w:szCs w:val="28"/>
+        </w:rPr>
+      </w:pPr>
+      <w:r>
+        <w:rPr>
+          <w:rFonts w:asciiTheme="majorBidi" w:hAnsiTheme="majorBidi" w:cstheme="majorBidi"/>
+          <w:b/>
+          <w:bCs/>
+          <w:i/>
+          <w:iCs/>
+          <w:sz w:val="28"/>
+          <w:szCs w:val="28"/>
+        </w:rPr>
+        <w:t>save/load</w:t>
+      </w:r>
+      <w:r>
+        <w:rPr>
+          <w:rFonts w:asciiTheme="majorBidi" w:hAnsiTheme="majorBidi" w:cstheme="majorBidi"/>
+          <w:sz w:val="28"/>
+          <w:szCs w:val="28"/>
+        </w:rPr>
+        <w:t xml:space="preserve"> operate at the image level.</w:t>
+      </w:r>
+      <w:r>
+        <w:rPr>
+          <w:rFonts w:asciiTheme="majorBidi" w:hAnsiTheme="majorBidi" w:cstheme="majorBidi"/>
+          <w:sz w:val="28"/>
+          <w:szCs w:val="28"/>
+        </w:rPr>
+        <w:t xml:space="preserve"> </w:t>
+      </w:r>
+      <w:r>
+        <w:rPr>
+          <w:rFonts w:asciiTheme="majorBidi" w:hAnsiTheme="majorBidi" w:cstheme="majorBidi"/>
+          <w:sz w:val="28"/>
+          <w:szCs w:val="28"/>
+        </w:rPr>
+        <w:t>They preserve:</w:t>
+      </w:r>
+    </w:p>
+    <w:p>
+      <w:pPr>
+        <w:pStyle w:val="ListParagraph"/>
+        <w:numPr>
+          <w:ilvl w:val="0"/>
+          <w:numId w:val="90"/>
+        </w:numPr>
+        <w:ind w:left="360"/>
+        <w:rPr>
+          <w:rFonts w:asciiTheme="majorBidi" w:hAnsiTheme="majorBidi" w:cstheme="majorBidi"/>
+          <w:sz w:val="28"/>
+          <w:szCs w:val="28"/>
+        </w:rPr>
+      </w:pPr>
+      <w:r>
+        <w:rPr>
+          <w:rFonts w:asciiTheme="majorBidi" w:hAnsiTheme="majorBidi" w:cstheme="majorBidi"/>
+          <w:sz w:val="28"/>
+          <w:szCs w:val="28"/>
+        </w:rPr>
+        <w:t>Image layers</w:t>
+      </w:r>
+    </w:p>
+    <w:p>
+      <w:pPr>
+        <w:pStyle w:val="ListParagraph"/>
+        <w:numPr>
+          <w:ilvl w:val="0"/>
+          <w:numId w:val="90"/>
+        </w:numPr>
+        <w:ind w:left="360"/>
+        <w:rPr>
+          <w:rFonts w:asciiTheme="majorBidi" w:hAnsiTheme="majorBidi" w:cstheme="majorBidi"/>
+          <w:sz w:val="28"/>
+          <w:szCs w:val="28"/>
+        </w:rPr>
+      </w:pPr>
+      <w:r>
+        <w:rPr>
+          <w:rFonts w:asciiTheme="majorBidi" w:hAnsiTheme="majorBidi" w:cstheme="majorBidi"/>
+          <w:sz w:val="28"/>
+          <w:szCs w:val="28"/>
+        </w:rPr>
+        <w:t>Tags</w:t>
+      </w:r>
+    </w:p>
+    <w:p>
+      <w:pPr>
+        <w:pStyle w:val="ListParagraph"/>
+        <w:numPr>
+          <w:ilvl w:val="0"/>
+          <w:numId w:val="90"/>
+        </w:numPr>
+        <w:ind w:left="360"/>
+        <w:rPr>
+          <w:rFonts w:asciiTheme="majorBidi" w:hAnsiTheme="majorBidi" w:cstheme="majorBidi"/>
+          <w:sz w:val="28"/>
+          <w:szCs w:val="28"/>
+        </w:rPr>
+      </w:pPr>
+      <w:r>
+        <w:rPr>
+          <w:rFonts w:asciiTheme="majorBidi" w:hAnsiTheme="majorBidi" w:cstheme="majorBidi"/>
+          <w:sz w:val="28"/>
+          <w:szCs w:val="28"/>
+        </w:rPr>
+        <w:t>History</w:t>
+      </w:r>
+    </w:p>
+    <w:p>
+      <w:pPr>
+        <w:pStyle w:val="ListParagraph"/>
+        <w:numPr>
+          <w:ilvl w:val="0"/>
+          <w:numId w:val="90"/>
+        </w:numPr>
+        <w:ind w:left="360"/>
+        <w:rPr>
+          <w:rFonts w:asciiTheme="majorBidi" w:hAnsiTheme="majorBidi" w:cstheme="majorBidi"/>
+          <w:sz w:val="28"/>
+          <w:szCs w:val="28"/>
+        </w:rPr>
+      </w:pPr>
+      <w:r>
+        <w:rPr>
+          <w:rFonts w:asciiTheme="majorBidi" w:hAnsiTheme="majorBidi" w:cstheme="majorBidi"/>
+          <w:sz w:val="28"/>
+          <w:szCs w:val="28"/>
+        </w:rPr>
+        <w:t>Architecture</w:t>
+      </w:r>
+    </w:p>
+    <w:p>
+      <w:pPr>
+        <w:rPr>
+          <w:rFonts w:asciiTheme="majorBidi" w:hAnsiTheme="majorBidi" w:cstheme="majorBidi"/>
+          <w:b/>
+          <w:bCs/>
+          <w:sz w:val="32"/>
+          <w:szCs w:val="32"/>
+        </w:rPr>
+      </w:pPr>
+      <w:r>
+        <w:rPr>
+          <w:rFonts w:asciiTheme="majorBidi" w:hAnsiTheme="majorBidi" w:cstheme="majorBidi"/>
+          <w:b/>
+          <w:bCs/>
+          <w:i/>
+          <w:iCs/>
+          <w:sz w:val="32"/>
+          <w:szCs w:val="32"/>
+        </w:rPr>
+        <w:t>docker export</w:t>
+      </w:r>
+      <w:r>
+        <w:rPr>
+          <w:rFonts w:asciiTheme="majorBidi" w:hAnsiTheme="majorBidi" w:cstheme="majorBidi"/>
+          <w:b/>
+          <w:bCs/>
+          <w:sz w:val="32"/>
+          <w:szCs w:val="32"/>
+        </w:rPr>
+        <w:t xml:space="preserve"> command:</w:t>
+      </w:r>
+    </w:p>
+    <w:p>
+      <w:pPr>
+        <w:rPr>
+          <w:rFonts w:asciiTheme="majorBidi" w:hAnsiTheme="majorBidi" w:cstheme="majorBidi"/>
+          <w:sz w:val="28"/>
+          <w:szCs w:val="28"/>
+        </w:rPr>
+      </w:pPr>
+      <w:r>
+        <w:rPr>
+          <w:rFonts w:asciiTheme="majorBidi" w:hAnsiTheme="majorBidi" w:cstheme="majorBidi"/>
+          <w:b/>
+          <w:bCs/>
+          <w:i/>
+          <w:iCs/>
+          <w:sz w:val="28"/>
+          <w:szCs w:val="28"/>
+        </w:rPr>
+        <w:t>docker export</w:t>
+      </w:r>
+      <w:r>
+        <w:rPr>
+          <w:rFonts w:asciiTheme="majorBidi" w:hAnsiTheme="majorBidi" w:cstheme="majorBidi"/>
+          <w:sz w:val="28"/>
+          <w:szCs w:val="28"/>
+        </w:rPr>
+        <w:t xml:space="preserve"> creates a tar archive of a container’s filesystem.</w:t>
+      </w:r>
+      <w:r>
+        <w:rPr>
+          <w:rFonts w:asciiTheme="majorBidi" w:hAnsiTheme="majorBidi" w:cstheme="majorBidi"/>
+          <w:sz w:val="28"/>
+          <w:szCs w:val="28"/>
+        </w:rPr>
+        <w:t xml:space="preserve"> </w:t>
+      </w:r>
+      <w:r>
+        <w:rPr>
+          <w:rFonts w:asciiTheme="majorBidi" w:hAnsiTheme="majorBidi" w:cstheme="majorBidi"/>
+          <w:sz w:val="28"/>
+          <w:szCs w:val="28"/>
+        </w:rPr>
+        <w:t>Example:</w:t>
+      </w:r>
+    </w:p>
+    <w:p>
+      <w:pPr>
+        <w:rPr>
+          <w:rFonts w:asciiTheme="majorBidi" w:hAnsiTheme="majorBidi" w:cstheme="majorBidi"/>
+          <w:b/>
+          <w:bCs/>
+          <w:i/>
+          <w:iCs/>
+          <w:sz w:val="28"/>
+          <w:szCs w:val="28"/>
+        </w:rPr>
+      </w:pPr>
+      <w:r>
+        <w:rPr>
+          <w:rFonts w:asciiTheme="majorBidi" w:hAnsiTheme="majorBidi" w:cstheme="majorBidi"/>
+          <w:b/>
+          <w:bCs/>
+          <w:i/>
+          <w:iCs/>
+          <w:sz w:val="28"/>
+          <w:szCs w:val="28"/>
+        </w:rPr>
+        <w:t xml:space="preserve">docker export </w:t>
+      </w:r>
+      <w:proofErr w:type="spellStart"/>
+      <w:r>
+        <w:rPr>
+          <w:rFonts w:asciiTheme="majorBidi" w:hAnsiTheme="majorBidi" w:cstheme="majorBidi"/>
+          <w:b/>
+          <w:bCs/>
+          <w:i/>
+          <w:iCs/>
+          <w:sz w:val="28"/>
+          <w:szCs w:val="28"/>
+        </w:rPr>
+        <w:t>mycontainer</w:t>
+      </w:r>
+      <w:proofErr w:type="spellEnd"/>
+      <w:r>
+        <w:rPr>
+          <w:rFonts w:asciiTheme="majorBidi" w:hAnsiTheme="majorBidi" w:cstheme="majorBidi"/>
+          <w:b/>
+          <w:bCs/>
+          <w:i/>
+          <w:iCs/>
+          <w:sz w:val="28"/>
+          <w:szCs w:val="28"/>
+        </w:rPr>
+        <w:t xml:space="preserve"> -o container.tar</w:t>
+      </w:r>
+      <w:r>
+        <w:rPr>
+          <w:rFonts w:asciiTheme="majorBidi" w:hAnsiTheme="majorBidi" w:cstheme="majorBidi"/>
+          <w:b/>
+          <w:bCs/>
+          <w:i/>
+          <w:iCs/>
+          <w:sz w:val="28"/>
+          <w:szCs w:val="28"/>
+        </w:rPr>
+        <w:t xml:space="preserve"> </w:t>
+      </w:r>
+      <w:r>
+        <w:rPr>
+          <w:rFonts w:asciiTheme="majorBidi" w:hAnsiTheme="majorBidi" w:cstheme="majorBidi"/>
+          <w:sz w:val="28"/>
+          <w:szCs w:val="28"/>
+        </w:rPr>
+        <w:t>→</w:t>
+      </w:r>
+      <w:r>
+        <w:rPr>
+          <w:rFonts w:asciiTheme="majorBidi" w:hAnsiTheme="majorBidi" w:cstheme="majorBidi"/>
+          <w:sz w:val="28"/>
+          <w:szCs w:val="28"/>
+        </w:rPr>
+        <w:t xml:space="preserve"> </w:t>
+      </w:r>
+      <w:proofErr w:type="gramStart"/>
+      <w:r>
+        <w:rPr>
+          <w:rFonts w:asciiTheme="majorBidi" w:hAnsiTheme="majorBidi" w:cstheme="majorBidi"/>
+          <w:sz w:val="28"/>
+          <w:szCs w:val="28"/>
+        </w:rPr>
+        <w:t>This exports</w:t>
+      </w:r>
+      <w:proofErr w:type="gramEnd"/>
+      <w:r>
+        <w:rPr>
+          <w:rFonts w:asciiTheme="majorBidi" w:hAnsiTheme="majorBidi" w:cstheme="majorBidi"/>
+          <w:sz w:val="28"/>
+          <w:szCs w:val="28"/>
+        </w:rPr>
+        <w:t xml:space="preserve"> the full root filesystem of the container as it exists right now.</w:t>
+      </w:r>
+    </w:p>
+    <w:p>
+      <w:pPr>
+        <w:rPr>
+          <w:rFonts w:asciiTheme="majorBidi" w:hAnsiTheme="majorBidi" w:cstheme="majorBidi"/>
+          <w:sz w:val="28"/>
+          <w:szCs w:val="28"/>
+        </w:rPr>
+      </w:pPr>
+      <w:r>
+        <w:rPr>
+          <w:rFonts w:asciiTheme="majorBidi" w:hAnsiTheme="majorBidi" w:cstheme="majorBidi"/>
+          <w:sz w:val="28"/>
+          <w:szCs w:val="28"/>
+        </w:rPr>
+        <w:t>It does not include:</w:t>
+      </w:r>
+    </w:p>
+    <w:p>
+      <w:pPr>
+        <w:pStyle w:val="ListParagraph"/>
+        <w:numPr>
+          <w:ilvl w:val="0"/>
+          <w:numId w:val="91"/>
+        </w:numPr>
+        <w:ind w:left="360"/>
+        <w:rPr>
+          <w:rFonts w:asciiTheme="majorBidi" w:hAnsiTheme="majorBidi" w:cstheme="majorBidi"/>
+          <w:sz w:val="28"/>
+          <w:szCs w:val="28"/>
+        </w:rPr>
+      </w:pPr>
+      <w:r>
+        <w:rPr>
+          <w:rFonts w:asciiTheme="majorBidi" w:hAnsiTheme="majorBidi" w:cstheme="majorBidi"/>
+          <w:sz w:val="28"/>
+          <w:szCs w:val="28"/>
+        </w:rPr>
+        <w:t>Image history</w:t>
+      </w:r>
+    </w:p>
+    <w:p>
+      <w:pPr>
+        <w:pStyle w:val="ListParagraph"/>
+        <w:numPr>
+          <w:ilvl w:val="0"/>
+          <w:numId w:val="91"/>
+        </w:numPr>
+        <w:ind w:left="360"/>
+        <w:rPr>
+          <w:rFonts w:asciiTheme="majorBidi" w:hAnsiTheme="majorBidi" w:cstheme="majorBidi"/>
+          <w:sz w:val="28"/>
+          <w:szCs w:val="28"/>
+        </w:rPr>
+      </w:pPr>
+      <w:r>
+        <w:rPr>
+          <w:rFonts w:asciiTheme="majorBidi" w:hAnsiTheme="majorBidi" w:cstheme="majorBidi"/>
+          <w:sz w:val="28"/>
+          <w:szCs w:val="28"/>
+        </w:rPr>
+        <w:t>Metadata</w:t>
+      </w:r>
+    </w:p>
+    <w:p>
+      <w:pPr>
+        <w:pStyle w:val="ListParagraph"/>
+        <w:numPr>
+          <w:ilvl w:val="0"/>
+          <w:numId w:val="91"/>
+        </w:numPr>
+        <w:ind w:left="360"/>
+        <w:rPr>
+          <w:rFonts w:asciiTheme="majorBidi" w:hAnsiTheme="majorBidi" w:cstheme="majorBidi"/>
+          <w:sz w:val="28"/>
+          <w:szCs w:val="28"/>
+        </w:rPr>
+      </w:pPr>
+      <w:r>
+        <w:rPr>
+          <w:rFonts w:asciiTheme="majorBidi" w:hAnsiTheme="majorBidi" w:cstheme="majorBidi"/>
+          <w:sz w:val="28"/>
+          <w:szCs w:val="28"/>
+        </w:rPr>
+        <w:t>Layers</w:t>
+      </w:r>
+    </w:p>
+    <w:p>
+      <w:pPr>
+        <w:pStyle w:val="ListParagraph"/>
+        <w:numPr>
+          <w:ilvl w:val="0"/>
+          <w:numId w:val="91"/>
+        </w:numPr>
+        <w:ind w:left="360"/>
+        <w:rPr>
+          <w:rFonts w:asciiTheme="majorBidi" w:hAnsiTheme="majorBidi" w:cstheme="majorBidi"/>
+          <w:sz w:val="28"/>
+          <w:szCs w:val="28"/>
+        </w:rPr>
+      </w:pPr>
+      <w:r>
+        <w:rPr>
+          <w:rFonts w:asciiTheme="majorBidi" w:hAnsiTheme="majorBidi" w:cstheme="majorBidi"/>
+          <w:sz w:val="28"/>
+          <w:szCs w:val="28"/>
+        </w:rPr>
+        <w:t>Environment variables</w:t>
+      </w:r>
+    </w:p>
+    <w:p>
+      <w:pPr>
+        <w:pStyle w:val="ListParagraph"/>
+        <w:numPr>
+          <w:ilvl w:val="0"/>
+          <w:numId w:val="91"/>
+        </w:numPr>
+        <w:ind w:left="360"/>
+        <w:rPr>
+          <w:rFonts w:asciiTheme="majorBidi" w:hAnsiTheme="majorBidi" w:cstheme="majorBidi"/>
+          <w:sz w:val="28"/>
+          <w:szCs w:val="28"/>
+        </w:rPr>
+      </w:pPr>
+      <w:r>
+        <w:rPr>
+          <w:rFonts w:asciiTheme="majorBidi" w:hAnsiTheme="majorBidi" w:cstheme="majorBidi"/>
+          <w:sz w:val="28"/>
+          <w:szCs w:val="28"/>
+        </w:rPr>
+        <w:t>Default CMD / ENTRYPOINT</w:t>
+      </w:r>
+    </w:p>
+    <w:p>
+      <w:pPr>
+        <w:pStyle w:val="ListParagraph"/>
+        <w:numPr>
+          <w:ilvl w:val="0"/>
+          <w:numId w:val="91"/>
+        </w:numPr>
+        <w:ind w:left="360"/>
+        <w:rPr>
+          <w:rFonts w:asciiTheme="majorBidi" w:hAnsiTheme="majorBidi" w:cstheme="majorBidi"/>
+          <w:sz w:val="28"/>
+          <w:szCs w:val="28"/>
+        </w:rPr>
+      </w:pPr>
+      <w:r>
+        <w:rPr>
+          <w:rFonts w:asciiTheme="majorBidi" w:hAnsiTheme="majorBidi" w:cstheme="majorBidi"/>
+          <w:sz w:val="28"/>
+          <w:szCs w:val="28"/>
+        </w:rPr>
+        <w:t>Tags</w:t>
+      </w:r>
+    </w:p>
+    <w:p>
+      <w:pPr>
+        <w:rPr>
+          <w:rFonts w:asciiTheme="majorBidi" w:hAnsiTheme="majorBidi" w:cstheme="majorBidi"/>
+          <w:sz w:val="28"/>
+          <w:szCs w:val="28"/>
+        </w:rPr>
+      </w:pPr>
+      <w:r>
+        <w:rPr>
+          <w:rFonts w:asciiTheme="majorBidi" w:hAnsiTheme="majorBidi" w:cstheme="majorBidi"/>
+          <w:sz w:val="28"/>
+          <w:szCs w:val="28"/>
+        </w:rPr>
+        <w:t>It is just a flattened filesystem snapshot.</w:t>
+      </w:r>
+    </w:p>
+    <w:p>
+      <w:pPr>
+        <w:rPr>
+          <w:rFonts w:asciiTheme="majorBidi" w:hAnsiTheme="majorBidi" w:cstheme="majorBidi"/>
+          <w:sz w:val="28"/>
+          <w:szCs w:val="28"/>
+          <w:u w:val="single"/>
+        </w:rPr>
+      </w:pPr>
+      <w:r>
+        <w:rPr>
+          <w:rFonts w:asciiTheme="majorBidi" w:hAnsiTheme="majorBidi" w:cstheme="majorBidi"/>
+          <w:sz w:val="28"/>
+          <w:szCs w:val="28"/>
+          <w:u w:val="single"/>
+        </w:rPr>
+        <w:t>How it works</w:t>
+      </w:r>
+      <w:r>
+        <w:rPr>
+          <w:rFonts w:asciiTheme="majorBidi" w:hAnsiTheme="majorBidi" w:cstheme="majorBidi"/>
+          <w:sz w:val="28"/>
+          <w:szCs w:val="28"/>
+          <w:u w:val="single"/>
+        </w:rPr>
+        <w:t>:</w:t>
+      </w:r>
+    </w:p>
+    <w:p>
+      <w:pPr>
+        <w:rPr>
+          <w:rFonts w:asciiTheme="majorBidi" w:hAnsiTheme="majorBidi" w:cstheme="majorBidi"/>
+          <w:sz w:val="28"/>
+          <w:szCs w:val="28"/>
+        </w:rPr>
+      </w:pPr>
+      <w:r>
+        <w:rPr>
+          <w:rFonts w:asciiTheme="majorBidi" w:hAnsiTheme="majorBidi" w:cstheme="majorBidi"/>
+          <w:sz w:val="28"/>
+          <w:szCs w:val="28"/>
+        </w:rPr>
+        <w:lastRenderedPageBreak/>
+        <w:t>Docker takes the container’s merged filesystem (base image layers + writable layer) and flattens it into a single tar archive.</w:t>
+      </w:r>
+      <w:r>
+        <w:rPr>
+          <w:rFonts w:asciiTheme="majorBidi" w:hAnsiTheme="majorBidi" w:cstheme="majorBidi"/>
+          <w:sz w:val="28"/>
+          <w:szCs w:val="28"/>
+        </w:rPr>
+        <w:t xml:space="preserve"> </w:t>
+      </w:r>
+      <w:r>
+        <w:rPr>
+          <w:rFonts w:asciiTheme="majorBidi" w:hAnsiTheme="majorBidi" w:cstheme="majorBidi"/>
+          <w:sz w:val="28"/>
+          <w:szCs w:val="28"/>
+        </w:rPr>
+        <w:t>All layering is lost. It becomes one flat root filesystem.</w:t>
+      </w:r>
+    </w:p>
+    <w:p>
+      <w:pPr>
+        <w:rPr>
+          <w:rFonts w:asciiTheme="majorBidi" w:hAnsiTheme="majorBidi" w:cstheme="majorBidi"/>
+          <w:b/>
+          <w:bCs/>
+          <w:sz w:val="32"/>
+          <w:szCs w:val="32"/>
+        </w:rPr>
+      </w:pPr>
+      <w:r>
+        <w:rPr>
+          <w:rFonts w:asciiTheme="majorBidi" w:hAnsiTheme="majorBidi" w:cstheme="majorBidi"/>
+          <w:b/>
+          <w:bCs/>
+          <w:i/>
+          <w:iCs/>
+          <w:sz w:val="32"/>
+          <w:szCs w:val="32"/>
+        </w:rPr>
+        <w:t>docker import</w:t>
+      </w:r>
+      <w:r>
+        <w:rPr>
+          <w:rFonts w:asciiTheme="majorBidi" w:hAnsiTheme="majorBidi" w:cstheme="majorBidi"/>
+          <w:b/>
+          <w:bCs/>
+          <w:sz w:val="32"/>
+          <w:szCs w:val="32"/>
+        </w:rPr>
+        <w:t xml:space="preserve"> command:</w:t>
+      </w:r>
+    </w:p>
+    <w:p>
+      <w:pPr>
+        <w:rPr>
+          <w:rFonts w:asciiTheme="majorBidi" w:hAnsiTheme="majorBidi" w:cstheme="majorBidi"/>
+          <w:sz w:val="28"/>
+          <w:szCs w:val="28"/>
+        </w:rPr>
+      </w:pPr>
+      <w:r>
+        <w:rPr>
+          <w:rFonts w:asciiTheme="majorBidi" w:hAnsiTheme="majorBidi" w:cstheme="majorBidi"/>
+          <w:b/>
+          <w:bCs/>
+          <w:i/>
+          <w:iCs/>
+          <w:sz w:val="28"/>
+          <w:szCs w:val="28"/>
+        </w:rPr>
+        <w:t>docker import</w:t>
+      </w:r>
+      <w:r>
+        <w:rPr>
+          <w:rFonts w:asciiTheme="majorBidi" w:hAnsiTheme="majorBidi" w:cstheme="majorBidi"/>
+          <w:sz w:val="28"/>
+          <w:szCs w:val="28"/>
+        </w:rPr>
+        <w:t xml:space="preserve"> takes a tar archive (usually from docker export) and creates a new image from it.</w:t>
+      </w:r>
+    </w:p>
+    <w:p>
+      <w:pPr>
+        <w:rPr>
+          <w:rFonts w:asciiTheme="majorBidi" w:hAnsiTheme="majorBidi" w:cstheme="majorBidi"/>
+          <w:sz w:val="28"/>
+          <w:szCs w:val="28"/>
+          <w:u w:val="single"/>
+        </w:rPr>
+      </w:pPr>
+      <w:r>
+        <w:rPr>
+          <w:rFonts w:asciiTheme="majorBidi" w:hAnsiTheme="majorBidi" w:cstheme="majorBidi"/>
+          <w:sz w:val="28"/>
+          <w:szCs w:val="28"/>
+          <w:u w:val="single"/>
+        </w:rPr>
+        <w:t>Example:</w:t>
+      </w:r>
+    </w:p>
+    <w:p>
+      <w:pPr>
+        <w:rPr>
+          <w:rFonts w:asciiTheme="majorBidi" w:hAnsiTheme="majorBidi" w:cstheme="majorBidi"/>
+          <w:sz w:val="28"/>
+          <w:szCs w:val="28"/>
+        </w:rPr>
+      </w:pPr>
+      <w:r>
+        <w:rPr>
+          <w:rFonts w:asciiTheme="majorBidi" w:hAnsiTheme="majorBidi" w:cstheme="majorBidi"/>
+          <w:b/>
+          <w:bCs/>
+          <w:i/>
+          <w:iCs/>
+          <w:sz w:val="28"/>
+          <w:szCs w:val="28"/>
+        </w:rPr>
+        <w:t xml:space="preserve">docker import container.tar </w:t>
+      </w:r>
+      <w:proofErr w:type="spellStart"/>
+      <w:proofErr w:type="gramStart"/>
+      <w:r>
+        <w:rPr>
+          <w:rFonts w:asciiTheme="majorBidi" w:hAnsiTheme="majorBidi" w:cstheme="majorBidi"/>
+          <w:b/>
+          <w:bCs/>
+          <w:i/>
+          <w:iCs/>
+          <w:sz w:val="28"/>
+          <w:szCs w:val="28"/>
+        </w:rPr>
+        <w:t>myimage:flat</w:t>
+      </w:r>
+      <w:proofErr w:type="spellEnd"/>
+      <w:proofErr w:type="gramEnd"/>
+      <w:r>
+        <w:rPr>
+          <w:rFonts w:asciiTheme="majorBidi" w:hAnsiTheme="majorBidi" w:cstheme="majorBidi"/>
+          <w:b/>
+          <w:bCs/>
+          <w:i/>
+          <w:iCs/>
+          <w:sz w:val="28"/>
+          <w:szCs w:val="28"/>
+        </w:rPr>
+        <w:t xml:space="preserve"> </w:t>
+      </w:r>
+      <w:r>
+        <w:rPr>
+          <w:rFonts w:asciiTheme="majorBidi" w:hAnsiTheme="majorBidi" w:cstheme="majorBidi"/>
+          <w:sz w:val="28"/>
+          <w:szCs w:val="28"/>
+        </w:rPr>
+        <w:t>→</w:t>
+      </w:r>
+      <w:r>
+        <w:rPr>
+          <w:rFonts w:asciiTheme="majorBidi" w:hAnsiTheme="majorBidi" w:cstheme="majorBidi"/>
+          <w:sz w:val="28"/>
+          <w:szCs w:val="28"/>
+        </w:rPr>
+        <w:t xml:space="preserve"> </w:t>
+      </w:r>
+      <w:r>
+        <w:rPr>
+          <w:rFonts w:asciiTheme="majorBidi" w:hAnsiTheme="majorBidi" w:cstheme="majorBidi"/>
+          <w:sz w:val="28"/>
+          <w:szCs w:val="28"/>
+        </w:rPr>
+        <w:t>Now you have an image but it is a single-layer image with no history.</w:t>
+      </w:r>
+    </w:p>
+    <w:p>
+      <w:pPr>
+        <w:rPr>
+          <w:rFonts w:asciiTheme="majorBidi" w:hAnsiTheme="majorBidi" w:cstheme="majorBidi"/>
+          <w:sz w:val="28"/>
+          <w:szCs w:val="28"/>
+          <w:u w:val="single"/>
+        </w:rPr>
+      </w:pPr>
+      <w:r>
+        <w:rPr>
+          <w:rFonts w:asciiTheme="majorBidi" w:hAnsiTheme="majorBidi" w:cstheme="majorBidi"/>
+          <w:sz w:val="28"/>
+          <w:szCs w:val="28"/>
+          <w:u w:val="single"/>
+        </w:rPr>
+        <w:t>Important options</w:t>
+      </w:r>
+      <w:r>
+        <w:rPr>
+          <w:rFonts w:asciiTheme="majorBidi" w:hAnsiTheme="majorBidi" w:cstheme="majorBidi"/>
+          <w:sz w:val="28"/>
+          <w:szCs w:val="28"/>
+          <w:u w:val="single"/>
+        </w:rPr>
+        <w:t>:</w:t>
+      </w:r>
+    </w:p>
+    <w:p>
+      <w:pPr>
+        <w:pStyle w:val="ListParagraph"/>
+        <w:numPr>
+          <w:ilvl w:val="0"/>
+          <w:numId w:val="92"/>
+        </w:numPr>
+        <w:ind w:left="360"/>
+        <w:rPr>
+          <w:rFonts w:asciiTheme="majorBidi" w:hAnsiTheme="majorBidi" w:cstheme="majorBidi"/>
+          <w:sz w:val="28"/>
+          <w:szCs w:val="28"/>
+        </w:rPr>
+      </w:pPr>
+      <w:r>
+        <w:rPr>
+          <w:rFonts w:asciiTheme="majorBidi" w:hAnsiTheme="majorBidi" w:cstheme="majorBidi"/>
+          <w:b/>
+          <w:bCs/>
+          <w:i/>
+          <w:iCs/>
+          <w:sz w:val="28"/>
+          <w:szCs w:val="28"/>
+        </w:rPr>
+        <w:t>-c, --change</w:t>
+      </w:r>
+      <w:r>
+        <w:rPr>
+          <w:rFonts w:asciiTheme="majorBidi" w:hAnsiTheme="majorBidi" w:cstheme="majorBidi"/>
+          <w:sz w:val="28"/>
+          <w:szCs w:val="28"/>
+        </w:rPr>
+        <w:t xml:space="preserve"> </w:t>
+      </w:r>
+      <w:r>
+        <w:rPr>
+          <w:rFonts w:asciiTheme="majorBidi" w:hAnsiTheme="majorBidi" w:cstheme="majorBidi"/>
+          <w:sz w:val="28"/>
+          <w:szCs w:val="28"/>
+        </w:rPr>
+        <w:t xml:space="preserve">→Apply </w:t>
+      </w:r>
+      <w:proofErr w:type="spellStart"/>
+      <w:r>
+        <w:rPr>
+          <w:rFonts w:asciiTheme="majorBidi" w:hAnsiTheme="majorBidi" w:cstheme="majorBidi"/>
+          <w:sz w:val="28"/>
+          <w:szCs w:val="28"/>
+        </w:rPr>
+        <w:t>Dockerfile</w:t>
+      </w:r>
+      <w:proofErr w:type="spellEnd"/>
+      <w:r>
+        <w:rPr>
+          <w:rFonts w:asciiTheme="majorBidi" w:hAnsiTheme="majorBidi" w:cstheme="majorBidi"/>
+          <w:sz w:val="28"/>
+          <w:szCs w:val="28"/>
+        </w:rPr>
+        <w:t>-style instructions to the new image (like setting CMD).</w:t>
+      </w:r>
+      <w:r>
+        <w:rPr>
+          <w:rFonts w:asciiTheme="majorBidi" w:hAnsiTheme="majorBidi" w:cstheme="majorBidi"/>
+          <w:sz w:val="28"/>
+          <w:szCs w:val="28"/>
+        </w:rPr>
+        <w:t xml:space="preserve"> </w:t>
+      </w:r>
+      <w:r>
+        <w:rPr>
+          <w:rFonts w:asciiTheme="majorBidi" w:hAnsiTheme="majorBidi" w:cstheme="majorBidi"/>
+          <w:sz w:val="28"/>
+          <w:szCs w:val="28"/>
+        </w:rPr>
+        <w:t>Example:</w:t>
+      </w:r>
+    </w:p>
+    <w:p>
+      <w:pPr>
+        <w:pStyle w:val="ListParagraph"/>
+        <w:ind w:left="360"/>
+        <w:rPr>
+          <w:rFonts w:asciiTheme="majorBidi" w:hAnsiTheme="majorBidi" w:cstheme="majorBidi"/>
+          <w:b/>
+          <w:bCs/>
+          <w:i/>
+          <w:iCs/>
+          <w:sz w:val="28"/>
+          <w:szCs w:val="28"/>
+        </w:rPr>
+      </w:pPr>
+      <w:r>
+        <w:rPr>
+          <w:rFonts w:asciiTheme="majorBidi" w:hAnsiTheme="majorBidi" w:cstheme="majorBidi"/>
+          <w:b/>
+          <w:bCs/>
+          <w:i/>
+          <w:iCs/>
+          <w:sz w:val="28"/>
+          <w:szCs w:val="28"/>
+        </w:rPr>
+        <w:t xml:space="preserve">docker import -c 'CMD ["bash"]' container.tar </w:t>
+      </w:r>
+      <w:proofErr w:type="spellStart"/>
+      <w:proofErr w:type="gramStart"/>
+      <w:r>
+        <w:rPr>
+          <w:rFonts w:asciiTheme="majorBidi" w:hAnsiTheme="majorBidi" w:cstheme="majorBidi"/>
+          <w:b/>
+          <w:bCs/>
+          <w:i/>
+          <w:iCs/>
+          <w:sz w:val="28"/>
+          <w:szCs w:val="28"/>
+        </w:rPr>
+        <w:t>myimage:fixed</w:t>
+      </w:r>
+      <w:proofErr w:type="spellEnd"/>
+      <w:proofErr w:type="gramEnd"/>
+    </w:p>
+    <w:p>
+      <w:pPr>
+        <w:pStyle w:val="ListParagraph"/>
+        <w:numPr>
+          <w:ilvl w:val="0"/>
+          <w:numId w:val="92"/>
+        </w:numPr>
+        <w:ind w:left="360"/>
+        <w:rPr>
+          <w:rFonts w:asciiTheme="majorBidi" w:hAnsiTheme="majorBidi" w:cstheme="majorBidi"/>
+          <w:sz w:val="28"/>
+          <w:szCs w:val="28"/>
+        </w:rPr>
+      </w:pPr>
+      <w:r>
+        <w:rPr>
+          <w:rFonts w:asciiTheme="majorBidi" w:hAnsiTheme="majorBidi" w:cstheme="majorBidi"/>
+          <w:sz w:val="28"/>
+          <w:szCs w:val="28"/>
+        </w:rPr>
+        <w:t>-m, --message</w:t>
+      </w:r>
+      <w:r>
+        <w:rPr>
+          <w:rFonts w:asciiTheme="majorBidi" w:hAnsiTheme="majorBidi" w:cstheme="majorBidi"/>
+          <w:sz w:val="28"/>
+          <w:szCs w:val="28"/>
+        </w:rPr>
+        <w:t xml:space="preserve"> </w:t>
+      </w:r>
+      <w:r>
+        <w:rPr>
+          <w:rFonts w:asciiTheme="majorBidi" w:hAnsiTheme="majorBidi" w:cstheme="majorBidi"/>
+          <w:sz w:val="28"/>
+          <w:szCs w:val="28"/>
+        </w:rPr>
+        <w:t>→ Add a commit message.</w:t>
+      </w:r>
+      <w:r>
+        <w:rPr>
+          <w:rFonts w:asciiTheme="majorBidi" w:hAnsiTheme="majorBidi" w:cstheme="majorBidi"/>
+          <w:sz w:val="28"/>
+          <w:szCs w:val="28"/>
+        </w:rPr>
+        <w:t xml:space="preserve"> </w:t>
+      </w:r>
+      <w:r>
+        <w:rPr>
+          <w:rFonts w:asciiTheme="majorBidi" w:hAnsiTheme="majorBidi" w:cstheme="majorBidi"/>
+          <w:sz w:val="28"/>
+          <w:szCs w:val="28"/>
+        </w:rPr>
+        <w:t>Example:</w:t>
+      </w:r>
+    </w:p>
+    <w:p>
+      <w:pPr>
+        <w:pStyle w:val="ListParagraph"/>
+        <w:ind w:left="360"/>
+        <w:rPr>
+          <w:rFonts w:asciiTheme="majorBidi" w:hAnsiTheme="majorBidi" w:cstheme="majorBidi"/>
+          <w:b/>
+          <w:bCs/>
+          <w:i/>
+          <w:iCs/>
+          <w:sz w:val="28"/>
+          <w:szCs w:val="28"/>
+        </w:rPr>
+      </w:pPr>
+      <w:r>
+        <w:rPr>
+          <w:rFonts w:asciiTheme="majorBidi" w:hAnsiTheme="majorBidi" w:cstheme="majorBidi"/>
+          <w:b/>
+          <w:bCs/>
+          <w:i/>
+          <w:iCs/>
+          <w:sz w:val="28"/>
+          <w:szCs w:val="28"/>
+        </w:rPr>
+        <w:t xml:space="preserve">docker import -m "imported from container snapshot" container.tar </w:t>
+      </w:r>
+      <w:proofErr w:type="spellStart"/>
+      <w:r>
+        <w:rPr>
+          <w:rFonts w:asciiTheme="majorBidi" w:hAnsiTheme="majorBidi" w:cstheme="majorBidi"/>
+          <w:b/>
+          <w:bCs/>
+          <w:i/>
+          <w:iCs/>
+          <w:sz w:val="28"/>
+          <w:szCs w:val="28"/>
+        </w:rPr>
+        <w:t>myimage</w:t>
+      </w:r>
+      <w:proofErr w:type="spellEnd"/>
+    </w:p>
+    <w:p>
+      <w:pPr>
+        <w:rPr>
+          <w:rFonts w:asciiTheme="majorBidi" w:hAnsiTheme="majorBidi" w:cstheme="majorBidi"/>
+          <w:b/>
+          <w:bCs/>
+          <w:sz w:val="32"/>
+          <w:szCs w:val="32"/>
+        </w:rPr>
+      </w:pPr>
+      <w:r>
+        <w:rPr>
+          <w:rFonts w:asciiTheme="majorBidi" w:hAnsiTheme="majorBidi" w:cstheme="majorBidi"/>
+          <w:b/>
+          <w:bCs/>
+          <w:sz w:val="32"/>
+          <w:szCs w:val="32"/>
+        </w:rPr>
+        <w:t>summery:</w:t>
+      </w:r>
+    </w:p>
+    <w:p>
+      <w:pPr>
+        <w:pStyle w:val="ListParagraph"/>
+        <w:numPr>
+          <w:ilvl w:val="0"/>
+          <w:numId w:val="92"/>
+        </w:numPr>
+        <w:ind w:left="360"/>
+        <w:rPr>
+          <w:rFonts w:asciiTheme="majorBidi" w:hAnsiTheme="majorBidi" w:cstheme="majorBidi"/>
+          <w:sz w:val="28"/>
+          <w:szCs w:val="28"/>
+        </w:rPr>
+      </w:pPr>
+      <w:r>
+        <w:rPr>
+          <w:rFonts w:asciiTheme="majorBidi" w:hAnsiTheme="majorBidi" w:cstheme="majorBidi"/>
+          <w:b/>
+          <w:bCs/>
+          <w:i/>
+          <w:iCs/>
+          <w:sz w:val="28"/>
+          <w:szCs w:val="28"/>
+        </w:rPr>
+        <w:t>save/load</w:t>
+      </w:r>
+      <w:r>
+        <w:rPr>
+          <w:rFonts w:asciiTheme="majorBidi" w:hAnsiTheme="majorBidi" w:cstheme="majorBidi"/>
+          <w:sz w:val="28"/>
+          <w:szCs w:val="28"/>
+        </w:rPr>
+        <w:t xml:space="preserve"> → image-level, preserves layers and metadata</w:t>
+      </w:r>
+    </w:p>
+    <w:p>
+      <w:pPr>
+        <w:pStyle w:val="ListParagraph"/>
+        <w:numPr>
+          <w:ilvl w:val="0"/>
+          <w:numId w:val="92"/>
+        </w:numPr>
+        <w:ind w:left="360"/>
+        <w:rPr>
+          <w:rFonts w:asciiTheme="majorBidi" w:hAnsiTheme="majorBidi" w:cstheme="majorBidi"/>
+          <w:sz w:val="28"/>
+          <w:szCs w:val="28"/>
+        </w:rPr>
+      </w:pPr>
+      <w:r>
+        <w:rPr>
+          <w:rFonts w:asciiTheme="majorBidi" w:hAnsiTheme="majorBidi" w:cstheme="majorBidi"/>
+          <w:b/>
+          <w:bCs/>
+          <w:i/>
+          <w:iCs/>
+          <w:sz w:val="28"/>
+          <w:szCs w:val="28"/>
+        </w:rPr>
+        <w:t>export/import</w:t>
+      </w:r>
+      <w:r>
+        <w:rPr>
+          <w:rFonts w:asciiTheme="majorBidi" w:hAnsiTheme="majorBidi" w:cstheme="majorBidi"/>
+          <w:sz w:val="28"/>
+          <w:szCs w:val="28"/>
+        </w:rPr>
+        <w:t xml:space="preserve"> → container filesystem only, flattens everything</w:t>
+      </w:r>
+    </w:p>
+    <w:p>
+      <w:pPr>
+        <w:rPr>
+          <w:rFonts w:asciiTheme="majorBidi" w:hAnsiTheme="majorBidi" w:cstheme="majorBidi"/>
+          <w:sz w:val="28"/>
+          <w:szCs w:val="28"/>
+        </w:rPr>
+      </w:pPr>
+      <w:r>
+        <w:rPr>
+          <w:rFonts w:asciiTheme="majorBidi" w:hAnsiTheme="majorBidi" w:cstheme="majorBidi"/>
+          <w:sz w:val="28"/>
+          <w:szCs w:val="28"/>
+        </w:rPr>
+        <w:t>If you export and import, you lose:</w:t>
+      </w:r>
+    </w:p>
+    <w:p>
+      <w:pPr>
+        <w:pStyle w:val="ListParagraph"/>
+        <w:numPr>
+          <w:ilvl w:val="0"/>
+          <w:numId w:val="93"/>
+        </w:numPr>
+        <w:ind w:left="360"/>
+        <w:rPr>
+          <w:rFonts w:asciiTheme="majorBidi" w:hAnsiTheme="majorBidi" w:cstheme="majorBidi"/>
+          <w:sz w:val="28"/>
+          <w:szCs w:val="28"/>
+        </w:rPr>
+      </w:pPr>
+      <w:r>
+        <w:rPr>
+          <w:rFonts w:asciiTheme="majorBidi" w:hAnsiTheme="majorBidi" w:cstheme="majorBidi"/>
+          <w:sz w:val="28"/>
+          <w:szCs w:val="28"/>
+        </w:rPr>
+        <w:t>Layer structure</w:t>
+      </w:r>
+    </w:p>
+    <w:p>
+      <w:pPr>
+        <w:pStyle w:val="ListParagraph"/>
+        <w:numPr>
+          <w:ilvl w:val="0"/>
+          <w:numId w:val="93"/>
+        </w:numPr>
+        <w:ind w:left="360"/>
+        <w:rPr>
+          <w:rFonts w:asciiTheme="majorBidi" w:hAnsiTheme="majorBidi" w:cstheme="majorBidi"/>
+          <w:sz w:val="28"/>
+          <w:szCs w:val="28"/>
+        </w:rPr>
+      </w:pPr>
+      <w:r>
+        <w:rPr>
+          <w:rFonts w:asciiTheme="majorBidi" w:hAnsiTheme="majorBidi" w:cstheme="majorBidi"/>
+          <w:sz w:val="28"/>
+          <w:szCs w:val="28"/>
+        </w:rPr>
+        <w:t>Build history</w:t>
+      </w:r>
+    </w:p>
+    <w:p>
+      <w:pPr>
+        <w:pStyle w:val="ListParagraph"/>
+        <w:numPr>
+          <w:ilvl w:val="0"/>
+          <w:numId w:val="93"/>
+        </w:numPr>
+        <w:ind w:left="360"/>
+        <w:rPr>
+          <w:rFonts w:asciiTheme="majorBidi" w:hAnsiTheme="majorBidi" w:cstheme="majorBidi"/>
+          <w:sz w:val="28"/>
+          <w:szCs w:val="28"/>
+        </w:rPr>
+      </w:pPr>
+      <w:r>
+        <w:rPr>
+          <w:rFonts w:asciiTheme="majorBidi" w:hAnsiTheme="majorBidi" w:cstheme="majorBidi"/>
+          <w:sz w:val="28"/>
+          <w:szCs w:val="28"/>
+        </w:rPr>
+        <w:t>Original tags</w:t>
+      </w:r>
+    </w:p>
+    <w:p>
+      <w:pPr>
+        <w:pStyle w:val="ListParagraph"/>
+        <w:numPr>
+          <w:ilvl w:val="0"/>
+          <w:numId w:val="93"/>
+        </w:numPr>
+        <w:ind w:left="360"/>
+        <w:rPr>
+          <w:rFonts w:asciiTheme="majorBidi" w:hAnsiTheme="majorBidi" w:cstheme="majorBidi"/>
+          <w:sz w:val="28"/>
+          <w:szCs w:val="28"/>
+        </w:rPr>
+      </w:pPr>
+      <w:r>
+        <w:rPr>
+          <w:rFonts w:asciiTheme="majorBidi" w:hAnsiTheme="majorBidi" w:cstheme="majorBidi"/>
+          <w:sz w:val="28"/>
+          <w:szCs w:val="28"/>
+        </w:rPr>
+        <w:t>Multi-arch metadata</w:t>
+      </w:r>
+    </w:p>
+    <w:p>
+      <w:pPr>
+        <w:rPr>
+          <w:rFonts w:asciiTheme="majorBidi" w:hAnsiTheme="majorBidi" w:cstheme="majorBidi"/>
+          <w:sz w:val="28"/>
+          <w:szCs w:val="28"/>
+        </w:rPr>
+      </w:pPr>
+      <w:r>
+        <w:rPr>
+          <w:rFonts w:asciiTheme="majorBidi" w:hAnsiTheme="majorBidi" w:cstheme="majorBidi"/>
+          <w:sz w:val="28"/>
+          <w:szCs w:val="28"/>
+        </w:rPr>
+        <w:t>It becomes a raw filesystem image.</w:t>
+      </w:r>
+    </w:p>
+    <w:p>
+      <w:pPr>
+        <w:rPr>
+          <w:rFonts w:asciiTheme="majorBidi" w:hAnsiTheme="majorBidi" w:cstheme="majorBidi"/>
+          <w:sz w:val="28"/>
+          <w:szCs w:val="28"/>
+        </w:rPr>
+      </w:pPr>
+      <w:r>
+        <w:rPr>
+          <w:rFonts w:asciiTheme="majorBidi" w:hAnsiTheme="majorBidi" w:cstheme="majorBidi"/>
+          <w:sz w:val="28"/>
+          <w:szCs w:val="28"/>
+        </w:rPr>
+        <w:t>So mentally:</w:t>
+      </w:r>
+    </w:p>
+    <w:p>
+      <w:pPr>
+        <w:pStyle w:val="ListParagraph"/>
+        <w:numPr>
+          <w:ilvl w:val="0"/>
+          <w:numId w:val="94"/>
+        </w:numPr>
+        <w:ind w:left="360"/>
+        <w:rPr>
+          <w:rFonts w:asciiTheme="majorBidi" w:hAnsiTheme="majorBidi" w:cstheme="majorBidi"/>
+          <w:sz w:val="28"/>
+          <w:szCs w:val="28"/>
+        </w:rPr>
+      </w:pPr>
+      <w:r>
+        <w:rPr>
+          <w:rFonts w:asciiTheme="majorBidi" w:hAnsiTheme="majorBidi" w:cstheme="majorBidi"/>
+          <w:b/>
+          <w:bCs/>
+          <w:i/>
+          <w:iCs/>
+          <w:sz w:val="28"/>
+          <w:szCs w:val="28"/>
+        </w:rPr>
+        <w:t xml:space="preserve">commit </w:t>
+      </w:r>
+      <w:r>
+        <w:rPr>
+          <w:rFonts w:asciiTheme="majorBidi" w:hAnsiTheme="majorBidi" w:cstheme="majorBidi"/>
+          <w:sz w:val="28"/>
+          <w:szCs w:val="28"/>
+        </w:rPr>
+        <w:t>→ snapshot writable layer into new image</w:t>
+      </w:r>
+    </w:p>
+    <w:p>
+      <w:pPr>
+        <w:pStyle w:val="ListParagraph"/>
+        <w:numPr>
+          <w:ilvl w:val="0"/>
+          <w:numId w:val="94"/>
+        </w:numPr>
+        <w:ind w:left="360"/>
+        <w:rPr>
+          <w:rFonts w:asciiTheme="majorBidi" w:hAnsiTheme="majorBidi" w:cstheme="majorBidi"/>
+          <w:sz w:val="28"/>
+          <w:szCs w:val="28"/>
+        </w:rPr>
+      </w:pPr>
+      <w:r>
+        <w:rPr>
+          <w:rFonts w:asciiTheme="majorBidi" w:hAnsiTheme="majorBidi" w:cstheme="majorBidi"/>
+          <w:b/>
+          <w:bCs/>
+          <w:i/>
+          <w:iCs/>
+          <w:sz w:val="28"/>
+          <w:szCs w:val="28"/>
+        </w:rPr>
+        <w:t>save/load</w:t>
+      </w:r>
+      <w:r>
+        <w:rPr>
+          <w:rFonts w:asciiTheme="majorBidi" w:hAnsiTheme="majorBidi" w:cstheme="majorBidi"/>
+          <w:sz w:val="28"/>
+          <w:szCs w:val="28"/>
+        </w:rPr>
+        <w:t xml:space="preserve"> → move real images</w:t>
+      </w:r>
+    </w:p>
+    <w:p>
+      <w:pPr>
+        <w:pStyle w:val="ListParagraph"/>
+        <w:numPr>
+          <w:ilvl w:val="0"/>
+          <w:numId w:val="94"/>
+        </w:numPr>
+        <w:ind w:left="360"/>
+        <w:rPr>
+          <w:rFonts w:asciiTheme="majorBidi" w:hAnsiTheme="majorBidi" w:cstheme="majorBidi"/>
+          <w:sz w:val="28"/>
+          <w:szCs w:val="28"/>
+        </w:rPr>
+      </w:pPr>
+      <w:r>
+        <w:rPr>
+          <w:rFonts w:asciiTheme="majorBidi" w:hAnsiTheme="majorBidi" w:cstheme="majorBidi"/>
+          <w:b/>
+          <w:bCs/>
+          <w:i/>
+          <w:iCs/>
+          <w:sz w:val="28"/>
+          <w:szCs w:val="28"/>
+        </w:rPr>
+        <w:t>export/import</w:t>
+      </w:r>
+      <w:r>
+        <w:rPr>
+          <w:rFonts w:asciiTheme="majorBidi" w:hAnsiTheme="majorBidi" w:cstheme="majorBidi"/>
+          <w:sz w:val="28"/>
+          <w:szCs w:val="28"/>
+        </w:rPr>
+        <w:t xml:space="preserve"> → move raw container filesystem</w:t>
       </w:r>
     </w:p>
     <w:sectPr>
@@ -7199,6 +9885,119 @@
     </w:lvl>
   </w:abstractNum>
   <w:abstractNum w:abstractNumId="5" w15:restartNumberingAfterBreak="0">
+    <w:nsid w:val="080B3AF2"/>
+    <w:multiLevelType w:val="hybridMultilevel"/>
+    <w:tmpl w:val="0F8263C4"/>
+    <w:lvl w:ilvl="0" w:tplc="04090001">
+      <w:start w:val="1"/>
+      <w:numFmt w:val="bullet"/>
+      <w:lvlText w:val=""/>
+      <w:lvlJc w:val="left"/>
+      <w:pPr>
+        <w:ind w:left="720" w:hanging="360"/>
+      </w:pPr>
+      <w:rPr>
+        <w:rFonts w:ascii="Symbol" w:hAnsi="Symbol" w:hint="default"/>
+      </w:rPr>
+    </w:lvl>
+    <w:lvl w:ilvl="1" w:tplc="04090003" w:tentative="1">
+      <w:start w:val="1"/>
+      <w:numFmt w:val="bullet"/>
+      <w:lvlText w:val="o"/>
+      <w:lvlJc w:val="left"/>
+      <w:pPr>
+        <w:ind w:left="1440" w:hanging="360"/>
+      </w:pPr>
+      <w:rPr>
+        <w:rFonts w:ascii="Courier New" w:hAnsi="Courier New" w:cs="Courier New" w:hint="default"/>
+      </w:rPr>
+    </w:lvl>
+    <w:lvl w:ilvl="2" w:tplc="04090005" w:tentative="1">
+      <w:start w:val="1"/>
+      <w:numFmt w:val="bullet"/>
+      <w:lvlText w:val=""/>
+      <w:lvlJc w:val="left"/>
+      <w:pPr>
+        <w:ind w:left="2160" w:hanging="360"/>
+      </w:pPr>
+      <w:rPr>
+        <w:rFonts w:ascii="Wingdings" w:hAnsi="Wingdings" w:hint="default"/>
+      </w:rPr>
+    </w:lvl>
+    <w:lvl w:ilvl="3" w:tplc="04090001" w:tentative="1">
+      <w:start w:val="1"/>
+      <w:numFmt w:val="bullet"/>
+      <w:lvlText w:val=""/>
+      <w:lvlJc w:val="left"/>
+      <w:pPr>
+        <w:ind w:left="2880" w:hanging="360"/>
+      </w:pPr>
+      <w:rPr>
+        <w:rFonts w:ascii="Symbol" w:hAnsi="Symbol" w:hint="default"/>
+      </w:rPr>
+    </w:lvl>
+    <w:lvl w:ilvl="4" w:tplc="04090003" w:tentative="1">
+      <w:start w:val="1"/>
+      <w:numFmt w:val="bullet"/>
+      <w:lvlText w:val="o"/>
+      <w:lvlJc w:val="left"/>
+      <w:pPr>
+        <w:ind w:left="3600" w:hanging="360"/>
+      </w:pPr>
+      <w:rPr>
+        <w:rFonts w:ascii="Courier New" w:hAnsi="Courier New" w:cs="Courier New" w:hint="default"/>
+      </w:rPr>
+    </w:lvl>
+    <w:lvl w:ilvl="5" w:tplc="04090005" w:tentative="1">
+      <w:start w:val="1"/>
+      <w:numFmt w:val="bullet"/>
+      <w:lvlText w:val=""/>
+      <w:lvlJc w:val="left"/>
+      <w:pPr>
+        <w:ind w:left="4320" w:hanging="360"/>
+      </w:pPr>
+      <w:rPr>
+        <w:rFonts w:ascii="Wingdings" w:hAnsi="Wingdings" w:hint="default"/>
+      </w:rPr>
+    </w:lvl>
+    <w:lvl w:ilvl="6" w:tplc="04090001" w:tentative="1">
+      <w:start w:val="1"/>
+      <w:numFmt w:val="bullet"/>
+      <w:lvlText w:val=""/>
+      <w:lvlJc w:val="left"/>
+      <w:pPr>
+        <w:ind w:left="5040" w:hanging="360"/>
+      </w:pPr>
+      <w:rPr>
+        <w:rFonts w:ascii="Symbol" w:hAnsi="Symbol" w:hint="default"/>
+      </w:rPr>
+    </w:lvl>
+    <w:lvl w:ilvl="7" w:tplc="04090003" w:tentative="1">
+      <w:start w:val="1"/>
+      <w:numFmt w:val="bullet"/>
+      <w:lvlText w:val="o"/>
+      <w:lvlJc w:val="left"/>
+      <w:pPr>
+        <w:ind w:left="5760" w:hanging="360"/>
+      </w:pPr>
+      <w:rPr>
+        <w:rFonts w:ascii="Courier New" w:hAnsi="Courier New" w:cs="Courier New" w:hint="default"/>
+      </w:rPr>
+    </w:lvl>
+    <w:lvl w:ilvl="8" w:tplc="04090005" w:tentative="1">
+      <w:start w:val="1"/>
+      <w:numFmt w:val="bullet"/>
+      <w:lvlText w:val=""/>
+      <w:lvlJc w:val="left"/>
+      <w:pPr>
+        <w:ind w:left="6480" w:hanging="360"/>
+      </w:pPr>
+      <w:rPr>
+        <w:rFonts w:ascii="Wingdings" w:hAnsi="Wingdings" w:hint="default"/>
+      </w:rPr>
+    </w:lvl>
+  </w:abstractNum>
+  <w:abstractNum w:abstractNumId="6" w15:restartNumberingAfterBreak="0">
     <w:nsid w:val="0ACF4AB7"/>
     <w:multiLevelType w:val="hybridMultilevel"/>
     <w:tmpl w:val="356A79B6"/>
@@ -7311,7 +10110,7 @@
       </w:rPr>
     </w:lvl>
   </w:abstractNum>
-  <w:abstractNum w:abstractNumId="6" w15:restartNumberingAfterBreak="0">
+  <w:abstractNum w:abstractNumId="7" w15:restartNumberingAfterBreak="0">
     <w:nsid w:val="0C66491B"/>
     <w:multiLevelType w:val="hybridMultilevel"/>
     <w:tmpl w:val="915E4F62"/>
@@ -7424,7 +10223,7 @@
       </w:rPr>
     </w:lvl>
   </w:abstractNum>
-  <w:abstractNum w:abstractNumId="7" w15:restartNumberingAfterBreak="0">
+  <w:abstractNum w:abstractNumId="8" w15:restartNumberingAfterBreak="0">
     <w:nsid w:val="0DB51854"/>
     <w:multiLevelType w:val="hybridMultilevel"/>
     <w:tmpl w:val="18EA1148"/>
@@ -7537,7 +10336,7 @@
       </w:rPr>
     </w:lvl>
   </w:abstractNum>
-  <w:abstractNum w:abstractNumId="8" w15:restartNumberingAfterBreak="0">
+  <w:abstractNum w:abstractNumId="9" w15:restartNumberingAfterBreak="0">
     <w:nsid w:val="0EAB61EE"/>
     <w:multiLevelType w:val="hybridMultilevel"/>
     <w:tmpl w:val="C7B4D7D2"/>
@@ -7623,7 +10422,7 @@
       </w:pPr>
     </w:lvl>
   </w:abstractNum>
-  <w:abstractNum w:abstractNumId="9" w15:restartNumberingAfterBreak="0">
+  <w:abstractNum w:abstractNumId="10" w15:restartNumberingAfterBreak="0">
     <w:nsid w:val="0EEC3934"/>
     <w:multiLevelType w:val="hybridMultilevel"/>
     <w:tmpl w:val="E1620146"/>
@@ -7736,7 +10535,7 @@
       </w:rPr>
     </w:lvl>
   </w:abstractNum>
-  <w:abstractNum w:abstractNumId="10" w15:restartNumberingAfterBreak="0">
+  <w:abstractNum w:abstractNumId="11" w15:restartNumberingAfterBreak="0">
     <w:nsid w:val="0F601ABA"/>
     <w:multiLevelType w:val="hybridMultilevel"/>
     <w:tmpl w:val="F3D4ACA8"/>
@@ -7849,7 +10648,7 @@
       </w:rPr>
     </w:lvl>
   </w:abstractNum>
-  <w:abstractNum w:abstractNumId="11" w15:restartNumberingAfterBreak="0">
+  <w:abstractNum w:abstractNumId="12" w15:restartNumberingAfterBreak="0">
     <w:nsid w:val="0F724923"/>
     <w:multiLevelType w:val="hybridMultilevel"/>
     <w:tmpl w:val="0FDA852C"/>
@@ -7962,7 +10761,7 @@
       </w:rPr>
     </w:lvl>
   </w:abstractNum>
-  <w:abstractNum w:abstractNumId="12" w15:restartNumberingAfterBreak="0">
+  <w:abstractNum w:abstractNumId="13" w15:restartNumberingAfterBreak="0">
     <w:nsid w:val="119C5127"/>
     <w:multiLevelType w:val="hybridMultilevel"/>
     <w:tmpl w:val="29BC7C88"/>
@@ -8075,7 +10874,7 @@
       </w:rPr>
     </w:lvl>
   </w:abstractNum>
-  <w:abstractNum w:abstractNumId="13" w15:restartNumberingAfterBreak="0">
+  <w:abstractNum w:abstractNumId="14" w15:restartNumberingAfterBreak="0">
     <w:nsid w:val="11E41729"/>
     <w:multiLevelType w:val="hybridMultilevel"/>
     <w:tmpl w:val="5ABA1398"/>
@@ -8188,7 +10987,7 @@
       </w:rPr>
     </w:lvl>
   </w:abstractNum>
-  <w:abstractNum w:abstractNumId="14" w15:restartNumberingAfterBreak="0">
+  <w:abstractNum w:abstractNumId="15" w15:restartNumberingAfterBreak="0">
     <w:nsid w:val="143C6BD0"/>
     <w:multiLevelType w:val="hybridMultilevel"/>
     <w:tmpl w:val="D804A9F2"/>
@@ -8301,7 +11100,7 @@
       </w:rPr>
     </w:lvl>
   </w:abstractNum>
-  <w:abstractNum w:abstractNumId="15" w15:restartNumberingAfterBreak="0">
+  <w:abstractNum w:abstractNumId="16" w15:restartNumberingAfterBreak="0">
     <w:nsid w:val="14A8188E"/>
     <w:multiLevelType w:val="hybridMultilevel"/>
     <w:tmpl w:val="AAA2A268"/>
@@ -8414,7 +11213,7 @@
       </w:rPr>
     </w:lvl>
   </w:abstractNum>
-  <w:abstractNum w:abstractNumId="16" w15:restartNumberingAfterBreak="0">
+  <w:abstractNum w:abstractNumId="17" w15:restartNumberingAfterBreak="0">
     <w:nsid w:val="15B2768B"/>
     <w:multiLevelType w:val="hybridMultilevel"/>
     <w:tmpl w:val="E910B0F2"/>
@@ -8527,7 +11326,7 @@
       </w:rPr>
     </w:lvl>
   </w:abstractNum>
-  <w:abstractNum w:abstractNumId="17" w15:restartNumberingAfterBreak="0">
+  <w:abstractNum w:abstractNumId="18" w15:restartNumberingAfterBreak="0">
     <w:nsid w:val="15E069CA"/>
     <w:multiLevelType w:val="hybridMultilevel"/>
     <w:tmpl w:val="7B169B72"/>
@@ -8640,7 +11439,7 @@
       </w:rPr>
     </w:lvl>
   </w:abstractNum>
-  <w:abstractNum w:abstractNumId="18" w15:restartNumberingAfterBreak="0">
+  <w:abstractNum w:abstractNumId="19" w15:restartNumberingAfterBreak="0">
     <w:nsid w:val="15EC305A"/>
     <w:multiLevelType w:val="hybridMultilevel"/>
     <w:tmpl w:val="3F38AAA6"/>
@@ -8753,7 +11552,120 @@
       </w:rPr>
     </w:lvl>
   </w:abstractNum>
-  <w:abstractNum w:abstractNumId="19" w15:restartNumberingAfterBreak="0">
+  <w:abstractNum w:abstractNumId="20" w15:restartNumberingAfterBreak="0">
+    <w:nsid w:val="16DB75BC"/>
+    <w:multiLevelType w:val="hybridMultilevel"/>
+    <w:tmpl w:val="4E440F42"/>
+    <w:lvl w:ilvl="0" w:tplc="04090001">
+      <w:start w:val="1"/>
+      <w:numFmt w:val="bullet"/>
+      <w:lvlText w:val=""/>
+      <w:lvlJc w:val="left"/>
+      <w:pPr>
+        <w:ind w:left="720" w:hanging="360"/>
+      </w:pPr>
+      <w:rPr>
+        <w:rFonts w:ascii="Symbol" w:hAnsi="Symbol" w:hint="default"/>
+      </w:rPr>
+    </w:lvl>
+    <w:lvl w:ilvl="1" w:tplc="04090003" w:tentative="1">
+      <w:start w:val="1"/>
+      <w:numFmt w:val="bullet"/>
+      <w:lvlText w:val="o"/>
+      <w:lvlJc w:val="left"/>
+      <w:pPr>
+        <w:ind w:left="1440" w:hanging="360"/>
+      </w:pPr>
+      <w:rPr>
+        <w:rFonts w:ascii="Courier New" w:hAnsi="Courier New" w:cs="Courier New" w:hint="default"/>
+      </w:rPr>
+    </w:lvl>
+    <w:lvl w:ilvl="2" w:tplc="04090005" w:tentative="1">
+      <w:start w:val="1"/>
+      <w:numFmt w:val="bullet"/>
+      <w:lvlText w:val=""/>
+      <w:lvlJc w:val="left"/>
+      <w:pPr>
+        <w:ind w:left="2160" w:hanging="360"/>
+      </w:pPr>
+      <w:rPr>
+        <w:rFonts w:ascii="Wingdings" w:hAnsi="Wingdings" w:hint="default"/>
+      </w:rPr>
+    </w:lvl>
+    <w:lvl w:ilvl="3" w:tplc="04090001" w:tentative="1">
+      <w:start w:val="1"/>
+      <w:numFmt w:val="bullet"/>
+      <w:lvlText w:val=""/>
+      <w:lvlJc w:val="left"/>
+      <w:pPr>
+        <w:ind w:left="2880" w:hanging="360"/>
+      </w:pPr>
+      <w:rPr>
+        <w:rFonts w:ascii="Symbol" w:hAnsi="Symbol" w:hint="default"/>
+      </w:rPr>
+    </w:lvl>
+    <w:lvl w:ilvl="4" w:tplc="04090003" w:tentative="1">
+      <w:start w:val="1"/>
+      <w:numFmt w:val="bullet"/>
+      <w:lvlText w:val="o"/>
+      <w:lvlJc w:val="left"/>
+      <w:pPr>
+        <w:ind w:left="3600" w:hanging="360"/>
+      </w:pPr>
+      <w:rPr>
+        <w:rFonts w:ascii="Courier New" w:hAnsi="Courier New" w:cs="Courier New" w:hint="default"/>
+      </w:rPr>
+    </w:lvl>
+    <w:lvl w:ilvl="5" w:tplc="04090005" w:tentative="1">
+      <w:start w:val="1"/>
+      <w:numFmt w:val="bullet"/>
+      <w:lvlText w:val=""/>
+      <w:lvlJc w:val="left"/>
+      <w:pPr>
+        <w:ind w:left="4320" w:hanging="360"/>
+      </w:pPr>
+      <w:rPr>
+        <w:rFonts w:ascii="Wingdings" w:hAnsi="Wingdings" w:hint="default"/>
+      </w:rPr>
+    </w:lvl>
+    <w:lvl w:ilvl="6" w:tplc="04090001" w:tentative="1">
+      <w:start w:val="1"/>
+      <w:numFmt w:val="bullet"/>
+      <w:lvlText w:val=""/>
+      <w:lvlJc w:val="left"/>
+      <w:pPr>
+        <w:ind w:left="5040" w:hanging="360"/>
+      </w:pPr>
+      <w:rPr>
+        <w:rFonts w:ascii="Symbol" w:hAnsi="Symbol" w:hint="default"/>
+      </w:rPr>
+    </w:lvl>
+    <w:lvl w:ilvl="7" w:tplc="04090003" w:tentative="1">
+      <w:start w:val="1"/>
+      <w:numFmt w:val="bullet"/>
+      <w:lvlText w:val="o"/>
+      <w:lvlJc w:val="left"/>
+      <w:pPr>
+        <w:ind w:left="5760" w:hanging="360"/>
+      </w:pPr>
+      <w:rPr>
+        <w:rFonts w:ascii="Courier New" w:hAnsi="Courier New" w:cs="Courier New" w:hint="default"/>
+      </w:rPr>
+    </w:lvl>
+    <w:lvl w:ilvl="8" w:tplc="04090005" w:tentative="1">
+      <w:start w:val="1"/>
+      <w:numFmt w:val="bullet"/>
+      <w:lvlText w:val=""/>
+      <w:lvlJc w:val="left"/>
+      <w:pPr>
+        <w:ind w:left="6480" w:hanging="360"/>
+      </w:pPr>
+      <w:rPr>
+        <w:rFonts w:ascii="Wingdings" w:hAnsi="Wingdings" w:hint="default"/>
+      </w:rPr>
+    </w:lvl>
+  </w:abstractNum>
+  <w:abstractNum w:abstractNumId="21" w15:restartNumberingAfterBreak="0">
     <w:nsid w:val="176653C0"/>
     <w:multiLevelType w:val="hybridMultilevel"/>
     <w:tmpl w:val="08A05E28"/>
@@ -8866,7 +11778,7 @@
       </w:rPr>
     </w:lvl>
   </w:abstractNum>
-  <w:abstractNum w:abstractNumId="20" w15:restartNumberingAfterBreak="0">
+  <w:abstractNum w:abstractNumId="22" w15:restartNumberingAfterBreak="0">
     <w:nsid w:val="19B30FA4"/>
     <w:multiLevelType w:val="hybridMultilevel"/>
     <w:tmpl w:val="570486BE"/>
@@ -8979,7 +11891,7 @@
       </w:rPr>
     </w:lvl>
   </w:abstractNum>
-  <w:abstractNum w:abstractNumId="21" w15:restartNumberingAfterBreak="0">
+  <w:abstractNum w:abstractNumId="23" w15:restartNumberingAfterBreak="0">
     <w:nsid w:val="1C7A2575"/>
     <w:multiLevelType w:val="hybridMultilevel"/>
     <w:tmpl w:val="7D746F8C"/>
@@ -9092,7 +12004,7 @@
       </w:rPr>
     </w:lvl>
   </w:abstractNum>
-  <w:abstractNum w:abstractNumId="22" w15:restartNumberingAfterBreak="0">
+  <w:abstractNum w:abstractNumId="24" w15:restartNumberingAfterBreak="0">
     <w:nsid w:val="1CCC70E7"/>
     <w:multiLevelType w:val="hybridMultilevel"/>
     <w:tmpl w:val="5F781118"/>
@@ -9205,7 +12117,7 @@
       </w:rPr>
     </w:lvl>
   </w:abstractNum>
-  <w:abstractNum w:abstractNumId="23" w15:restartNumberingAfterBreak="0">
+  <w:abstractNum w:abstractNumId="25" w15:restartNumberingAfterBreak="0">
     <w:nsid w:val="24B90396"/>
     <w:multiLevelType w:val="hybridMultilevel"/>
     <w:tmpl w:val="75469786"/>
@@ -9318,7 +12230,120 @@
       </w:rPr>
     </w:lvl>
   </w:abstractNum>
-  <w:abstractNum w:abstractNumId="24" w15:restartNumberingAfterBreak="0">
+  <w:abstractNum w:abstractNumId="26" w15:restartNumberingAfterBreak="0">
+    <w:nsid w:val="2581075B"/>
+    <w:multiLevelType w:val="hybridMultilevel"/>
+    <w:tmpl w:val="A2B0B10C"/>
+    <w:lvl w:ilvl="0" w:tplc="04090001">
+      <w:start w:val="1"/>
+      <w:numFmt w:val="bullet"/>
+      <w:lvlText w:val=""/>
+      <w:lvlJc w:val="left"/>
+      <w:pPr>
+        <w:ind w:left="720" w:hanging="360"/>
+      </w:pPr>
+      <w:rPr>
+        <w:rFonts w:ascii="Symbol" w:hAnsi="Symbol" w:hint="default"/>
+      </w:rPr>
+    </w:lvl>
+    <w:lvl w:ilvl="1" w:tplc="04090003" w:tentative="1">
+      <w:start w:val="1"/>
+      <w:numFmt w:val="bullet"/>
+      <w:lvlText w:val="o"/>
+      <w:lvlJc w:val="left"/>
+      <w:pPr>
+        <w:ind w:left="1440" w:hanging="360"/>
+      </w:pPr>
+      <w:rPr>
+        <w:rFonts w:ascii="Courier New" w:hAnsi="Courier New" w:cs="Courier New" w:hint="default"/>
+      </w:rPr>
+    </w:lvl>
+    <w:lvl w:ilvl="2" w:tplc="04090005" w:tentative="1">
+      <w:start w:val="1"/>
+      <w:numFmt w:val="bullet"/>
+      <w:lvlText w:val=""/>
+      <w:lvlJc w:val="left"/>
+      <w:pPr>
+        <w:ind w:left="2160" w:hanging="360"/>
+      </w:pPr>
+      <w:rPr>
+        <w:rFonts w:ascii="Wingdings" w:hAnsi="Wingdings" w:hint="default"/>
+      </w:rPr>
+    </w:lvl>
+    <w:lvl w:ilvl="3" w:tplc="04090001" w:tentative="1">
+      <w:start w:val="1"/>
+      <w:numFmt w:val="bullet"/>
+      <w:lvlText w:val=""/>
+      <w:lvlJc w:val="left"/>
+      <w:pPr>
+        <w:ind w:left="2880" w:hanging="360"/>
+      </w:pPr>
+      <w:rPr>
+        <w:rFonts w:ascii="Symbol" w:hAnsi="Symbol" w:hint="default"/>
+      </w:rPr>
+    </w:lvl>
+    <w:lvl w:ilvl="4" w:tplc="04090003" w:tentative="1">
+      <w:start w:val="1"/>
+      <w:numFmt w:val="bullet"/>
+      <w:lvlText w:val="o"/>
+      <w:lvlJc w:val="left"/>
+      <w:pPr>
+        <w:ind w:left="3600" w:hanging="360"/>
+      </w:pPr>
+      <w:rPr>
+        <w:rFonts w:ascii="Courier New" w:hAnsi="Courier New" w:cs="Courier New" w:hint="default"/>
+      </w:rPr>
+    </w:lvl>
+    <w:lvl w:ilvl="5" w:tplc="04090005" w:tentative="1">
+      <w:start w:val="1"/>
+      <w:numFmt w:val="bullet"/>
+      <w:lvlText w:val=""/>
+      <w:lvlJc w:val="left"/>
+      <w:pPr>
+        <w:ind w:left="4320" w:hanging="360"/>
+      </w:pPr>
+      <w:rPr>
+        <w:rFonts w:ascii="Wingdings" w:hAnsi="Wingdings" w:hint="default"/>
+      </w:rPr>
+    </w:lvl>
+    <w:lvl w:ilvl="6" w:tplc="04090001" w:tentative="1">
+      <w:start w:val="1"/>
+      <w:numFmt w:val="bullet"/>
+      <w:lvlText w:val=""/>
+      <w:lvlJc w:val="left"/>
+      <w:pPr>
+        <w:ind w:left="5040" w:hanging="360"/>
+      </w:pPr>
+      <w:rPr>
+        <w:rFonts w:ascii="Symbol" w:hAnsi="Symbol" w:hint="default"/>
+      </w:rPr>
+    </w:lvl>
+    <w:lvl w:ilvl="7" w:tplc="04090003" w:tentative="1">
+      <w:start w:val="1"/>
+      <w:numFmt w:val="bullet"/>
+      <w:lvlText w:val="o"/>
+      <w:lvlJc w:val="left"/>
+      <w:pPr>
+        <w:ind w:left="5760" w:hanging="360"/>
+      </w:pPr>
+      <w:rPr>
+        <w:rFonts w:ascii="Courier New" w:hAnsi="Courier New" w:cs="Courier New" w:hint="default"/>
+      </w:rPr>
+    </w:lvl>
+    <w:lvl w:ilvl="8" w:tplc="04090005" w:tentative="1">
+      <w:start w:val="1"/>
+      <w:numFmt w:val="bullet"/>
+      <w:lvlText w:val=""/>
+      <w:lvlJc w:val="left"/>
+      <w:pPr>
+        <w:ind w:left="6480" w:hanging="360"/>
+      </w:pPr>
+      <w:rPr>
+        <w:rFonts w:ascii="Wingdings" w:hAnsi="Wingdings" w:hint="default"/>
+      </w:rPr>
+    </w:lvl>
+  </w:abstractNum>
+  <w:abstractNum w:abstractNumId="27" w15:restartNumberingAfterBreak="0">
     <w:nsid w:val="26AC3E30"/>
     <w:multiLevelType w:val="hybridMultilevel"/>
     <w:tmpl w:val="D1FC649A"/>
@@ -9431,7 +12456,7 @@
       </w:rPr>
     </w:lvl>
   </w:abstractNum>
-  <w:abstractNum w:abstractNumId="25" w15:restartNumberingAfterBreak="0">
+  <w:abstractNum w:abstractNumId="28" w15:restartNumberingAfterBreak="0">
     <w:nsid w:val="28190715"/>
     <w:multiLevelType w:val="hybridMultilevel"/>
     <w:tmpl w:val="F198EA58"/>
@@ -9517,7 +12542,7 @@
       </w:pPr>
     </w:lvl>
   </w:abstractNum>
-  <w:abstractNum w:abstractNumId="26" w15:restartNumberingAfterBreak="0">
+  <w:abstractNum w:abstractNumId="29" w15:restartNumberingAfterBreak="0">
     <w:nsid w:val="290D16D4"/>
     <w:multiLevelType w:val="hybridMultilevel"/>
     <w:tmpl w:val="850CA056"/>
@@ -9603,7 +12628,7 @@
       </w:pPr>
     </w:lvl>
   </w:abstractNum>
-  <w:abstractNum w:abstractNumId="27" w15:restartNumberingAfterBreak="0">
+  <w:abstractNum w:abstractNumId="30" w15:restartNumberingAfterBreak="0">
     <w:nsid w:val="29125D6B"/>
     <w:multiLevelType w:val="hybridMultilevel"/>
     <w:tmpl w:val="5C14C760"/>
@@ -9716,7 +12741,7 @@
       </w:rPr>
     </w:lvl>
   </w:abstractNum>
-  <w:abstractNum w:abstractNumId="28" w15:restartNumberingAfterBreak="0">
+  <w:abstractNum w:abstractNumId="31" w15:restartNumberingAfterBreak="0">
     <w:nsid w:val="299E5941"/>
     <w:multiLevelType w:val="hybridMultilevel"/>
     <w:tmpl w:val="9FE80B98"/>
@@ -9829,7 +12854,7 @@
       </w:rPr>
     </w:lvl>
   </w:abstractNum>
-  <w:abstractNum w:abstractNumId="29" w15:restartNumberingAfterBreak="0">
+  <w:abstractNum w:abstractNumId="32" w15:restartNumberingAfterBreak="0">
     <w:nsid w:val="2A425DD0"/>
     <w:multiLevelType w:val="hybridMultilevel"/>
     <w:tmpl w:val="FC5CFAF2"/>
@@ -9915,7 +12940,7 @@
       </w:pPr>
     </w:lvl>
   </w:abstractNum>
-  <w:abstractNum w:abstractNumId="30" w15:restartNumberingAfterBreak="0">
+  <w:abstractNum w:abstractNumId="33" w15:restartNumberingAfterBreak="0">
     <w:nsid w:val="2B5F052B"/>
     <w:multiLevelType w:val="hybridMultilevel"/>
     <w:tmpl w:val="5030DC38"/>
@@ -10028,7 +13053,120 @@
       </w:rPr>
     </w:lvl>
   </w:abstractNum>
-  <w:abstractNum w:abstractNumId="31" w15:restartNumberingAfterBreak="0">
+  <w:abstractNum w:abstractNumId="34" w15:restartNumberingAfterBreak="0">
+    <w:nsid w:val="2F410BD2"/>
+    <w:multiLevelType w:val="hybridMultilevel"/>
+    <w:tmpl w:val="4B8A50E6"/>
+    <w:lvl w:ilvl="0" w:tplc="04090001">
+      <w:start w:val="1"/>
+      <w:numFmt w:val="bullet"/>
+      <w:lvlText w:val=""/>
+      <w:lvlJc w:val="left"/>
+      <w:pPr>
+        <w:ind w:left="720" w:hanging="360"/>
+      </w:pPr>
+      <w:rPr>
+        <w:rFonts w:ascii="Symbol" w:hAnsi="Symbol" w:hint="default"/>
+      </w:rPr>
+    </w:lvl>
+    <w:lvl w:ilvl="1" w:tplc="04090003" w:tentative="1">
+      <w:start w:val="1"/>
+      <w:numFmt w:val="bullet"/>
+      <w:lvlText w:val="o"/>
+      <w:lvlJc w:val="left"/>
+      <w:pPr>
+        <w:ind w:left="1440" w:hanging="360"/>
+      </w:pPr>
+      <w:rPr>
+        <w:rFonts w:ascii="Courier New" w:hAnsi="Courier New" w:cs="Courier New" w:hint="default"/>
+      </w:rPr>
+    </w:lvl>
+    <w:lvl w:ilvl="2" w:tplc="04090005" w:tentative="1">
+      <w:start w:val="1"/>
+      <w:numFmt w:val="bullet"/>
+      <w:lvlText w:val=""/>
+      <w:lvlJc w:val="left"/>
+      <w:pPr>
+        <w:ind w:left="2160" w:hanging="360"/>
+      </w:pPr>
+      <w:rPr>
+        <w:rFonts w:ascii="Wingdings" w:hAnsi="Wingdings" w:hint="default"/>
+      </w:rPr>
+    </w:lvl>
+    <w:lvl w:ilvl="3" w:tplc="04090001" w:tentative="1">
+      <w:start w:val="1"/>
+      <w:numFmt w:val="bullet"/>
+      <w:lvlText w:val=""/>
+      <w:lvlJc w:val="left"/>
+      <w:pPr>
+        <w:ind w:left="2880" w:hanging="360"/>
+      </w:pPr>
+      <w:rPr>
+        <w:rFonts w:ascii="Symbol" w:hAnsi="Symbol" w:hint="default"/>
+      </w:rPr>
+    </w:lvl>
+    <w:lvl w:ilvl="4" w:tplc="04090003" w:tentative="1">
+      <w:start w:val="1"/>
+      <w:numFmt w:val="bullet"/>
+      <w:lvlText w:val="o"/>
+      <w:lvlJc w:val="left"/>
+      <w:pPr>
+        <w:ind w:left="3600" w:hanging="360"/>
+      </w:pPr>
+      <w:rPr>
+        <w:rFonts w:ascii="Courier New" w:hAnsi="Courier New" w:cs="Courier New" w:hint="default"/>
+      </w:rPr>
+    </w:lvl>
+    <w:lvl w:ilvl="5" w:tplc="04090005" w:tentative="1">
+      <w:start w:val="1"/>
+      <w:numFmt w:val="bullet"/>
+      <w:lvlText w:val=""/>
+      <w:lvlJc w:val="left"/>
+      <w:pPr>
+        <w:ind w:left="4320" w:hanging="360"/>
+      </w:pPr>
+      <w:rPr>
+        <w:rFonts w:ascii="Wingdings" w:hAnsi="Wingdings" w:hint="default"/>
+      </w:rPr>
+    </w:lvl>
+    <w:lvl w:ilvl="6" w:tplc="04090001" w:tentative="1">
+      <w:start w:val="1"/>
+      <w:numFmt w:val="bullet"/>
+      <w:lvlText w:val=""/>
+      <w:lvlJc w:val="left"/>
+      <w:pPr>
+        <w:ind w:left="5040" w:hanging="360"/>
+      </w:pPr>
+      <w:rPr>
+        <w:rFonts w:ascii="Symbol" w:hAnsi="Symbol" w:hint="default"/>
+      </w:rPr>
+    </w:lvl>
+    <w:lvl w:ilvl="7" w:tplc="04090003" w:tentative="1">
+      <w:start w:val="1"/>
+      <w:numFmt w:val="bullet"/>
+      <w:lvlText w:val="o"/>
+      <w:lvlJc w:val="left"/>
+      <w:pPr>
+        <w:ind w:left="5760" w:hanging="360"/>
+      </w:pPr>
+      <w:rPr>
+        <w:rFonts w:ascii="Courier New" w:hAnsi="Courier New" w:cs="Courier New" w:hint="default"/>
+      </w:rPr>
+    </w:lvl>
+    <w:lvl w:ilvl="8" w:tplc="04090005" w:tentative="1">
+      <w:start w:val="1"/>
+      <w:numFmt w:val="bullet"/>
+      <w:lvlText w:val=""/>
+      <w:lvlJc w:val="left"/>
+      <w:pPr>
+        <w:ind w:left="6480" w:hanging="360"/>
+      </w:pPr>
+      <w:rPr>
+        <w:rFonts w:ascii="Wingdings" w:hAnsi="Wingdings" w:hint="default"/>
+      </w:rPr>
+    </w:lvl>
+  </w:abstractNum>
+  <w:abstractNum w:abstractNumId="35" w15:restartNumberingAfterBreak="0">
     <w:nsid w:val="2F9D4EBC"/>
     <w:multiLevelType w:val="hybridMultilevel"/>
     <w:tmpl w:val="75BE8682"/>
@@ -10141,7 +13279,7 @@
       </w:rPr>
     </w:lvl>
   </w:abstractNum>
-  <w:abstractNum w:abstractNumId="32" w15:restartNumberingAfterBreak="0">
+  <w:abstractNum w:abstractNumId="36" w15:restartNumberingAfterBreak="0">
     <w:nsid w:val="30B67E2F"/>
     <w:multiLevelType w:val="hybridMultilevel"/>
     <w:tmpl w:val="59660B40"/>
@@ -10254,7 +13392,7 @@
       </w:rPr>
     </w:lvl>
   </w:abstractNum>
-  <w:abstractNum w:abstractNumId="33" w15:restartNumberingAfterBreak="0">
+  <w:abstractNum w:abstractNumId="37" w15:restartNumberingAfterBreak="0">
     <w:nsid w:val="30E50561"/>
     <w:multiLevelType w:val="hybridMultilevel"/>
     <w:tmpl w:val="32B6F57E"/>
@@ -10367,7 +13505,7 @@
       </w:rPr>
     </w:lvl>
   </w:abstractNum>
-  <w:abstractNum w:abstractNumId="34" w15:restartNumberingAfterBreak="0">
+  <w:abstractNum w:abstractNumId="38" w15:restartNumberingAfterBreak="0">
     <w:nsid w:val="35484DB3"/>
     <w:multiLevelType w:val="hybridMultilevel"/>
     <w:tmpl w:val="F7F620EC"/>
@@ -10480,7 +13618,7 @@
       </w:rPr>
     </w:lvl>
   </w:abstractNum>
-  <w:abstractNum w:abstractNumId="35" w15:restartNumberingAfterBreak="0">
+  <w:abstractNum w:abstractNumId="39" w15:restartNumberingAfterBreak="0">
     <w:nsid w:val="356C252A"/>
     <w:multiLevelType w:val="hybridMultilevel"/>
     <w:tmpl w:val="56C642E8"/>
@@ -10593,7 +13731,7 @@
       </w:rPr>
     </w:lvl>
   </w:abstractNum>
-  <w:abstractNum w:abstractNumId="36" w15:restartNumberingAfterBreak="0">
+  <w:abstractNum w:abstractNumId="40" w15:restartNumberingAfterBreak="0">
     <w:nsid w:val="35861E1F"/>
     <w:multiLevelType w:val="hybridMultilevel"/>
     <w:tmpl w:val="7B364A44"/>
@@ -10706,7 +13844,7 @@
       </w:rPr>
     </w:lvl>
   </w:abstractNum>
-  <w:abstractNum w:abstractNumId="37" w15:restartNumberingAfterBreak="0">
+  <w:abstractNum w:abstractNumId="41" w15:restartNumberingAfterBreak="0">
     <w:nsid w:val="35A706F1"/>
     <w:multiLevelType w:val="hybridMultilevel"/>
     <w:tmpl w:val="F19C8E58"/>
@@ -10819,7 +13957,7 @@
       </w:rPr>
     </w:lvl>
   </w:abstractNum>
-  <w:abstractNum w:abstractNumId="38" w15:restartNumberingAfterBreak="0">
+  <w:abstractNum w:abstractNumId="42" w15:restartNumberingAfterBreak="0">
     <w:nsid w:val="39984B4A"/>
     <w:multiLevelType w:val="hybridMultilevel"/>
     <w:tmpl w:val="4B9CFE62"/>
@@ -10932,7 +14070,7 @@
       </w:rPr>
     </w:lvl>
   </w:abstractNum>
-  <w:abstractNum w:abstractNumId="39" w15:restartNumberingAfterBreak="0">
+  <w:abstractNum w:abstractNumId="43" w15:restartNumberingAfterBreak="0">
     <w:nsid w:val="3BB13CD6"/>
     <w:multiLevelType w:val="hybridMultilevel"/>
     <w:tmpl w:val="38E65BE0"/>
@@ -11045,7 +14183,7 @@
       </w:rPr>
     </w:lvl>
   </w:abstractNum>
-  <w:abstractNum w:abstractNumId="40" w15:restartNumberingAfterBreak="0">
+  <w:abstractNum w:abstractNumId="44" w15:restartNumberingAfterBreak="0">
     <w:nsid w:val="3D8272C8"/>
     <w:multiLevelType w:val="hybridMultilevel"/>
     <w:tmpl w:val="69A42A26"/>
@@ -11158,7 +14296,7 @@
       </w:rPr>
     </w:lvl>
   </w:abstractNum>
-  <w:abstractNum w:abstractNumId="41" w15:restartNumberingAfterBreak="0">
+  <w:abstractNum w:abstractNumId="45" w15:restartNumberingAfterBreak="0">
     <w:nsid w:val="3E921BF7"/>
     <w:multiLevelType w:val="hybridMultilevel"/>
     <w:tmpl w:val="07D83C3E"/>
@@ -11271,7 +14409,7 @@
       </w:rPr>
     </w:lvl>
   </w:abstractNum>
-  <w:abstractNum w:abstractNumId="42" w15:restartNumberingAfterBreak="0">
+  <w:abstractNum w:abstractNumId="46" w15:restartNumberingAfterBreak="0">
     <w:nsid w:val="40BF32BA"/>
     <w:multiLevelType w:val="hybridMultilevel"/>
     <w:tmpl w:val="90849960"/>
@@ -11384,7 +14522,7 @@
       </w:rPr>
     </w:lvl>
   </w:abstractNum>
-  <w:abstractNum w:abstractNumId="43" w15:restartNumberingAfterBreak="0">
+  <w:abstractNum w:abstractNumId="47" w15:restartNumberingAfterBreak="0">
     <w:nsid w:val="410A541F"/>
     <w:multiLevelType w:val="hybridMultilevel"/>
     <w:tmpl w:val="F8CA0428"/>
@@ -11497,7 +14635,7 @@
       </w:rPr>
     </w:lvl>
   </w:abstractNum>
-  <w:abstractNum w:abstractNumId="44" w15:restartNumberingAfterBreak="0">
+  <w:abstractNum w:abstractNumId="48" w15:restartNumberingAfterBreak="0">
     <w:nsid w:val="42126938"/>
     <w:multiLevelType w:val="hybridMultilevel"/>
     <w:tmpl w:val="5D086338"/>
@@ -11610,7 +14748,7 @@
       </w:rPr>
     </w:lvl>
   </w:abstractNum>
-  <w:abstractNum w:abstractNumId="45" w15:restartNumberingAfterBreak="0">
+  <w:abstractNum w:abstractNumId="49" w15:restartNumberingAfterBreak="0">
     <w:nsid w:val="422A0DA2"/>
     <w:multiLevelType w:val="hybridMultilevel"/>
     <w:tmpl w:val="7B527DD6"/>
@@ -11696,7 +14834,7 @@
       </w:pPr>
     </w:lvl>
   </w:abstractNum>
-  <w:abstractNum w:abstractNumId="46" w15:restartNumberingAfterBreak="0">
+  <w:abstractNum w:abstractNumId="50" w15:restartNumberingAfterBreak="0">
     <w:nsid w:val="42592306"/>
     <w:multiLevelType w:val="hybridMultilevel"/>
     <w:tmpl w:val="252211AE"/>
@@ -11809,7 +14947,7 @@
       </w:rPr>
     </w:lvl>
   </w:abstractNum>
-  <w:abstractNum w:abstractNumId="47" w15:restartNumberingAfterBreak="0">
+  <w:abstractNum w:abstractNumId="51" w15:restartNumberingAfterBreak="0">
     <w:nsid w:val="42767048"/>
     <w:multiLevelType w:val="hybridMultilevel"/>
     <w:tmpl w:val="1E98EFE6"/>
@@ -11895,7 +15033,7 @@
       </w:pPr>
     </w:lvl>
   </w:abstractNum>
-  <w:abstractNum w:abstractNumId="48" w15:restartNumberingAfterBreak="0">
+  <w:abstractNum w:abstractNumId="52" w15:restartNumberingAfterBreak="0">
     <w:nsid w:val="43067A6B"/>
     <w:multiLevelType w:val="hybridMultilevel"/>
     <w:tmpl w:val="6B8AF690"/>
@@ -12008,7 +15146,7 @@
       </w:rPr>
     </w:lvl>
   </w:abstractNum>
-  <w:abstractNum w:abstractNumId="49" w15:restartNumberingAfterBreak="0">
+  <w:abstractNum w:abstractNumId="53" w15:restartNumberingAfterBreak="0">
     <w:nsid w:val="438638CD"/>
     <w:multiLevelType w:val="hybridMultilevel"/>
     <w:tmpl w:val="8526AD56"/>
@@ -12121,7 +15259,7 @@
       </w:rPr>
     </w:lvl>
   </w:abstractNum>
-  <w:abstractNum w:abstractNumId="50" w15:restartNumberingAfterBreak="0">
+  <w:abstractNum w:abstractNumId="54" w15:restartNumberingAfterBreak="0">
     <w:nsid w:val="43FE2240"/>
     <w:multiLevelType w:val="hybridMultilevel"/>
     <w:tmpl w:val="379010B8"/>
@@ -12234,7 +15372,7 @@
       </w:rPr>
     </w:lvl>
   </w:abstractNum>
-  <w:abstractNum w:abstractNumId="51" w15:restartNumberingAfterBreak="0">
+  <w:abstractNum w:abstractNumId="55" w15:restartNumberingAfterBreak="0">
     <w:nsid w:val="440542AF"/>
     <w:multiLevelType w:val="hybridMultilevel"/>
     <w:tmpl w:val="3D3CB302"/>
@@ -12347,7 +15485,7 @@
       </w:rPr>
     </w:lvl>
   </w:abstractNum>
-  <w:abstractNum w:abstractNumId="52" w15:restartNumberingAfterBreak="0">
+  <w:abstractNum w:abstractNumId="56" w15:restartNumberingAfterBreak="0">
     <w:nsid w:val="448444E1"/>
     <w:multiLevelType w:val="hybridMultilevel"/>
     <w:tmpl w:val="4244A5A6"/>
@@ -12460,7 +15598,7 @@
       </w:rPr>
     </w:lvl>
   </w:abstractNum>
-  <w:abstractNum w:abstractNumId="53" w15:restartNumberingAfterBreak="0">
+  <w:abstractNum w:abstractNumId="57" w15:restartNumberingAfterBreak="0">
     <w:nsid w:val="465D19C4"/>
     <w:multiLevelType w:val="hybridMultilevel"/>
     <w:tmpl w:val="59DA5D9A"/>
@@ -12573,7 +15711,7 @@
       </w:rPr>
     </w:lvl>
   </w:abstractNum>
-  <w:abstractNum w:abstractNumId="54" w15:restartNumberingAfterBreak="0">
+  <w:abstractNum w:abstractNumId="58" w15:restartNumberingAfterBreak="0">
     <w:nsid w:val="47666A8C"/>
     <w:multiLevelType w:val="hybridMultilevel"/>
     <w:tmpl w:val="18EC88AE"/>
@@ -12659,7 +15797,7 @@
       </w:pPr>
     </w:lvl>
   </w:abstractNum>
-  <w:abstractNum w:abstractNumId="55" w15:restartNumberingAfterBreak="0">
+  <w:abstractNum w:abstractNumId="59" w15:restartNumberingAfterBreak="0">
     <w:nsid w:val="49417DC1"/>
     <w:multiLevelType w:val="hybridMultilevel"/>
     <w:tmpl w:val="357411BA"/>
@@ -12772,7 +15910,7 @@
       </w:rPr>
     </w:lvl>
   </w:abstractNum>
-  <w:abstractNum w:abstractNumId="56" w15:restartNumberingAfterBreak="0">
+  <w:abstractNum w:abstractNumId="60" w15:restartNumberingAfterBreak="0">
     <w:nsid w:val="4E2C2D1C"/>
     <w:multiLevelType w:val="hybridMultilevel"/>
     <w:tmpl w:val="9626D062"/>
@@ -12885,7 +16023,7 @@
       </w:rPr>
     </w:lvl>
   </w:abstractNum>
-  <w:abstractNum w:abstractNumId="57" w15:restartNumberingAfterBreak="0">
+  <w:abstractNum w:abstractNumId="61" w15:restartNumberingAfterBreak="0">
     <w:nsid w:val="4EB719F3"/>
     <w:multiLevelType w:val="hybridMultilevel"/>
     <w:tmpl w:val="9306D736"/>
@@ -12998,7 +16136,7 @@
       </w:rPr>
     </w:lvl>
   </w:abstractNum>
-  <w:abstractNum w:abstractNumId="58" w15:restartNumberingAfterBreak="0">
+  <w:abstractNum w:abstractNumId="62" w15:restartNumberingAfterBreak="0">
     <w:nsid w:val="4F1224C7"/>
     <w:multiLevelType w:val="hybridMultilevel"/>
     <w:tmpl w:val="026C68CA"/>
@@ -13111,7 +16249,7 @@
       </w:rPr>
     </w:lvl>
   </w:abstractNum>
-  <w:abstractNum w:abstractNumId="59" w15:restartNumberingAfterBreak="0">
+  <w:abstractNum w:abstractNumId="63" w15:restartNumberingAfterBreak="0">
     <w:nsid w:val="53E65E4A"/>
     <w:multiLevelType w:val="hybridMultilevel"/>
     <w:tmpl w:val="8C7E6872"/>
@@ -13224,7 +16362,7 @@
       </w:rPr>
     </w:lvl>
   </w:abstractNum>
-  <w:abstractNum w:abstractNumId="60" w15:restartNumberingAfterBreak="0">
+  <w:abstractNum w:abstractNumId="64" w15:restartNumberingAfterBreak="0">
     <w:nsid w:val="575945E6"/>
     <w:multiLevelType w:val="hybridMultilevel"/>
     <w:tmpl w:val="F0B62A5E"/>
@@ -13337,7 +16475,7 @@
       </w:rPr>
     </w:lvl>
   </w:abstractNum>
-  <w:abstractNum w:abstractNumId="61" w15:restartNumberingAfterBreak="0">
+  <w:abstractNum w:abstractNumId="65" w15:restartNumberingAfterBreak="0">
     <w:nsid w:val="57A64A4A"/>
     <w:multiLevelType w:val="hybridMultilevel"/>
     <w:tmpl w:val="57F61210"/>
@@ -13450,7 +16588,7 @@
       </w:rPr>
     </w:lvl>
   </w:abstractNum>
-  <w:abstractNum w:abstractNumId="62" w15:restartNumberingAfterBreak="0">
+  <w:abstractNum w:abstractNumId="66" w15:restartNumberingAfterBreak="0">
     <w:nsid w:val="580638E5"/>
     <w:multiLevelType w:val="hybridMultilevel"/>
     <w:tmpl w:val="F606E3EA"/>
@@ -13563,7 +16701,7 @@
       </w:rPr>
     </w:lvl>
   </w:abstractNum>
-  <w:abstractNum w:abstractNumId="63" w15:restartNumberingAfterBreak="0">
+  <w:abstractNum w:abstractNumId="67" w15:restartNumberingAfterBreak="0">
     <w:nsid w:val="5B41034E"/>
     <w:multiLevelType w:val="hybridMultilevel"/>
     <w:tmpl w:val="C7324AEC"/>
@@ -13676,7 +16814,7 @@
       </w:rPr>
     </w:lvl>
   </w:abstractNum>
-  <w:abstractNum w:abstractNumId="64" w15:restartNumberingAfterBreak="0">
+  <w:abstractNum w:abstractNumId="68" w15:restartNumberingAfterBreak="0">
     <w:nsid w:val="5BD1365B"/>
     <w:multiLevelType w:val="hybridMultilevel"/>
     <w:tmpl w:val="E5B0176A"/>
@@ -13789,7 +16927,7 @@
       </w:rPr>
     </w:lvl>
   </w:abstractNum>
-  <w:abstractNum w:abstractNumId="65" w15:restartNumberingAfterBreak="0">
+  <w:abstractNum w:abstractNumId="69" w15:restartNumberingAfterBreak="0">
     <w:nsid w:val="5EDB35EC"/>
     <w:multiLevelType w:val="hybridMultilevel"/>
     <w:tmpl w:val="74A42BD4"/>
@@ -13902,7 +17040,7 @@
       </w:rPr>
     </w:lvl>
   </w:abstractNum>
-  <w:abstractNum w:abstractNumId="66" w15:restartNumberingAfterBreak="0">
+  <w:abstractNum w:abstractNumId="70" w15:restartNumberingAfterBreak="0">
     <w:nsid w:val="5F6C7BC0"/>
     <w:multiLevelType w:val="hybridMultilevel"/>
     <w:tmpl w:val="4D24E3DC"/>
@@ -14015,7 +17153,7 @@
       </w:rPr>
     </w:lvl>
   </w:abstractNum>
-  <w:abstractNum w:abstractNumId="67" w15:restartNumberingAfterBreak="0">
+  <w:abstractNum w:abstractNumId="71" w15:restartNumberingAfterBreak="0">
     <w:nsid w:val="60224FA5"/>
     <w:multiLevelType w:val="hybridMultilevel"/>
     <w:tmpl w:val="7CE4CD1A"/>
@@ -14128,7 +17266,7 @@
       </w:rPr>
     </w:lvl>
   </w:abstractNum>
-  <w:abstractNum w:abstractNumId="68" w15:restartNumberingAfterBreak="0">
+  <w:abstractNum w:abstractNumId="72" w15:restartNumberingAfterBreak="0">
     <w:nsid w:val="60D33E1C"/>
     <w:multiLevelType w:val="hybridMultilevel"/>
     <w:tmpl w:val="83B05A04"/>
@@ -14241,7 +17379,7 @@
       </w:rPr>
     </w:lvl>
   </w:abstractNum>
-  <w:abstractNum w:abstractNumId="69" w15:restartNumberingAfterBreak="0">
+  <w:abstractNum w:abstractNumId="73" w15:restartNumberingAfterBreak="0">
     <w:nsid w:val="626B6AB0"/>
     <w:multiLevelType w:val="hybridMultilevel"/>
     <w:tmpl w:val="5B38FD5E"/>
@@ -14327,7 +17465,120 @@
       </w:pPr>
     </w:lvl>
   </w:abstractNum>
-  <w:abstractNum w:abstractNumId="70" w15:restartNumberingAfterBreak="0">
+  <w:abstractNum w:abstractNumId="74" w15:restartNumberingAfterBreak="0">
+    <w:nsid w:val="62755D04"/>
+    <w:multiLevelType w:val="hybridMultilevel"/>
+    <w:tmpl w:val="53F0B9A0"/>
+    <w:lvl w:ilvl="0" w:tplc="04090001">
+      <w:start w:val="1"/>
+      <w:numFmt w:val="bullet"/>
+      <w:lvlText w:val=""/>
+      <w:lvlJc w:val="left"/>
+      <w:pPr>
+        <w:ind w:left="720" w:hanging="360"/>
+      </w:pPr>
+      <w:rPr>
+        <w:rFonts w:ascii="Symbol" w:hAnsi="Symbol" w:hint="default"/>
+      </w:rPr>
+    </w:lvl>
+    <w:lvl w:ilvl="1" w:tplc="04090003" w:tentative="1">
+      <w:start w:val="1"/>
+      <w:numFmt w:val="bullet"/>
+      <w:lvlText w:val="o"/>
+      <w:lvlJc w:val="left"/>
+      <w:pPr>
+        <w:ind w:left="1440" w:hanging="360"/>
+      </w:pPr>
+      <w:rPr>
+        <w:rFonts w:ascii="Courier New" w:hAnsi="Courier New" w:cs="Courier New" w:hint="default"/>
+      </w:rPr>
+    </w:lvl>
+    <w:lvl w:ilvl="2" w:tplc="04090005" w:tentative="1">
+      <w:start w:val="1"/>
+      <w:numFmt w:val="bullet"/>
+      <w:lvlText w:val=""/>
+      <w:lvlJc w:val="left"/>
+      <w:pPr>
+        <w:ind w:left="2160" w:hanging="360"/>
+      </w:pPr>
+      <w:rPr>
+        <w:rFonts w:ascii="Wingdings" w:hAnsi="Wingdings" w:hint="default"/>
+      </w:rPr>
+    </w:lvl>
+    <w:lvl w:ilvl="3" w:tplc="04090001" w:tentative="1">
+      <w:start w:val="1"/>
+      <w:numFmt w:val="bullet"/>
+      <w:lvlText w:val=""/>
+      <w:lvlJc w:val="left"/>
+      <w:pPr>
+        <w:ind w:left="2880" w:hanging="360"/>
+      </w:pPr>
+      <w:rPr>
+        <w:rFonts w:ascii="Symbol" w:hAnsi="Symbol" w:hint="default"/>
+      </w:rPr>
+    </w:lvl>
+    <w:lvl w:ilvl="4" w:tplc="04090003" w:tentative="1">
+      <w:start w:val="1"/>
+      <w:numFmt w:val="bullet"/>
+      <w:lvlText w:val="o"/>
+      <w:lvlJc w:val="left"/>
+      <w:pPr>
+        <w:ind w:left="3600" w:hanging="360"/>
+      </w:pPr>
+      <w:rPr>
+        <w:rFonts w:ascii="Courier New" w:hAnsi="Courier New" w:cs="Courier New" w:hint="default"/>
+      </w:rPr>
+    </w:lvl>
+    <w:lvl w:ilvl="5" w:tplc="04090005" w:tentative="1">
+      <w:start w:val="1"/>
+      <w:numFmt w:val="bullet"/>
+      <w:lvlText w:val=""/>
+      <w:lvlJc w:val="left"/>
+      <w:pPr>
+        <w:ind w:left="4320" w:hanging="360"/>
+      </w:pPr>
+      <w:rPr>
+        <w:rFonts w:ascii="Wingdings" w:hAnsi="Wingdings" w:hint="default"/>
+      </w:rPr>
+    </w:lvl>
+    <w:lvl w:ilvl="6" w:tplc="04090001" w:tentative="1">
+      <w:start w:val="1"/>
+      <w:numFmt w:val="bullet"/>
+      <w:lvlText w:val=""/>
+      <w:lvlJc w:val="left"/>
+      <w:pPr>
+        <w:ind w:left="5040" w:hanging="360"/>
+      </w:pPr>
+      <w:rPr>
+        <w:rFonts w:ascii="Symbol" w:hAnsi="Symbol" w:hint="default"/>
+      </w:rPr>
+    </w:lvl>
+    <w:lvl w:ilvl="7" w:tplc="04090003" w:tentative="1">
+      <w:start w:val="1"/>
+      <w:numFmt w:val="bullet"/>
+      <w:lvlText w:val="o"/>
+      <w:lvlJc w:val="left"/>
+      <w:pPr>
+        <w:ind w:left="5760" w:hanging="360"/>
+      </w:pPr>
+      <w:rPr>
+        <w:rFonts w:ascii="Courier New" w:hAnsi="Courier New" w:cs="Courier New" w:hint="default"/>
+      </w:rPr>
+    </w:lvl>
+    <w:lvl w:ilvl="8" w:tplc="04090005" w:tentative="1">
+      <w:start w:val="1"/>
+      <w:numFmt w:val="bullet"/>
+      <w:lvlText w:val=""/>
+      <w:lvlJc w:val="left"/>
+      <w:pPr>
+        <w:ind w:left="6480" w:hanging="360"/>
+      </w:pPr>
+      <w:rPr>
+        <w:rFonts w:ascii="Wingdings" w:hAnsi="Wingdings" w:hint="default"/>
+      </w:rPr>
+    </w:lvl>
+  </w:abstractNum>
+  <w:abstractNum w:abstractNumId="75" w15:restartNumberingAfterBreak="0">
     <w:nsid w:val="63520FCD"/>
     <w:multiLevelType w:val="hybridMultilevel"/>
     <w:tmpl w:val="BC20B65E"/>
@@ -14440,7 +17691,7 @@
       </w:rPr>
     </w:lvl>
   </w:abstractNum>
-  <w:abstractNum w:abstractNumId="71" w15:restartNumberingAfterBreak="0">
+  <w:abstractNum w:abstractNumId="76" w15:restartNumberingAfterBreak="0">
     <w:nsid w:val="67712598"/>
     <w:multiLevelType w:val="hybridMultilevel"/>
     <w:tmpl w:val="CF662074"/>
@@ -14553,7 +17804,7 @@
       </w:rPr>
     </w:lvl>
   </w:abstractNum>
-  <w:abstractNum w:abstractNumId="72" w15:restartNumberingAfterBreak="0">
+  <w:abstractNum w:abstractNumId="77" w15:restartNumberingAfterBreak="0">
     <w:nsid w:val="685F5CFD"/>
     <w:multiLevelType w:val="hybridMultilevel"/>
     <w:tmpl w:val="3C88BD80"/>
@@ -14666,7 +17917,7 @@
       </w:rPr>
     </w:lvl>
   </w:abstractNum>
-  <w:abstractNum w:abstractNumId="73" w15:restartNumberingAfterBreak="0">
+  <w:abstractNum w:abstractNumId="78" w15:restartNumberingAfterBreak="0">
     <w:nsid w:val="68E30751"/>
     <w:multiLevelType w:val="hybridMultilevel"/>
     <w:tmpl w:val="C180F3BC"/>
@@ -14779,7 +18030,7 @@
       </w:rPr>
     </w:lvl>
   </w:abstractNum>
-  <w:abstractNum w:abstractNumId="74" w15:restartNumberingAfterBreak="0">
+  <w:abstractNum w:abstractNumId="79" w15:restartNumberingAfterBreak="0">
     <w:nsid w:val="690A7EF9"/>
     <w:multiLevelType w:val="hybridMultilevel"/>
     <w:tmpl w:val="DD549D3C"/>
@@ -14892,7 +18143,7 @@
       </w:rPr>
     </w:lvl>
   </w:abstractNum>
-  <w:abstractNum w:abstractNumId="75" w15:restartNumberingAfterBreak="0">
+  <w:abstractNum w:abstractNumId="80" w15:restartNumberingAfterBreak="0">
     <w:nsid w:val="69E07337"/>
     <w:multiLevelType w:val="hybridMultilevel"/>
     <w:tmpl w:val="8BD25784"/>
@@ -15005,7 +18256,7 @@
       </w:rPr>
     </w:lvl>
   </w:abstractNum>
-  <w:abstractNum w:abstractNumId="76" w15:restartNumberingAfterBreak="0">
+  <w:abstractNum w:abstractNumId="81" w15:restartNumberingAfterBreak="0">
     <w:nsid w:val="6A921E1A"/>
     <w:multiLevelType w:val="hybridMultilevel"/>
     <w:tmpl w:val="EC482F82"/>
@@ -15118,7 +18369,7 @@
       </w:rPr>
     </w:lvl>
   </w:abstractNum>
-  <w:abstractNum w:abstractNumId="77" w15:restartNumberingAfterBreak="0">
+  <w:abstractNum w:abstractNumId="82" w15:restartNumberingAfterBreak="0">
     <w:nsid w:val="6A992E25"/>
     <w:multiLevelType w:val="hybridMultilevel"/>
     <w:tmpl w:val="7CB82F38"/>
@@ -15231,7 +18482,7 @@
       </w:rPr>
     </w:lvl>
   </w:abstractNum>
-  <w:abstractNum w:abstractNumId="78" w15:restartNumberingAfterBreak="0">
+  <w:abstractNum w:abstractNumId="83" w15:restartNumberingAfterBreak="0">
     <w:nsid w:val="6C0B2D42"/>
     <w:multiLevelType w:val="hybridMultilevel"/>
     <w:tmpl w:val="D8408682"/>
@@ -15344,7 +18595,7 @@
       </w:rPr>
     </w:lvl>
   </w:abstractNum>
-  <w:abstractNum w:abstractNumId="79" w15:restartNumberingAfterBreak="0">
+  <w:abstractNum w:abstractNumId="84" w15:restartNumberingAfterBreak="0">
     <w:nsid w:val="6EE87CD0"/>
     <w:multiLevelType w:val="hybridMultilevel"/>
     <w:tmpl w:val="1326F5B2"/>
@@ -15457,7 +18708,7 @@
       </w:rPr>
     </w:lvl>
   </w:abstractNum>
-  <w:abstractNum w:abstractNumId="80" w15:restartNumberingAfterBreak="0">
+  <w:abstractNum w:abstractNumId="85" w15:restartNumberingAfterBreak="0">
     <w:nsid w:val="71550F8E"/>
     <w:multiLevelType w:val="hybridMultilevel"/>
     <w:tmpl w:val="42147756"/>
@@ -15570,7 +18821,7 @@
       </w:rPr>
     </w:lvl>
   </w:abstractNum>
-  <w:abstractNum w:abstractNumId="81" w15:restartNumberingAfterBreak="0">
+  <w:abstractNum w:abstractNumId="86" w15:restartNumberingAfterBreak="0">
     <w:nsid w:val="717C6830"/>
     <w:multiLevelType w:val="hybridMultilevel"/>
     <w:tmpl w:val="9BC6839A"/>
@@ -15683,7 +18934,7 @@
       </w:rPr>
     </w:lvl>
   </w:abstractNum>
-  <w:abstractNum w:abstractNumId="82" w15:restartNumberingAfterBreak="0">
+  <w:abstractNum w:abstractNumId="87" w15:restartNumberingAfterBreak="0">
     <w:nsid w:val="747D26C2"/>
     <w:multiLevelType w:val="hybridMultilevel"/>
     <w:tmpl w:val="585EA518"/>
@@ -15796,7 +19047,7 @@
       </w:rPr>
     </w:lvl>
   </w:abstractNum>
-  <w:abstractNum w:abstractNumId="83" w15:restartNumberingAfterBreak="0">
+  <w:abstractNum w:abstractNumId="88" w15:restartNumberingAfterBreak="0">
     <w:nsid w:val="74BC1C1B"/>
     <w:multiLevelType w:val="hybridMultilevel"/>
     <w:tmpl w:val="DF3A32BC"/>
@@ -15909,7 +19160,120 @@
       </w:rPr>
     </w:lvl>
   </w:abstractNum>
-  <w:abstractNum w:abstractNumId="84" w15:restartNumberingAfterBreak="0">
+  <w:abstractNum w:abstractNumId="89" w15:restartNumberingAfterBreak="0">
+    <w:nsid w:val="759114A9"/>
+    <w:multiLevelType w:val="hybridMultilevel"/>
+    <w:tmpl w:val="B1EADEE0"/>
+    <w:lvl w:ilvl="0" w:tplc="04090001">
+      <w:start w:val="1"/>
+      <w:numFmt w:val="bullet"/>
+      <w:lvlText w:val=""/>
+      <w:lvlJc w:val="left"/>
+      <w:pPr>
+        <w:ind w:left="720" w:hanging="360"/>
+      </w:pPr>
+      <w:rPr>
+        <w:rFonts w:ascii="Symbol" w:hAnsi="Symbol" w:hint="default"/>
+      </w:rPr>
+    </w:lvl>
+    <w:lvl w:ilvl="1" w:tplc="04090003" w:tentative="1">
+      <w:start w:val="1"/>
+      <w:numFmt w:val="bullet"/>
+      <w:lvlText w:val="o"/>
+      <w:lvlJc w:val="left"/>
+      <w:pPr>
+        <w:ind w:left="1440" w:hanging="360"/>
+      </w:pPr>
+      <w:rPr>
+        <w:rFonts w:ascii="Courier New" w:hAnsi="Courier New" w:cs="Courier New" w:hint="default"/>
+      </w:rPr>
+    </w:lvl>
+    <w:lvl w:ilvl="2" w:tplc="04090005" w:tentative="1">
+      <w:start w:val="1"/>
+      <w:numFmt w:val="bullet"/>
+      <w:lvlText w:val=""/>
+      <w:lvlJc w:val="left"/>
+      <w:pPr>
+        <w:ind w:left="2160" w:hanging="360"/>
+      </w:pPr>
+      <w:rPr>
+        <w:rFonts w:ascii="Wingdings" w:hAnsi="Wingdings" w:hint="default"/>
+      </w:rPr>
+    </w:lvl>
+    <w:lvl w:ilvl="3" w:tplc="04090001" w:tentative="1">
+      <w:start w:val="1"/>
+      <w:numFmt w:val="bullet"/>
+      <w:lvlText w:val=""/>
+      <w:lvlJc w:val="left"/>
+      <w:pPr>
+        <w:ind w:left="2880" w:hanging="360"/>
+      </w:pPr>
+      <w:rPr>
+        <w:rFonts w:ascii="Symbol" w:hAnsi="Symbol" w:hint="default"/>
+      </w:rPr>
+    </w:lvl>
+    <w:lvl w:ilvl="4" w:tplc="04090003" w:tentative="1">
+      <w:start w:val="1"/>
+      <w:numFmt w:val="bullet"/>
+      <w:lvlText w:val="o"/>
+      <w:lvlJc w:val="left"/>
+      <w:pPr>
+        <w:ind w:left="3600" w:hanging="360"/>
+      </w:pPr>
+      <w:rPr>
+        <w:rFonts w:ascii="Courier New" w:hAnsi="Courier New" w:cs="Courier New" w:hint="default"/>
+      </w:rPr>
+    </w:lvl>
+    <w:lvl w:ilvl="5" w:tplc="04090005" w:tentative="1">
+      <w:start w:val="1"/>
+      <w:numFmt w:val="bullet"/>
+      <w:lvlText w:val=""/>
+      <w:lvlJc w:val="left"/>
+      <w:pPr>
+        <w:ind w:left="4320" w:hanging="360"/>
+      </w:pPr>
+      <w:rPr>
+        <w:rFonts w:ascii="Wingdings" w:hAnsi="Wingdings" w:hint="default"/>
+      </w:rPr>
+    </w:lvl>
+    <w:lvl w:ilvl="6" w:tplc="04090001" w:tentative="1">
+      <w:start w:val="1"/>
+      <w:numFmt w:val="bullet"/>
+      <w:lvlText w:val=""/>
+      <w:lvlJc w:val="left"/>
+      <w:pPr>
+        <w:ind w:left="5040" w:hanging="360"/>
+      </w:pPr>
+      <w:rPr>
+        <w:rFonts w:ascii="Symbol" w:hAnsi="Symbol" w:hint="default"/>
+      </w:rPr>
+    </w:lvl>
+    <w:lvl w:ilvl="7" w:tplc="04090003" w:tentative="1">
+      <w:start w:val="1"/>
+      <w:numFmt w:val="bullet"/>
+      <w:lvlText w:val="o"/>
+      <w:lvlJc w:val="left"/>
+      <w:pPr>
+        <w:ind w:left="5760" w:hanging="360"/>
+      </w:pPr>
+      <w:rPr>
+        <w:rFonts w:ascii="Courier New" w:hAnsi="Courier New" w:cs="Courier New" w:hint="default"/>
+      </w:rPr>
+    </w:lvl>
+    <w:lvl w:ilvl="8" w:tplc="04090005" w:tentative="1">
+      <w:start w:val="1"/>
+      <w:numFmt w:val="bullet"/>
+      <w:lvlText w:val=""/>
+      <w:lvlJc w:val="left"/>
+      <w:pPr>
+        <w:ind w:left="6480" w:hanging="360"/>
+      </w:pPr>
+      <w:rPr>
+        <w:rFonts w:ascii="Wingdings" w:hAnsi="Wingdings" w:hint="default"/>
+      </w:rPr>
+    </w:lvl>
+  </w:abstractNum>
+  <w:abstractNum w:abstractNumId="90" w15:restartNumberingAfterBreak="0">
     <w:nsid w:val="78E404C7"/>
     <w:multiLevelType w:val="hybridMultilevel"/>
     <w:tmpl w:val="FB0ED528"/>
@@ -15995,7 +19359,7 @@
       </w:pPr>
     </w:lvl>
   </w:abstractNum>
-  <w:abstractNum w:abstractNumId="85" w15:restartNumberingAfterBreak="0">
+  <w:abstractNum w:abstractNumId="91" w15:restartNumberingAfterBreak="0">
     <w:nsid w:val="79F2025C"/>
     <w:multiLevelType w:val="hybridMultilevel"/>
     <w:tmpl w:val="856AB364"/>
@@ -16108,7 +19472,7 @@
       </w:rPr>
     </w:lvl>
   </w:abstractNum>
-  <w:abstractNum w:abstractNumId="86" w15:restartNumberingAfterBreak="0">
+  <w:abstractNum w:abstractNumId="92" w15:restartNumberingAfterBreak="0">
     <w:nsid w:val="7A880265"/>
     <w:multiLevelType w:val="hybridMultilevel"/>
     <w:tmpl w:val="00CE3C72"/>
@@ -16221,266 +19585,400 @@
       </w:rPr>
     </w:lvl>
   </w:abstractNum>
+  <w:abstractNum w:abstractNumId="93" w15:restartNumberingAfterBreak="0">
+    <w:nsid w:val="7DFC6E24"/>
+    <w:multiLevelType w:val="hybridMultilevel"/>
+    <w:tmpl w:val="08B446EE"/>
+    <w:lvl w:ilvl="0" w:tplc="04090001">
+      <w:start w:val="1"/>
+      <w:numFmt w:val="bullet"/>
+      <w:lvlText w:val=""/>
+      <w:lvlJc w:val="left"/>
+      <w:pPr>
+        <w:ind w:left="720" w:hanging="360"/>
+      </w:pPr>
+      <w:rPr>
+        <w:rFonts w:ascii="Symbol" w:hAnsi="Symbol" w:hint="default"/>
+      </w:rPr>
+    </w:lvl>
+    <w:lvl w:ilvl="1" w:tplc="04090003" w:tentative="1">
+      <w:start w:val="1"/>
+      <w:numFmt w:val="bullet"/>
+      <w:lvlText w:val="o"/>
+      <w:lvlJc w:val="left"/>
+      <w:pPr>
+        <w:ind w:left="1440" w:hanging="360"/>
+      </w:pPr>
+      <w:rPr>
+        <w:rFonts w:ascii="Courier New" w:hAnsi="Courier New" w:cs="Courier New" w:hint="default"/>
+      </w:rPr>
+    </w:lvl>
+    <w:lvl w:ilvl="2" w:tplc="04090005" w:tentative="1">
+      <w:start w:val="1"/>
+      <w:numFmt w:val="bullet"/>
+      <w:lvlText w:val=""/>
+      <w:lvlJc w:val="left"/>
+      <w:pPr>
+        <w:ind w:left="2160" w:hanging="360"/>
+      </w:pPr>
+      <w:rPr>
+        <w:rFonts w:ascii="Wingdings" w:hAnsi="Wingdings" w:hint="default"/>
+      </w:rPr>
+    </w:lvl>
+    <w:lvl w:ilvl="3" w:tplc="04090001" w:tentative="1">
+      <w:start w:val="1"/>
+      <w:numFmt w:val="bullet"/>
+      <w:lvlText w:val=""/>
+      <w:lvlJc w:val="left"/>
+      <w:pPr>
+        <w:ind w:left="2880" w:hanging="360"/>
+      </w:pPr>
+      <w:rPr>
+        <w:rFonts w:ascii="Symbol" w:hAnsi="Symbol" w:hint="default"/>
+      </w:rPr>
+    </w:lvl>
+    <w:lvl w:ilvl="4" w:tplc="04090003" w:tentative="1">
+      <w:start w:val="1"/>
+      <w:numFmt w:val="bullet"/>
+      <w:lvlText w:val="o"/>
+      <w:lvlJc w:val="left"/>
+      <w:pPr>
+        <w:ind w:left="3600" w:hanging="360"/>
+      </w:pPr>
+      <w:rPr>
+        <w:rFonts w:ascii="Courier New" w:hAnsi="Courier New" w:cs="Courier New" w:hint="default"/>
+      </w:rPr>
+    </w:lvl>
+    <w:lvl w:ilvl="5" w:tplc="04090005" w:tentative="1">
+      <w:start w:val="1"/>
+      <w:numFmt w:val="bullet"/>
+      <w:lvlText w:val=""/>
+      <w:lvlJc w:val="left"/>
+      <w:pPr>
+        <w:ind w:left="4320" w:hanging="360"/>
+      </w:pPr>
+      <w:rPr>
+        <w:rFonts w:ascii="Wingdings" w:hAnsi="Wingdings" w:hint="default"/>
+      </w:rPr>
+    </w:lvl>
+    <w:lvl w:ilvl="6" w:tplc="04090001" w:tentative="1">
+      <w:start w:val="1"/>
+      <w:numFmt w:val="bullet"/>
+      <w:lvlText w:val=""/>
+      <w:lvlJc w:val="left"/>
+      <w:pPr>
+        <w:ind w:left="5040" w:hanging="360"/>
+      </w:pPr>
+      <w:rPr>
+        <w:rFonts w:ascii="Symbol" w:hAnsi="Symbol" w:hint="default"/>
+      </w:rPr>
+    </w:lvl>
+    <w:lvl w:ilvl="7" w:tplc="04090003" w:tentative="1">
+      <w:start w:val="1"/>
+      <w:numFmt w:val="bullet"/>
+      <w:lvlText w:val="o"/>
+      <w:lvlJc w:val="left"/>
+      <w:pPr>
+        <w:ind w:left="5760" w:hanging="360"/>
+      </w:pPr>
+      <w:rPr>
+        <w:rFonts w:ascii="Courier New" w:hAnsi="Courier New" w:cs="Courier New" w:hint="default"/>
+      </w:rPr>
+    </w:lvl>
+    <w:lvl w:ilvl="8" w:tplc="04090005" w:tentative="1">
+      <w:start w:val="1"/>
+      <w:numFmt w:val="bullet"/>
+      <w:lvlText w:val=""/>
+      <w:lvlJc w:val="left"/>
+      <w:pPr>
+        <w:ind w:left="6480" w:hanging="360"/>
+      </w:pPr>
+      <w:rPr>
+        <w:rFonts w:ascii="Wingdings" w:hAnsi="Wingdings" w:hint="default"/>
+      </w:rPr>
+    </w:lvl>
+  </w:abstractNum>
   <w:num w:numId="1" w16cid:durableId="451706812">
-    <w:abstractNumId w:val="13"/>
+    <w:abstractNumId w:val="14"/>
   </w:num>
   <w:num w:numId="2" w16cid:durableId="943072337">
-    <w:abstractNumId w:val="65"/>
+    <w:abstractNumId w:val="69"/>
   </w:num>
   <w:num w:numId="3" w16cid:durableId="667709974">
-    <w:abstractNumId w:val="84"/>
+    <w:abstractNumId w:val="90"/>
   </w:num>
   <w:num w:numId="4" w16cid:durableId="42875176">
     <w:abstractNumId w:val="2"/>
   </w:num>
   <w:num w:numId="5" w16cid:durableId="1469126308">
-    <w:abstractNumId w:val="40"/>
+    <w:abstractNumId w:val="44"/>
   </w:num>
   <w:num w:numId="6" w16cid:durableId="2092892987">
-    <w:abstractNumId w:val="51"/>
+    <w:abstractNumId w:val="55"/>
   </w:num>
   <w:num w:numId="7" w16cid:durableId="722296573">
-    <w:abstractNumId w:val="74"/>
+    <w:abstractNumId w:val="79"/>
   </w:num>
   <w:num w:numId="8" w16cid:durableId="938299569">
-    <w:abstractNumId w:val="47"/>
+    <w:abstractNumId w:val="51"/>
   </w:num>
   <w:num w:numId="9" w16cid:durableId="1003119981">
     <w:abstractNumId w:val="1"/>
   </w:num>
   <w:num w:numId="10" w16cid:durableId="742533557">
+    <w:abstractNumId w:val="16"/>
+  </w:num>
+  <w:num w:numId="11" w16cid:durableId="1140876254">
     <w:abstractNumId w:val="15"/>
   </w:num>
-  <w:num w:numId="11" w16cid:durableId="1140876254">
-    <w:abstractNumId w:val="14"/>
-  </w:num>
   <w:num w:numId="12" w16cid:durableId="311175087">
-    <w:abstractNumId w:val="32"/>
+    <w:abstractNumId w:val="36"/>
   </w:num>
   <w:num w:numId="13" w16cid:durableId="1643578613">
-    <w:abstractNumId w:val="73"/>
+    <w:abstractNumId w:val="78"/>
   </w:num>
   <w:num w:numId="14" w16cid:durableId="28188523">
-    <w:abstractNumId w:val="17"/>
+    <w:abstractNumId w:val="18"/>
   </w:num>
   <w:num w:numId="15" w16cid:durableId="273635984">
     <w:abstractNumId w:val="0"/>
   </w:num>
   <w:num w:numId="16" w16cid:durableId="632515647">
-    <w:abstractNumId w:val="79"/>
+    <w:abstractNumId w:val="84"/>
   </w:num>
   <w:num w:numId="17" w16cid:durableId="1717313687">
     <w:abstractNumId w:val="3"/>
   </w:num>
   <w:num w:numId="18" w16cid:durableId="350423995">
+    <w:abstractNumId w:val="63"/>
+  </w:num>
+  <w:num w:numId="19" w16cid:durableId="1476485022">
+    <w:abstractNumId w:val="88"/>
+  </w:num>
+  <w:num w:numId="20" w16cid:durableId="798887380">
+    <w:abstractNumId w:val="32"/>
+  </w:num>
+  <w:num w:numId="21" w16cid:durableId="865338109">
+    <w:abstractNumId w:val="52"/>
+  </w:num>
+  <w:num w:numId="22" w16cid:durableId="1891963560">
+    <w:abstractNumId w:val="81"/>
+  </w:num>
+  <w:num w:numId="23" w16cid:durableId="337780777">
+    <w:abstractNumId w:val="80"/>
+  </w:num>
+  <w:num w:numId="24" w16cid:durableId="1319992471">
+    <w:abstractNumId w:val="8"/>
+  </w:num>
+  <w:num w:numId="25" w16cid:durableId="127862042">
+    <w:abstractNumId w:val="68"/>
+  </w:num>
+  <w:num w:numId="26" w16cid:durableId="1227882914">
+    <w:abstractNumId w:val="35"/>
+  </w:num>
+  <w:num w:numId="27" w16cid:durableId="780151792">
+    <w:abstractNumId w:val="53"/>
+  </w:num>
+  <w:num w:numId="28" w16cid:durableId="1863471563">
+    <w:abstractNumId w:val="12"/>
+  </w:num>
+  <w:num w:numId="29" w16cid:durableId="371878930">
+    <w:abstractNumId w:val="61"/>
+  </w:num>
+  <w:num w:numId="30" w16cid:durableId="388262574">
+    <w:abstractNumId w:val="82"/>
+  </w:num>
+  <w:num w:numId="31" w16cid:durableId="1178665434">
     <w:abstractNumId w:val="59"/>
   </w:num>
-  <w:num w:numId="19" w16cid:durableId="1476485022">
+  <w:num w:numId="32" w16cid:durableId="915287788">
+    <w:abstractNumId w:val="57"/>
+  </w:num>
+  <w:num w:numId="33" w16cid:durableId="1896235540">
+    <w:abstractNumId w:val="54"/>
+  </w:num>
+  <w:num w:numId="34" w16cid:durableId="1107042679">
+    <w:abstractNumId w:val="9"/>
+  </w:num>
+  <w:num w:numId="35" w16cid:durableId="874779833">
+    <w:abstractNumId w:val="42"/>
+  </w:num>
+  <w:num w:numId="36" w16cid:durableId="948898611">
+    <w:abstractNumId w:val="62"/>
+  </w:num>
+  <w:num w:numId="37" w16cid:durableId="590242007">
     <w:abstractNumId w:val="83"/>
   </w:num>
-  <w:num w:numId="20" w16cid:durableId="798887380">
+  <w:num w:numId="38" w16cid:durableId="857157669">
+    <w:abstractNumId w:val="33"/>
+  </w:num>
+  <w:num w:numId="39" w16cid:durableId="906645066">
+    <w:abstractNumId w:val="45"/>
+  </w:num>
+  <w:num w:numId="40" w16cid:durableId="780346730">
+    <w:abstractNumId w:val="21"/>
+  </w:num>
+  <w:num w:numId="41" w16cid:durableId="1991328286">
+    <w:abstractNumId w:val="72"/>
+  </w:num>
+  <w:num w:numId="42" w16cid:durableId="1379402897">
+    <w:abstractNumId w:val="10"/>
+  </w:num>
+  <w:num w:numId="43" w16cid:durableId="1461269641">
+    <w:abstractNumId w:val="24"/>
+  </w:num>
+  <w:num w:numId="44" w16cid:durableId="2044283027">
+    <w:abstractNumId w:val="92"/>
+  </w:num>
+  <w:num w:numId="45" w16cid:durableId="1396320795">
+    <w:abstractNumId w:val="17"/>
+  </w:num>
+  <w:num w:numId="46" w16cid:durableId="1484538646">
+    <w:abstractNumId w:val="65"/>
+  </w:num>
+  <w:num w:numId="47" w16cid:durableId="1667320133">
+    <w:abstractNumId w:val="37"/>
+  </w:num>
+  <w:num w:numId="48" w16cid:durableId="894658374">
+    <w:abstractNumId w:val="27"/>
+  </w:num>
+  <w:num w:numId="49" w16cid:durableId="41682562">
+    <w:abstractNumId w:val="71"/>
+  </w:num>
+  <w:num w:numId="50" w16cid:durableId="681009789">
+    <w:abstractNumId w:val="13"/>
+  </w:num>
+  <w:num w:numId="51" w16cid:durableId="1973946117">
     <w:abstractNumId w:val="29"/>
   </w:num>
-  <w:num w:numId="21" w16cid:durableId="865338109">
+  <w:num w:numId="52" w16cid:durableId="267203936">
+    <w:abstractNumId w:val="76"/>
+  </w:num>
+  <w:num w:numId="53" w16cid:durableId="1364747124">
+    <w:abstractNumId w:val="25"/>
+  </w:num>
+  <w:num w:numId="54" w16cid:durableId="465391243">
+    <w:abstractNumId w:val="75"/>
+  </w:num>
+  <w:num w:numId="55" w16cid:durableId="1051079903">
+    <w:abstractNumId w:val="19"/>
+  </w:num>
+  <w:num w:numId="56" w16cid:durableId="1185172641">
+    <w:abstractNumId w:val="87"/>
+  </w:num>
+  <w:num w:numId="57" w16cid:durableId="762216263">
+    <w:abstractNumId w:val="6"/>
+  </w:num>
+  <w:num w:numId="58" w16cid:durableId="523446550">
+    <w:abstractNumId w:val="77"/>
+  </w:num>
+  <w:num w:numId="59" w16cid:durableId="1654337723">
+    <w:abstractNumId w:val="43"/>
+  </w:num>
+  <w:num w:numId="60" w16cid:durableId="362248408">
+    <w:abstractNumId w:val="60"/>
+  </w:num>
+  <w:num w:numId="61" w16cid:durableId="1846439190">
+    <w:abstractNumId w:val="39"/>
+  </w:num>
+  <w:num w:numId="62" w16cid:durableId="391924560">
+    <w:abstractNumId w:val="11"/>
+  </w:num>
+  <w:num w:numId="63" w16cid:durableId="1929540848">
+    <w:abstractNumId w:val="67"/>
+  </w:num>
+  <w:num w:numId="64" w16cid:durableId="1962763530">
+    <w:abstractNumId w:val="85"/>
+  </w:num>
+  <w:num w:numId="65" w16cid:durableId="938829965">
+    <w:abstractNumId w:val="70"/>
+  </w:num>
+  <w:num w:numId="66" w16cid:durableId="700667380">
+    <w:abstractNumId w:val="56"/>
+  </w:num>
+  <w:num w:numId="67" w16cid:durableId="1385057277">
     <w:abstractNumId w:val="48"/>
   </w:num>
-  <w:num w:numId="22" w16cid:durableId="1891963560">
-    <w:abstractNumId w:val="76"/>
-  </w:num>
-  <w:num w:numId="23" w16cid:durableId="337780777">
-    <w:abstractNumId w:val="75"/>
-  </w:num>
-  <w:num w:numId="24" w16cid:durableId="1319992471">
-    <w:abstractNumId w:val="7"/>
-  </w:num>
-  <w:num w:numId="25" w16cid:durableId="127862042">
+  <w:num w:numId="68" w16cid:durableId="1032657564">
     <w:abstractNumId w:val="64"/>
   </w:num>
-  <w:num w:numId="26" w16cid:durableId="1227882914">
-    <w:abstractNumId w:val="31"/>
+  <w:num w:numId="69" w16cid:durableId="86078716">
+    <w:abstractNumId w:val="41"/>
   </w:num>
-  <w:num w:numId="27" w16cid:durableId="780151792">
-    <w:abstractNumId w:val="49"/>
-  </w:num>
-  <w:num w:numId="28" w16cid:durableId="1863471563">
-    <w:abstractNumId w:val="11"/>
-  </w:num>
-  <w:num w:numId="29" w16cid:durableId="371878930">
-    <w:abstractNumId w:val="57"/>
-  </w:num>
-  <w:num w:numId="30" w16cid:durableId="388262574">
-    <w:abstractNumId w:val="77"/>
-  </w:num>
-  <w:num w:numId="31" w16cid:durableId="1178665434">
-    <w:abstractNumId w:val="55"/>
-  </w:num>
-  <w:num w:numId="32" w16cid:durableId="915287788">
-    <w:abstractNumId w:val="53"/>
-  </w:num>
-  <w:num w:numId="33" w16cid:durableId="1896235540">
+  <w:num w:numId="70" w16cid:durableId="751463082">
     <w:abstractNumId w:val="50"/>
   </w:num>
-  <w:num w:numId="34" w16cid:durableId="1107042679">
-    <w:abstractNumId w:val="8"/>
+  <w:num w:numId="71" w16cid:durableId="1436942437">
+    <w:abstractNumId w:val="46"/>
   </w:num>
-  <w:num w:numId="35" w16cid:durableId="874779833">
+  <w:num w:numId="72" w16cid:durableId="745421061">
+    <w:abstractNumId w:val="28"/>
+  </w:num>
+  <w:num w:numId="73" w16cid:durableId="1640721056">
+    <w:abstractNumId w:val="58"/>
+  </w:num>
+  <w:num w:numId="74" w16cid:durableId="1332876128">
+    <w:abstractNumId w:val="91"/>
+  </w:num>
+  <w:num w:numId="75" w16cid:durableId="1947536825">
     <w:abstractNumId w:val="38"/>
   </w:num>
-  <w:num w:numId="36" w16cid:durableId="948898611">
-    <w:abstractNumId w:val="58"/>
+  <w:num w:numId="76" w16cid:durableId="624190089">
+    <w:abstractNumId w:val="73"/>
   </w:num>
-  <w:num w:numId="37" w16cid:durableId="590242007">
-    <w:abstractNumId w:val="78"/>
-  </w:num>
-  <w:num w:numId="38" w16cid:durableId="857157669">
-    <w:abstractNumId w:val="30"/>
-  </w:num>
-  <w:num w:numId="39" w16cid:durableId="906645066">
-    <w:abstractNumId w:val="41"/>
-  </w:num>
-  <w:num w:numId="40" w16cid:durableId="780346730">
-    <w:abstractNumId w:val="19"/>
-  </w:num>
-  <w:num w:numId="41" w16cid:durableId="1991328286">
-    <w:abstractNumId w:val="68"/>
-  </w:num>
-  <w:num w:numId="42" w16cid:durableId="1379402897">
-    <w:abstractNumId w:val="9"/>
-  </w:num>
-  <w:num w:numId="43" w16cid:durableId="1461269641">
+  <w:num w:numId="77" w16cid:durableId="2114353150">
     <w:abstractNumId w:val="22"/>
   </w:num>
-  <w:num w:numId="44" w16cid:durableId="2044283027">
-    <w:abstractNumId w:val="86"/>
-  </w:num>
-  <w:num w:numId="45" w16cid:durableId="1396320795">
-    <w:abstractNumId w:val="16"/>
-  </w:num>
-  <w:num w:numId="46" w16cid:durableId="1484538646">
-    <w:abstractNumId w:val="61"/>
-  </w:num>
-  <w:num w:numId="47" w16cid:durableId="1667320133">
-    <w:abstractNumId w:val="33"/>
-  </w:num>
-  <w:num w:numId="48" w16cid:durableId="894658374">
-    <w:abstractNumId w:val="24"/>
-  </w:num>
-  <w:num w:numId="49" w16cid:durableId="41682562">
-    <w:abstractNumId w:val="67"/>
-  </w:num>
-  <w:num w:numId="50" w16cid:durableId="681009789">
-    <w:abstractNumId w:val="12"/>
-  </w:num>
-  <w:num w:numId="51" w16cid:durableId="1973946117">
-    <w:abstractNumId w:val="26"/>
-  </w:num>
-  <w:num w:numId="52" w16cid:durableId="267203936">
-    <w:abstractNumId w:val="71"/>
-  </w:num>
-  <w:num w:numId="53" w16cid:durableId="1364747124">
-    <w:abstractNumId w:val="23"/>
-  </w:num>
-  <w:num w:numId="54" w16cid:durableId="465391243">
-    <w:abstractNumId w:val="70"/>
-  </w:num>
-  <w:num w:numId="55" w16cid:durableId="1051079903">
-    <w:abstractNumId w:val="18"/>
-  </w:num>
-  <w:num w:numId="56" w16cid:durableId="1185172641">
-    <w:abstractNumId w:val="82"/>
-  </w:num>
-  <w:num w:numId="57" w16cid:durableId="762216263">
-    <w:abstractNumId w:val="5"/>
-  </w:num>
-  <w:num w:numId="58" w16cid:durableId="523446550">
-    <w:abstractNumId w:val="72"/>
-  </w:num>
-  <w:num w:numId="59" w16cid:durableId="1654337723">
-    <w:abstractNumId w:val="39"/>
-  </w:num>
-  <w:num w:numId="60" w16cid:durableId="362248408">
-    <w:abstractNumId w:val="56"/>
-  </w:num>
-  <w:num w:numId="61" w16cid:durableId="1846439190">
-    <w:abstractNumId w:val="35"/>
-  </w:num>
-  <w:num w:numId="62" w16cid:durableId="391924560">
-    <w:abstractNumId w:val="10"/>
-  </w:num>
-  <w:num w:numId="63" w16cid:durableId="1929540848">
-    <w:abstractNumId w:val="63"/>
-  </w:num>
-  <w:num w:numId="64" w16cid:durableId="1962763530">
-    <w:abstractNumId w:val="80"/>
-  </w:num>
-  <w:num w:numId="65" w16cid:durableId="938829965">
-    <w:abstractNumId w:val="66"/>
-  </w:num>
-  <w:num w:numId="66" w16cid:durableId="700667380">
-    <w:abstractNumId w:val="52"/>
-  </w:num>
-  <w:num w:numId="67" w16cid:durableId="1385057277">
-    <w:abstractNumId w:val="44"/>
-  </w:num>
-  <w:num w:numId="68" w16cid:durableId="1032657564">
-    <w:abstractNumId w:val="60"/>
-  </w:num>
-  <w:num w:numId="69" w16cid:durableId="86078716">
-    <w:abstractNumId w:val="37"/>
-  </w:num>
-  <w:num w:numId="70" w16cid:durableId="751463082">
-    <w:abstractNumId w:val="46"/>
-  </w:num>
-  <w:num w:numId="71" w16cid:durableId="1436942437">
-    <w:abstractNumId w:val="42"/>
-  </w:num>
-  <w:num w:numId="72" w16cid:durableId="745421061">
-    <w:abstractNumId w:val="25"/>
-  </w:num>
-  <w:num w:numId="73" w16cid:durableId="1640721056">
-    <w:abstractNumId w:val="54"/>
-  </w:num>
-  <w:num w:numId="74" w16cid:durableId="1332876128">
-    <w:abstractNumId w:val="85"/>
-  </w:num>
-  <w:num w:numId="75" w16cid:durableId="1947536825">
-    <w:abstractNumId w:val="34"/>
-  </w:num>
-  <w:num w:numId="76" w16cid:durableId="624190089">
-    <w:abstractNumId w:val="69"/>
-  </w:num>
-  <w:num w:numId="77" w16cid:durableId="2114353150">
-    <w:abstractNumId w:val="20"/>
-  </w:num>
   <w:num w:numId="78" w16cid:durableId="1205942063">
-    <w:abstractNumId w:val="36"/>
+    <w:abstractNumId w:val="40"/>
   </w:num>
   <w:num w:numId="79" w16cid:durableId="1646620926">
     <w:abstractNumId w:val="4"/>
   </w:num>
   <w:num w:numId="80" w16cid:durableId="118576681">
-    <w:abstractNumId w:val="27"/>
+    <w:abstractNumId w:val="30"/>
   </w:num>
   <w:num w:numId="81" w16cid:durableId="1522665152">
-    <w:abstractNumId w:val="28"/>
+    <w:abstractNumId w:val="31"/>
   </w:num>
   <w:num w:numId="82" w16cid:durableId="776218829">
-    <w:abstractNumId w:val="45"/>
+    <w:abstractNumId w:val="49"/>
   </w:num>
   <w:num w:numId="83" w16cid:durableId="112216851">
-    <w:abstractNumId w:val="62"/>
+    <w:abstractNumId w:val="66"/>
   </w:num>
   <w:num w:numId="84" w16cid:durableId="1655597904">
-    <w:abstractNumId w:val="21"/>
+    <w:abstractNumId w:val="23"/>
   </w:num>
   <w:num w:numId="85" w16cid:durableId="1085298509">
-    <w:abstractNumId w:val="81"/>
+    <w:abstractNumId w:val="86"/>
   </w:num>
   <w:num w:numId="86" w16cid:durableId="280261920">
-    <w:abstractNumId w:val="6"/>
+    <w:abstractNumId w:val="7"/>
   </w:num>
   <w:num w:numId="87" w16cid:durableId="1878079943">
-    <w:abstractNumId w:val="43"/>
+    <w:abstractNumId w:val="47"/>
+  </w:num>
+  <w:num w:numId="88" w16cid:durableId="1798179732">
+    <w:abstractNumId w:val="74"/>
+  </w:num>
+  <w:num w:numId="89" w16cid:durableId="642855665">
+    <w:abstractNumId w:val="93"/>
+  </w:num>
+  <w:num w:numId="90" w16cid:durableId="1362902037">
+    <w:abstractNumId w:val="34"/>
+  </w:num>
+  <w:num w:numId="91" w16cid:durableId="1401246561">
+    <w:abstractNumId w:val="89"/>
+  </w:num>
+  <w:num w:numId="92" w16cid:durableId="376206057">
+    <w:abstractNumId w:val="20"/>
+  </w:num>
+  <w:num w:numId="93" w16cid:durableId="1987128730">
+    <w:abstractNumId w:val="26"/>
+  </w:num>
+  <w:num w:numId="94" w16cid:durableId="459619071">
+    <w:abstractNumId w:val="5"/>
   </w:num>
 </w:numbering>
 </file>

</xml_diff>